<commit_message>
Protocol: reduce to two hypotheses (bipolar exposure, profitability)
</commit_message>
<xml_diff>
--- a/3er-semestre/desarrollo-proyecto-i/tareas/Protocolo/Protocolo_Investigacion_CarlosPulidoRosas.docx
+++ b/3er-semestre/desarrollo-proyecto-i/tareas/Protocolo/Protocolo_Investigacion_CarlosPulidoRosas.docx
@@ -1100,7 +1100,7 @@
           <w:sz w:val="24"/>
           <w:szCs w:val="24"/>
         </w:rPr>
-        <w:t xml:space="preserve">H1. Dentro de la industria manufacturera de Jalisco, la exposición a la IA cognitiva y la exposición a la robótica recaen en ocupaciones distintas: los operadores y trabajadores de producción concentran la exposición física, mientras que las ocupaciones administrativas, técnicas y de supervisión concentran la exposición cognitiva.</w:t>
+        <w:t xml:space="preserve">H1. Dentro de la industria manufacturera de Jalisco, la exposición a la IA cognitiva y la exposición a la robótica recaen en ocupaciones distintas: los operadores y trabajadores de producción concentran la exposición física, mientras que las ocupaciones administrativas, técnicas y de supervisión concentran la exposición cognitiva. Se contrastará con análisis factorial exploratorio y confirmatorio sobre los índices de exposición.</w:t>
       </w:r>
     </w:p>
     <w:p>
@@ -1115,37 +1115,7 @@
           <w:sz w:val="24"/>
           <w:szCs w:val="24"/>
         </w:rPr>
-        <w:t xml:space="preserve">H2. Ponderada por empleo, la exposición de la manufactura jalisciense es mayor en el eje físico que en el cognitivo.</w:t>
-      </w:r>
-    </w:p>
-    <w:p>
-      <w:pPr>
-        <w:spacing w:before="0" w:after="0" w:line="480" w:lineRule="auto"/>
-        <w:ind w:firstLine="709"/>
-        <w:jc w:val="both"/>
-      </w:pPr>
-      <w:r>
-        <w:rPr>
-          <w:rFonts w:ascii="Times New Roman" w:hAnsi="Times New Roman" w:cs="Times New Roman" w:eastAsia="Times New Roman"/>
-          <w:sz w:val="24"/>
-          <w:szCs w:val="24"/>
-        </w:rPr>
-        <w:t xml:space="preserve">H3. Las ramas manufactureras con mayor rentabilidad de automatizar, medida con el Índice de Rentabilidad de la Automatización, presentan mayor profundización de capital y menor participación del trabajo en el valor agregado.</w:t>
-      </w:r>
-    </w:p>
-    <w:p>
-      <w:pPr>
-        <w:spacing w:before="0" w:after="0" w:line="480" w:lineRule="auto"/>
-        <w:ind w:firstLine="709"/>
-        <w:jc w:val="both"/>
-      </w:pPr>
-      <w:r>
-        <w:rPr>
-          <w:rFonts w:ascii="Times New Roman" w:hAnsi="Times New Roman" w:cs="Times New Roman" w:eastAsia="Times New Roman"/>
-          <w:sz w:val="24"/>
-          <w:szCs w:val="24"/>
-        </w:rPr>
-        <w:t xml:space="preserve">H4. En el escenario de adopción robótica acelerada asociado al nearshoring, la presión de sustitución en la manufactura crece hacia 2030 más que en el resto de los sectores de la economía estatal.</w:t>
+        <w:t xml:space="preserve">H2. Las ramas manufactureras con mayor rentabilidad de automatizar, medida con el Índice de Rentabilidad de la Automatización, presentan mayor profundización de capital y menor participación del trabajo en el valor agregado. Se contrastará con un panel de los Censos Económicos con efectos fijos e inferencia por permutación.</w:t>
       </w:r>
     </w:p>
     <w:p>
@@ -1403,7 +1373,7 @@
           <w:sz w:val="24"/>
           <w:szCs w:val="24"/>
         </w:rPr>
-        <w:t xml:space="preserve">3. Análisis de la estructura de la exposición con análisis factorial exploratorio y confirmatorio, para contrastar H1 y H2.</w:t>
+        <w:t xml:space="preserve">3. Análisis de la estructura de la exposición con análisis factorial exploratorio y confirmatorio, para contrastar H1, y descripción del perfil de exposición del sector ponderado por empleo.</w:t>
       </w:r>
     </w:p>
     <w:p>
@@ -1433,7 +1403,7 @@
           <w:sz w:val="24"/>
           <w:szCs w:val="24"/>
         </w:rPr>
-        <w:t xml:space="preserve">5. Contraste de H3 con un panel de los Censos Económicos y efectos fijos de periodo, usando el Índice de Rentabilidad de la Automatización rezagado e inferencia por permutación. Se propone desagregar este análisis a nivel de rama manufacturera.</w:t>
+        <w:t xml:space="preserve">5. Contraste de H2 con un panel de los Censos Económicos y efectos fijos de periodo, usando el Índice de Rentabilidad de la Automatización rezagado e inferencia por permutación. Se propone desagregar este análisis a nivel de rama manufacturera.</w:t>
       </w:r>
     </w:p>
     <w:p>
@@ -1448,7 +1418,7 @@
           <w:sz w:val="24"/>
           <w:szCs w:val="24"/>
         </w:rPr>
-        <w:t xml:space="preserve">6. Proyección 2025-2030 en tres escenarios (conservador, base y acelerado) que combinan la exposición, la rentabilidad y las curvas de capacidad de la IA y de adopción robótica, para contrastar H4, y elaboración del tablero de visualización.</w:t>
+        <w:t xml:space="preserve">6. Proyección 2025-2030 en tres escenarios (conservador, base y acelerado) que combinan la exposición, la rentabilidad y las curvas de capacidad de la IA y de adopción robótica, para dimensionar la presión de sustitución en el sector, y elaboración del tablero de visualización.</w:t>
       </w:r>
     </w:p>
     <w:p>

</xml_diff>

<commit_message>
Protocol: every statement cited (APA 7) from external sources, formal definitions (LLM, nearshoring, robot, informality), no unpublished thesis results as evidence
</commit_message>
<xml_diff>
--- a/3er-semestre/desarrollo-proyecto-i/tareas/Protocolo/Protocolo_Investigacion_CarlosPulidoRosas.docx
+++ b/3er-semestre/desarrollo-proyecto-i/tareas/Protocolo/Protocolo_Investigacion_CarlosPulidoRosas.docx
@@ -830,6 +830,22 @@
     </w:p>
     <w:p>
       <w:pPr>
+        <w:keepNext/>
+        <w:spacing w:before="240" w:after="0" w:line="480" w:lineRule="auto"/>
+        <w:jc w:val="left"/>
+      </w:pPr>
+      <w:r>
+        <w:rPr>
+          <w:rFonts w:ascii="Times New Roman" w:hAnsi="Times New Roman" w:cs="Times New Roman" w:eastAsia="Times New Roman"/>
+          <w:b/>
+          <w:sz w:val="24"/>
+          <w:szCs w:val="24"/>
+        </w:rPr>
+        <w:t xml:space="preserve">2.1. Contexto</w:t>
+      </w:r>
+    </w:p>
+    <w:p>
+      <w:pPr>
         <w:spacing w:before="0" w:after="0" w:line="480" w:lineRule="auto"/>
         <w:ind w:firstLine="709"/>
         <w:jc w:val="both"/>
@@ -840,7 +856,7 @@
           <w:sz w:val="24"/>
           <w:szCs w:val="24"/>
         </w:rPr>
-        <w:t xml:space="preserve">El debate sobre la automatización suele tratar a la inteligencia artificial como un riesgo único que amenaza a todos los empleos por igual. La evidencia acumulada indica otra cosa: la automatización avanza por dos fronteras tecnológicas distintas. Una es cognitiva y está encabezada por los modelos de lenguaje, que realizan tareas de redacción, análisis y procesamiento de información. La otra es física y se materializa en robots industriales y máquinas autónomas que manipulan objetos y operan equipo. Ambas fronteras tienen costos, canales de difusión y ocupaciones afectadas diferentes, y los análisis del repositorio de esta tesis muestran que las ocupaciones más expuestas a una suelen ser las menos expuestas a la otra.</w:t>
+        <w:t xml:space="preserve">La automatización es el proceso mediante el cual el capital reemplaza al trabajo en tareas que antes realizaban las personas; su efecto inmediato es desplazar trabajo, aunque puede compensarse con la creación de tareas nuevas (Acemoglu y Restrepo, 2019). Durante décadas, este proceso se asoció sobre todo con tareas rutinarias, es decir, con actividades que siguen reglas explícitas y que por ello pueden programarse en una computadora (Autor et al., 2003).</w:t>
       </w:r>
     </w:p>
     <w:p>
@@ -855,7 +871,7 @@
           <w:sz w:val="24"/>
           <w:szCs w:val="24"/>
         </w:rPr>
-        <w:t xml:space="preserve">La industria manufacturera de Jalisco concentra las dos fronteras en un mismo sector. Es el sector con mayor empleo formal del estado, con 627 mil trabajadores registrados en los Censos Económicos, y en las proyecciones de la tesis aparece entre los de mayor presión de automatización hacia 2030, con un componente físico dominante. Dentro de sus plantas conviven los operadores de maquinaria industrial, el grupo ocupacional con la exposición más alta a la automatización física, y las áreas administrativas, técnicas y de supervisión, expuestas a los modelos de lenguaje. A esto se suma el nearshoring: la inversión extranjera directa en Jalisco aumentó 27 % en 2021-2023 respecto a 2015-2019, sobre todo por reinversión de plantas establecidas, lo que crea empleo en el corto plazo y al mismo tiempo trae consigo la frontera tecnológica de las empresas matrices.</w:t>
+        <w:t xml:space="preserve">En los últimos años la automatización se extendió en dos direcciones. Por un lado, los modelos de lenguaje de gran escala, que se definen formalmente en el marco teórico, ampliaron la capacidad de las máquinas para realizar tareas cognitivas como redactar, resumir o analizar información. Eloundou et al. (2023) estiman que cerca de 80 % de los trabajadores de Estados Unidos podría tener al menos 10 % de sus tareas afectadas por estos modelos, y que alrededor de 19 % podría ver afectada la mitad o más de sus tareas. Para México, Azuara et al. (2024) estiman que 74 % de los empleos tiene más de 10 % de sus tareas expuestas, y Benítez-Rueda y Parrado (2024) calculan que alrededor de 16 millones de empleos mexicanos están muy expuestos a la inteligencia artificial en un horizonte de un año.</w:t>
       </w:r>
     </w:p>
     <w:p>
@@ -870,7 +886,144 @@
           <w:sz w:val="24"/>
           <w:szCs w:val="24"/>
         </w:rPr>
-        <w:t xml:space="preserve">Los instrumentos disponibles no permiten dimensionar este riesgo. Las medidas clásicas, como la de Frey y Osborne (2017), son estáticas, se construyeron con juicio experto sobre datos de Estados Unidos y suponen que el trabajo cognitivo no rutinario está protegido. Las medidas recientes de exposición a la IA se enfocan en el eje cognitivo y no distinguen el riesgo de robotización. Ninguna considera si la sustitución es rentable para las empresas de un sector específico. En consecuencia, se formula la siguiente pregunta de investigación: ¿cómo se distribuye el riesgo de sustitución laboral por inteligencia artificial cognitiva y por robótica entre las ocupaciones y ramas de la industria manufacturera de Jalisco, y qué factores determinan cuál de las dos fronteras domina?</w:t>
+        <w:t xml:space="preserve">Por otro lado, la robótica industrial sigue extendiéndose sobre las tareas físicas. México instaló 5,594 robots industriales en 2024 y es el segundo mercado de robots de América, después de Estados Unidos (International Federation of Robotics [IFR], 2025). La evidencia sobre su efecto en el empleo mexicano no es concluyente. Faber (2020) encuentra que los robots instalados en Estados Unidos reducen el empleo en los mercados laborales mexicanos, con mayor efecto en operadores de maquinaria de baja escolaridad de la manufactura, y Artuc et al. (2019) estiman que un robot adicional por cada mil trabajadores en Estados Unidos reduce 6.7 % el crecimiento de las exportaciones por trabajador de México hacia ese país. En sentido contrario, Márquez Stone y Sandoval Cabrera (2024) encuentran una correlación positiva entre la adopción de robots y el empleo y los salarios en la industria automotriz de 14 estados entre 2013 y 2022, y Maloney y Molina (2019) documentan que en los países en desarrollo el empleo de operadores y ensambladores ha crecido, aunque con indicios de polarización en México.</w:t>
+      </w:r>
+    </w:p>
+    <w:p>
+      <w:pPr>
+        <w:spacing w:before="0" w:after="0" w:line="480" w:lineRule="auto"/>
+        <w:ind w:firstLine="709"/>
+        <w:jc w:val="both"/>
+      </w:pPr>
+      <w:r>
+        <w:rPr>
+          <w:rFonts w:ascii="Times New Roman" w:hAnsi="Times New Roman" w:cs="Times New Roman" w:eastAsia="Times New Roman"/>
+          <w:sz w:val="24"/>
+          <w:szCs w:val="24"/>
+        </w:rPr>
+        <w:t xml:space="preserve">La industria manufacturera de Jalisco se ubica en el cruce de ambas tendencias. En el cuarto trimestre de 2024 empleaba a 698,147 personas, 17.9 % de los 4.0 millones de ocupados del estado, y la tasa de informalidad laboral estatal era de 46.5 % (Instituto Nacional de Estadística y Geografía [INEGI], 2025). A ello se suma la relocalización de empresas hacia México, conocida como nearshoring: según el Banco de México (2022), 16 % de las empresas con más de 100 trabajadores reportó beneficios de este fenómeno, concentrados en la región norte y en la manufactura integrada a cadenas globales de valor. Sin embargo, el efecto en Jalisco no es lineal: en 2024 el estado recibió 1,100 millones de dólares de inversión extranjera directa, 3 % del total nacional, y pasó del cuarto al noveno lugar entre las entidades (Secretaría de Economía [SE], 2025).</w:t>
+      </w:r>
+    </w:p>
+    <w:p>
+      <w:pPr>
+        <w:keepNext/>
+        <w:spacing w:before="240" w:after="0" w:line="480" w:lineRule="auto"/>
+        <w:jc w:val="left"/>
+      </w:pPr>
+      <w:r>
+        <w:rPr>
+          <w:rFonts w:ascii="Times New Roman" w:hAnsi="Times New Roman" w:cs="Times New Roman" w:eastAsia="Times New Roman"/>
+          <w:b/>
+          <w:sz w:val="24"/>
+          <w:szCs w:val="24"/>
+        </w:rPr>
+        <w:t xml:space="preserve">2.2. Definición del problema</w:t>
+      </w:r>
+    </w:p>
+    <w:p>
+      <w:pPr>
+        <w:spacing w:before="0" w:after="0" w:line="480" w:lineRule="auto"/>
+        <w:ind w:firstLine="709"/>
+        <w:jc w:val="both"/>
+      </w:pPr>
+      <w:r>
+        <w:rPr>
+          <w:rFonts w:ascii="Times New Roman" w:hAnsi="Times New Roman" w:cs="Times New Roman" w:eastAsia="Times New Roman"/>
+          <w:sz w:val="24"/>
+          <w:szCs w:val="24"/>
+        </w:rPr>
+        <w:t xml:space="preserve">Las medidas disponibles no permiten saber qué ocupaciones de la manufactura jalisciense enfrentan qué tipo de riesgo. La estimación más difundida, la de Frey y Osborne (2017), se construyó a partir de 70 ocupaciones etiquetadas de forma subjetiva por un grupo de investigadores y se extrapoló al resto con datos de Estados Unidos, por lo que es estática y depende del juicio experto. Los índices posteriores miden por separado cada tecnología: unos la exposición a la IA cognitiva (Eloundou et al., 2023; Felten et al., 2021, 2023) y otros la exposición a robots (Acemoglu y Restrepo, 2020; Webb, 2020), aun cuando Webb (2020) muestra que ambas tecnologías se dirigen a tareas distintas. Además, la exposición técnica no basta para que la sustitución ocurra, pues automatizar solo resulta conveniente cuando el costo del capital es menor que el del trabajo que reemplaza (Acemoglu y Restrepo, 2018).</w:t>
+      </w:r>
+    </w:p>
+    <w:p>
+      <w:pPr>
+        <w:spacing w:before="0" w:after="0" w:line="480" w:lineRule="auto"/>
+        <w:ind w:firstLine="709"/>
+        <w:jc w:val="both"/>
+      </w:pPr>
+      <w:r>
+        <w:rPr>
+          <w:rFonts w:ascii="Times New Roman" w:hAnsi="Times New Roman" w:cs="Times New Roman" w:eastAsia="Times New Roman"/>
+          <w:sz w:val="24"/>
+          <w:szCs w:val="24"/>
+        </w:rPr>
+        <w:t xml:space="preserve">En consecuencia, el problema de investigación es la falta de un instrumento que permita evaluar, con datos de México, el riesgo de sustitución laboral que enfrentan las ocupaciones de la industria manufacturera de Jalisco ante dos tecnologías diferentes, la inteligencia artificial cognitiva y la robótica, considerando además si la sustitución es económicamente rentable para las empresas. Sin ese instrumento, las autoridades, las cámaras industriales y los centros de capacitación no cuentan con un diagnóstico para anticipar qué trabajadores necesitarán apoyo ni de qué tipo.</w:t>
+      </w:r>
+    </w:p>
+    <w:p>
+      <w:pPr>
+        <w:keepNext/>
+        <w:spacing w:before="240" w:after="0" w:line="480" w:lineRule="auto"/>
+        <w:jc w:val="left"/>
+      </w:pPr>
+      <w:r>
+        <w:rPr>
+          <w:rFonts w:ascii="Times New Roman" w:hAnsi="Times New Roman" w:cs="Times New Roman" w:eastAsia="Times New Roman"/>
+          <w:b/>
+          <w:sz w:val="24"/>
+          <w:szCs w:val="24"/>
+        </w:rPr>
+        <w:t xml:space="preserve">2.3. Preguntas de investigación</w:t>
+      </w:r>
+    </w:p>
+    <w:p>
+      <w:pPr>
+        <w:spacing w:before="0" w:after="0" w:line="480" w:lineRule="auto"/>
+        <w:ind w:firstLine="709"/>
+        <w:jc w:val="both"/>
+      </w:pPr>
+      <w:r>
+        <w:rPr>
+          <w:rFonts w:ascii="Times New Roman" w:hAnsi="Times New Roman" w:cs="Times New Roman" w:eastAsia="Times New Roman"/>
+          <w:sz w:val="24"/>
+          <w:szCs w:val="24"/>
+        </w:rPr>
+        <w:t xml:space="preserve">Pregunta general: ¿cómo se distribuye el riesgo de sustitución laboral por inteligencia artificial cognitiva y por robótica entre las ocupaciones y ramas de la industria manufacturera de Jalisco, y en qué medida la rentabilidad de automatizar determina que ese riesgo se materialice?</w:t>
+      </w:r>
+    </w:p>
+    <w:p>
+      <w:pPr>
+        <w:spacing w:before="0" w:after="0" w:line="480" w:lineRule="auto"/>
+        <w:ind w:left="709"/>
+        <w:jc w:val="both"/>
+      </w:pPr>
+      <w:r>
+        <w:rPr>
+          <w:rFonts w:ascii="Times New Roman" w:hAnsi="Times New Roman" w:cs="Times New Roman" w:eastAsia="Times New Roman"/>
+          <w:sz w:val="24"/>
+          <w:szCs w:val="24"/>
+        </w:rPr>
+        <w:t xml:space="preserve">1. ¿Qué ocupaciones manufactureras de Jalisco están más expuestas a la IA cognitiva y cuáles a la robótica?</w:t>
+      </w:r>
+    </w:p>
+    <w:p>
+      <w:pPr>
+        <w:spacing w:before="0" w:after="0" w:line="480" w:lineRule="auto"/>
+        <w:ind w:left="709"/>
+        <w:jc w:val="both"/>
+      </w:pPr>
+      <w:r>
+        <w:rPr>
+          <w:rFonts w:ascii="Times New Roman" w:hAnsi="Times New Roman" w:cs="Times New Roman" w:eastAsia="Times New Roman"/>
+          <w:sz w:val="24"/>
+          <w:szCs w:val="24"/>
+        </w:rPr>
+        <w:t xml:space="preserve">2. ¿Las ramas manufactureras donde automatizar es más rentable sustituyen más trabajo por capital?</w:t>
+      </w:r>
+    </w:p>
+    <w:p>
+      <w:pPr>
+        <w:spacing w:before="0" w:after="0" w:line="480" w:lineRule="auto"/>
+        <w:ind w:left="709"/>
+        <w:jc w:val="both"/>
+      </w:pPr>
+      <w:r>
+        <w:rPr>
+          <w:rFonts w:ascii="Times New Roman" w:hAnsi="Times New Roman" w:cs="Times New Roman" w:eastAsia="Times New Roman"/>
+          <w:sz w:val="24"/>
+          <w:szCs w:val="24"/>
+        </w:rPr>
+        <w:t xml:space="preserve">3. ¿Qué presión de sustitución podría enfrentar el sector hacia 2030 bajo distintos escenarios de adopción tecnológica?</w:t>
       </w:r>
     </w:p>
     <w:p>
@@ -901,7 +1054,7 @@
           <w:sz w:val="24"/>
           <w:szCs w:val="24"/>
         </w:rPr>
-        <w:t xml:space="preserve">La relevancia del problema es social y económica. La manufactura es la principal fuente de empleo formal del estado, y la tesis estima que la automatización física presiona sobre todo a trabajadores con menor escolaridad, que son también los que tienen menos opciones de reconversión. Del lado económico, veinte años de Censos Económicos muestran que en Jalisco los sectores donde automatizar resultaba más rentable profundizaron su capital y redujeron la participación del trabajo en el valor agregado, con valores p por permutación de 0.013 y 0.004. Es decir, la sustitución no es solo una posibilidad técnica, sino un comportamiento observado.</w:t>
+        <w:t xml:space="preserve">Relevancia social. La manufactura emplea a casi una de cada cinco personas ocupadas en Jalisco y casi la mitad de los ocupados del estado trabaja en la informalidad (INEGI, 2025), es decir, en condiciones de vulnerabilidad laboral y, en muchos casos, sin seguridad social. Si la automatización desplaza trabajadores en este sector, una parte importante de ellos carecería de protección. La evidencia para México apunta a que los más afectados por la robótica son los operadores de maquinaria con baja escolaridad (Faber, 2020), un grupo con pocas opciones de reconversión laboral.</w:t>
       </w:r>
     </w:p>
     <w:p>
@@ -916,7 +1069,7 @@
           <w:sz w:val="24"/>
           <w:szCs w:val="24"/>
         </w:rPr>
-        <w:t xml:space="preserve">El impacto esperado se dirige a quienes toman decisiones en el sector: autoridades estatales de desarrollo económico y trabajo, cámaras industriales y centros de capacitación. Un diagnóstico por rama y ocupación permitiría orientar la formación de trabajadores hacia las ocupaciones con mayor riesgo antes de que el desplazamiento ocurra. La tesis documenta que ese momento todavía existe: la capacidad de los modelos de lenguaje ya aumentó y las expectativas de desplazamiento de la población crecieron 12.5 puntos entre 2020 y 2023, pero aún no se detecta un efecto en el empleo, lo que abre una ventana para la política pública.</w:t>
+        <w:t xml:space="preserve">Relevancia práctica. Como los estudios disponibles llegan a conclusiones opuestas para México (Artuc et al., 2019; Faber, 2020; Márquez Stone y Sandoval Cabrera, 2024), hace falta un diagnóstico local que distinga ocupaciones, ramas y tecnologías. Ese diagnóstico permitiría a las instancias de desarrollo económico, trabajo y capacitación del estado orientar sus programas hacia las ocupaciones con mayor riesgo antes de que el desplazamiento ocurra. La literatura sobre la adopción de tecnologías de propósito general sugiere que sus efectos tardan en aparecer en las estadísticas (Brynjolfsson et al., 2021), lo que abre un margen de tiempo para actuar.</w:t>
       </w:r>
     </w:p>
     <w:p>
@@ -931,7 +1084,22 @@
           <w:sz w:val="24"/>
           <w:szCs w:val="24"/>
         </w:rPr>
-        <w:t xml:space="preserve">La contribución original es metodológica. La tesis construye dos índices propios de exposición ocupacional: el DBOE, que agrega una dimensión temporal al índice de Felten et al. (2021) a partir de curvas anuales de desempeño de los modelos de lenguaje y reproduce el índice publicado con una correlación de 0.94, y el DEOE, un índice de exposición física validado contra la medida de robots de Webb (2020) con una correlación de 0.76. Frente a las soluciones existentes, el modelo propuesto mide ambas fronteras con la misma metodología, incorpora la rentabilidad de automatizar y se ancla en datos mexicanos de empleo, censos e inversión.</w:t>
+        <w:t xml:space="preserve">Aportación a la ciencia. El proyecto propone construir dos índices de exposición ocupacional con la misma metodología, uno para la IA cognitiva y otro para la robótica, y combinarlos con una medida de rentabilidad de la automatización. El índice cognitivo partirá del índice de exposición a la IA de Felten et al. (2021), al que se agregará una dimensión temporal a partir de la evolución del desempeño de los modelos de lenguaje, y ambos índices se validarán contra medidas publicadas, como la exposición a robots de Webb (2020) y el uso observado de la IA de Handa et al. (2025).</w:t>
+      </w:r>
+    </w:p>
+    <w:p>
+      <w:pPr>
+        <w:spacing w:before="0" w:after="0" w:line="480" w:lineRule="auto"/>
+        <w:ind w:firstLine="709"/>
+        <w:jc w:val="both"/>
+      </w:pPr>
+      <w:r>
+        <w:rPr>
+          <w:rFonts w:ascii="Times New Roman" w:hAnsi="Times New Roman" w:cs="Times New Roman" w:eastAsia="Times New Roman"/>
+          <w:sz w:val="24"/>
+          <w:szCs w:val="24"/>
+        </w:rPr>
+        <w:t xml:space="preserve">Viabilidad. Todas las fuentes de información son públicas y gratuitas: la ENOE, los Censos Económicos y la clasificación de ocupaciones del INEGI, la base O*NET, las estadísticas de la Federación Internacional de Robótica y las bases de datos que acompañan a los estudios citados.</w:t>
       </w:r>
     </w:p>
     <w:p>
@@ -1024,7 +1192,7 @@
           <w:sz w:val="24"/>
           <w:szCs w:val="24"/>
         </w:rPr>
-        <w:t xml:space="preserve">2. Construir y validar dos índices de exposición ocupacional, uno cognitivo (DBOE) y uno físico (DEOE), y aplicarlos a la estructura ocupacional de la manufactura.</w:t>
+        <w:t xml:space="preserve">2. Construir y validar dos índices de exposición ocupacional, uno cognitivo y uno físico, y aplicarlos a la estructura ocupacional de la manufactura.</w:t>
       </w:r>
     </w:p>
     <w:p>
@@ -1100,7 +1268,7 @@
           <w:sz w:val="24"/>
           <w:szCs w:val="24"/>
         </w:rPr>
-        <w:t xml:space="preserve">H1. Dentro de la industria manufacturera de Jalisco, la exposición a la IA cognitiva y la exposición a la robótica recaen en ocupaciones distintas: los operadores y trabajadores de producción concentran la exposición física, mientras que las ocupaciones administrativas, técnicas y de supervisión concentran la exposición cognitiva. Se contrastará con análisis factorial exploratorio y confirmatorio sobre los índices de exposición.</w:t>
+        <w:t xml:space="preserve">H1. Dentro de la industria manufacturera de Jalisco, la exposición a la IA cognitiva y la exposición a la robótica recaen en ocupaciones distintas: los operadores y trabajadores de producción concentran la exposición física, mientras que las ocupaciones administrativas, técnicas y de supervisión concentran la exposición cognitiva. Esta hipótesis se deriva de la evidencia de Webb (2020) sobre la orientación distinta de ambas tecnologías y se contrastará con análisis factorial exploratorio y confirmatorio sobre los índices de exposición.</w:t>
       </w:r>
     </w:p>
     <w:p>
@@ -1115,7 +1283,7 @@
           <w:sz w:val="24"/>
           <w:szCs w:val="24"/>
         </w:rPr>
-        <w:t xml:space="preserve">H2. Las ramas manufactureras con mayor rentabilidad de automatizar, medida con el Índice de Rentabilidad de la Automatización, presentan mayor profundización de capital y menor participación del trabajo en el valor agregado. Se contrastará con un panel de los Censos Económicos con efectos fijos e inferencia por permutación.</w:t>
+        <w:t xml:space="preserve">H2. Las ramas manufactureras con mayor rentabilidad de automatizar presentan mayor profundización de capital y menor participación del trabajo en el valor agregado. Esta hipótesis se deriva de la condición de rentabilidad de Acemoglu y Restrepo (2018) y se contrastará con un panel de los Censos Económicos con efectos fijos e inferencia por permutación.</w:t>
       </w:r>
     </w:p>
     <w:p>
@@ -1146,7 +1314,7 @@
           <w:sz w:val="24"/>
           <w:szCs w:val="24"/>
         </w:rPr>
-        <w:t xml:space="preserve">Los antecedentes se presentan en orden cronológico. Autor, Levy y Murnane (2003) establecieron el enfoque de tareas: la tecnología sustituye tareas y no ocupaciones completas, y las tareas rutinarias son las más fáciles de automatizar. Frey y Osborne (2017) estimaron, con un clasificador de procesos gaussianos aplicado a 702 ocupaciones, que 47 % del empleo de Estados Unidos enfrentaba un riesgo alto de automatización. Acemoglu y Restrepo (2018) formalizaron el proceso como una carrera entre el desplazamiento del trabajo y la creación de tareas nuevas, e incorporaron la condición de que automatizar solo ocurre cuando es más barato que pagar salarios.</w:t>
+        <w:t xml:space="preserve">Los antecedentes se presentan en orden cronológico. Autor et al. (2003) establecieron el enfoque de tareas: la tecnología sustituye tareas y no ocupaciones completas, y las tareas rutinarias son las más fáciles de automatizar. Frey y Osborne (2017) estimaron, con un clasificador de procesos gaussianos aplicado a 702 ocupaciones, que 47 % del empleo de Estados Unidos enfrentaba un riesgo alto de automatización. Acemoglu y Restrepo (2018) formalizaron el proceso como una carrera entre el desplazamiento del trabajo y la creación de tareas nuevas, e incorporaron la condición de que automatizar solo ocurre cuando es más barato que pagar salarios.</w:t>
       </w:r>
     </w:p>
     <w:p>
@@ -1161,7 +1329,7 @@
           <w:sz w:val="24"/>
           <w:szCs w:val="24"/>
         </w:rPr>
-        <w:t xml:space="preserve">Sobre la robótica, Graetz y Michaels (2018) encontraron, con datos de 17 países entre 1993 y 2007, que los robots industriales elevaron la productividad, el valor agregado y los salarios sin un efecto significativo en las horas totales trabajadas. Acemoglu y Restrepo (2019) atribuyeron el menor crecimiento del empleo en Estados Unidos a un desplazamiento más rápido, sobre todo en la manufactura, y a una creación de tareas nuevas más débil. Acemoglu y Restrepo (2020) estimaron que cada robot adicional por cada mil trabajadores redujo la razón empleo-población entre 0.18 y 0.34 puntos porcentuales en las zonas laborales de ese país.</w:t>
+        <w:t xml:space="preserve">Sobre la robótica, Graetz y Michaels (2018) encontraron, con datos de 17 países entre 1993 y 2007, que los robots industriales elevaron la productividad laboral, el valor agregado y los salarios, sin un efecto significativo en las horas totales trabajadas. Acemoglu y Restrepo (2019) atribuyeron el menor crecimiento del empleo en Estados Unidos durante tres décadas a un desplazamiento más rápido, sobre todo en la manufactura, y a una creación de tareas nuevas más débil. Acemoglu y Restrepo (2020) estimaron que cada robot adicional por cada mil trabajadores redujo la razón empleo-población entre 0.18 y 0.34 puntos porcentuales en las zonas laborales de ese país.</w:t>
       </w:r>
     </w:p>
     <w:p>
@@ -1176,7 +1344,7 @@
           <w:sz w:val="24"/>
           <w:szCs w:val="24"/>
         </w:rPr>
-        <w:t xml:space="preserve">Para México, Artuc, Christiaensen y Winkler (2019) mostraron que un robot adicional por cada mil trabajadores en Estados Unidos reduce 6.7 % el crecimiento de las exportaciones por trabajador de México hacia ese país, y que el empleo manufacturero cae en los municipios con ocupaciones más automatizables. Faber (2020) encontró que los robots instalados en Estados Unidos reducen el empleo en los mercados laborales mexicanos, con el mayor efecto en operadores de maquinaria de baja escolaridad de la manufactura. Webb (2020) midió la exposición de las ocupaciones con el texto de las patentes y mostró que, a diferencia del software y los robots, la IA se dirige a tareas de alta calificación.</w:t>
+        <w:t xml:space="preserve">Para México y los países en desarrollo, Artuc et al. (2019) encontraron que la automatización en Estados Unidos reduce el crecimiento de las exportaciones mexicanas y el empleo manufacturero en los municipios con ocupaciones más automatizables. Maloney y Molina (2019) no hallaron, en cambio, desplazamiento en los países en desarrollo, donde el empleo de operadores y ensambladores aumentó, aunque con indicios de polarización en México y Brasil. Faber (2020) mostró que los robots de Estados Unidos reducen el empleo en los mercados laborales mexicanos, sobre todo el de operadores de maquinaria de baja escolaridad, y Webb (2020) documentó, con el texto de las patentes, que a diferencia del software y los robots la IA se dirige a tareas de alta calificación.</w:t>
       </w:r>
     </w:p>
     <w:p>
@@ -1191,7 +1359,7 @@
           <w:sz w:val="24"/>
           <w:szCs w:val="24"/>
         </w:rPr>
-        <w:t xml:space="preserve">La llegada de los modelos de lenguaje abrió una nueva línea. Brynjolfsson, Rock y Syverson (2021) explicaron por qué los efectos de las tecnologías de propósito general tardan en aparecer en las estadísticas. Eloundou et al. (2023) estimaron que cerca de 80 % de los trabajadores de Estados Unidos tiene al menos 10 % de sus tareas expuestas a estos modelos. Felten, Raj y Seamans (2023) adaptaron su índice de exposición a la IA a los modelos de lenguaje, y Gmyrek, Berg y Bescond (2023) concluyeron para la OIT que el efecto dominante será complementar más que automatizar. En América Latina, Azuara, Ripani y Torres (2024) estimaron que 74 % de los empleos en México tiene más de 10 % de sus tareas expuestas, y Benítez-Rueda y Parrado (2024) calcularon que alrededor de 16 millones de empleos mexicanos están muy expuestos en un horizonte de un año. Finalmente, Handa et al. (2025) midieron por primera vez el uso real de la IA por ocupación a partir de millones de conversaciones con un asistente.</w:t>
+        <w:t xml:space="preserve">La llegada de los modelos de lenguaje abrió una nueva línea. Brynjolfsson et al. (2021) explicaron por qué los efectos de las tecnologías de propósito general tardan en aparecer en las estadísticas. Eloundou et al. (2023) midieron la exposición de las ocupaciones a estos modelos, Felten et al. (2023) adaptaron su índice de exposición a la IA a los modelos de lenguaje y Gmyrek et al. (2023) concluyeron para la Organización Internacional del Trabajo que el efecto dominante será complementar más que automatizar. En América Latina, Azuara et al. (2024) y Benítez-Rueda y Parrado (2024) estimaron la exposición del empleo mexicano. Márquez Stone y Sandoval Cabrera (2024) analizaron la adopción de robots en la industria automotriz de 14 estados del país, y Handa et al. (2025) midieron por primera vez el uso real de la IA por ocupación a partir de millones de conversaciones con un asistente.</w:t>
       </w:r>
     </w:p>
     <w:p>
@@ -1212,6 +1380,22 @@
     </w:p>
     <w:p>
       <w:pPr>
+        <w:keepNext/>
+        <w:spacing w:before="240" w:after="0" w:line="480" w:lineRule="auto"/>
+        <w:jc w:val="left"/>
+      </w:pPr>
+      <w:r>
+        <w:rPr>
+          <w:rFonts w:ascii="Times New Roman" w:hAnsi="Times New Roman" w:cs="Times New Roman" w:eastAsia="Times New Roman"/>
+          <w:b/>
+          <w:sz w:val="24"/>
+          <w:szCs w:val="24"/>
+        </w:rPr>
+        <w:t xml:space="preserve">7.1. Conceptos y definiciones</w:t>
+      </w:r>
+    </w:p>
+    <w:p>
+      <w:pPr>
         <w:spacing w:before="0" w:after="0" w:line="480" w:lineRule="auto"/>
         <w:ind w:firstLine="709"/>
         <w:jc w:val="both"/>
@@ -1222,7 +1406,7 @@
           <w:sz w:val="24"/>
           <w:szCs w:val="24"/>
         </w:rPr>
-        <w:t xml:space="preserve">¿Qué se sabe hasta ahora? El marco de tareas (Autor et al., 2003) y el modelo de desplazamiento y reinstalación (Acemoglu y Restrepo, 2018, 2019) son la base teórica de la investigación. Según este enfoque, el efecto de la automatización sobre el empleo depende del balance entre las tareas que pasan al capital y las tareas nuevas que surgen para el trabajo, y la sustitución se materializa solo cuando el costo del capital es menor que el salario. La paradoja de Moravec (Moravec, 1988), según la cual lo que resulta sencillo para las personas es difícil para las máquinas y viceversa, explica por qué la IA cognitiva y los robots avanzan sobre tareas distintas, como confirmó empíricamente Webb (2020).</w:t>
+        <w:t xml:space="preserve">Automatización y sustitución laboral. La automatización permite que el capital reemplace al trabajo en tareas que antes realizaban las personas, lo que produce un efecto de desplazamiento; la creación de tareas nuevas genera, en sentido contrario, un efecto de reinstalación del trabajo (Acemoglu y Restrepo, 2019). En este protocolo, el riesgo de sustitución laboral se entiende como la posibilidad de que ocurra ese desplazamiento en las tareas de una ocupación.</w:t>
       </w:r>
     </w:p>
     <w:p>
@@ -1237,7 +1421,7 @@
           <w:sz w:val="24"/>
           <w:szCs w:val="24"/>
         </w:rPr>
-        <w:t xml:space="preserve">¿Cómo se relaciona el problema con lo que se sabe? La literatura mide la exposición de las ocupaciones, pero lo hace por separado para cada tecnología y casi siempre con datos de Estados Unidos (Frey y Osborne, 2017; Eloundou et al., 2023; Felten et al., 2023). Los estudios para México muestran que la robotización afecta a la manufactura nacional a través del comercio (Artuc et al., 2019; Faber, 2020), y los trabajos del BID trasladan las medidas cognitivas a la región (Azuara et al., 2024; Benítez-Rueda y Parrado, 2024). Falta un análisis que combine ambas fronteras dentro de un mismo sector y que considere la rentabilidad de automatizar. La teoría de la curva J (Brynjolfsson et al., 2021) ayuda a interpretar por qué el efecto en el empleo todavía no es visible.</w:t>
+        <w:t xml:space="preserve">Modelos de lenguaje de gran escala. Se trata de modelos de lenguaje basados en la arquitectura Transformer que contienen cientos de miles de millones de parámetros o más, se entrenan con grandes volúmenes de texto y muestran una fuerte capacidad para comprender el lenguaje natural y resolver tareas complejas mediante la generación de texto; ejemplos de ellos son GPT-3, PaLM y LLaMA (Zhao et al., 2023). La arquitectura Transformer, en la que se basan, es una red neuronal que se apoya únicamente en mecanismos de atención (Vaswani et al., 2017).</w:t>
       </w:r>
     </w:p>
     <w:p>
@@ -1252,7 +1436,130 @@
           <w:sz w:val="24"/>
           <w:szCs w:val="24"/>
         </w:rPr>
-        <w:t xml:space="preserve">¿Por qué este método? El enfoque es cuantitativo porque el riesgo se expresa en magnitudes comparables entre ocupaciones, ramas y territorios. Los índices de exposición se construyen a partir de los descriptores de tareas de O*NET, como en la literatura de referencia, y se validan contra medidas externas. Los modelos estadísticos permiten contrastar las hipótesis con inferencia formal, y los modelos de aprendizaje automático aportan capacidad predictiva y medidas de importancia de variables. La proyección por escenarios, en lugar de un pronóstico, responde a que no existe un panel histórico de automatización observada para Jalisco.</w:t>
+        <w:t xml:space="preserve">Robot industrial. La Federación Internacional de Robótica define un robot industrial como una máquina controlada automáticamente, reprogramable y multipropósito (IFR, 2014, como se citó en Acemoglu y Restrepo, 2020).</w:t>
+      </w:r>
+    </w:p>
+    <w:p>
+      <w:pPr>
+        <w:spacing w:before="0" w:after="0" w:line="480" w:lineRule="auto"/>
+        <w:ind w:firstLine="709"/>
+        <w:jc w:val="both"/>
+      </w:pPr>
+      <w:r>
+        <w:rPr>
+          <w:rFonts w:ascii="Times New Roman" w:hAnsi="Times New Roman" w:cs="Times New Roman" w:eastAsia="Times New Roman"/>
+          <w:sz w:val="24"/>
+          <w:szCs w:val="24"/>
+        </w:rPr>
+        <w:t xml:space="preserve">Nearshoring. Es la relocalización de actividades productivas hacia países más cercanos al lugar de consumo, a diferencia del reshoring, que consiste en regresar la producción al país de origen (Banco de México, 2022). En la literatura de gestión de operaciones se le define como la reubicación de la producción hacia la región de origen de la empresa (Merino et al., 2021). Para México, la cercanía geográfica con Estados Unidos y el T-MEC lo convierten en un candidato natural para la relocalización de empresas que abastecen al mercado estadounidense (Banco de México, 2022).</w:t>
+      </w:r>
+    </w:p>
+    <w:p>
+      <w:pPr>
+        <w:spacing w:before="0" w:after="0" w:line="480" w:lineRule="auto"/>
+        <w:ind w:firstLine="709"/>
+        <w:jc w:val="both"/>
+      </w:pPr>
+      <w:r>
+        <w:rPr>
+          <w:rFonts w:ascii="Times New Roman" w:hAnsi="Times New Roman" w:cs="Times New Roman" w:eastAsia="Times New Roman"/>
+          <w:sz w:val="24"/>
+          <w:szCs w:val="24"/>
+        </w:rPr>
+        <w:t xml:space="preserve">Informalidad laboral. Comprende a las personas ocupadas que son laboralmente vulnerables por la naturaleza de la unidad económica para la que trabajan, o cuyo vínculo laboral no es reconocido por su fuente de trabajo; incluye a quienes trabajan en micronegocios no registrados y a quienes laboran sin seguridad social en unidades económicas registradas (INEGI, 2025).</w:t>
+      </w:r>
+    </w:p>
+    <w:p>
+      <w:pPr>
+        <w:keepNext/>
+        <w:spacing w:before="240" w:after="0" w:line="480" w:lineRule="auto"/>
+        <w:jc w:val="left"/>
+      </w:pPr>
+      <w:r>
+        <w:rPr>
+          <w:rFonts w:ascii="Times New Roman" w:hAnsi="Times New Roman" w:cs="Times New Roman" w:eastAsia="Times New Roman"/>
+          <w:b/>
+          <w:sz w:val="24"/>
+          <w:szCs w:val="24"/>
+        </w:rPr>
+        <w:t xml:space="preserve">7.2. Teoría de tareas y condición de rentabilidad</w:t>
+      </w:r>
+    </w:p>
+    <w:p>
+      <w:pPr>
+        <w:spacing w:before="0" w:after="0" w:line="480" w:lineRule="auto"/>
+        <w:ind w:firstLine="709"/>
+        <w:jc w:val="both"/>
+      </w:pPr>
+      <w:r>
+        <w:rPr>
+          <w:rFonts w:ascii="Times New Roman" w:hAnsi="Times New Roman" w:cs="Times New Roman" w:eastAsia="Times New Roman"/>
+          <w:sz w:val="24"/>
+          <w:szCs w:val="24"/>
+        </w:rPr>
+        <w:t xml:space="preserve">El fundamento teórico del proyecto es el enfoque de tareas (Autor et al., 2003), según el cual la tecnología no sustituye ocupaciones completas, sino tareas específicas. Acemoglu y Restrepo (2018, 2019) desarrollan este enfoque como una carrera entre el desplazamiento que genera la automatización y la reinstalación que generan las tareas nuevas, y establecen que la sustitución solo se materializa cuando el costo del capital es menor que el salario. La teoría de la curva J de Brynjolfsson et al. (2021) complementa este marco al explicar por qué el efecto de las tecnologías de propósito general puede tardar varios años en observarse.</w:t>
+      </w:r>
+    </w:p>
+    <w:p>
+      <w:pPr>
+        <w:keepNext/>
+        <w:spacing w:before="240" w:after="0" w:line="480" w:lineRule="auto"/>
+        <w:jc w:val="left"/>
+      </w:pPr>
+      <w:r>
+        <w:rPr>
+          <w:rFonts w:ascii="Times New Roman" w:hAnsi="Times New Roman" w:cs="Times New Roman" w:eastAsia="Times New Roman"/>
+          <w:b/>
+          <w:sz w:val="24"/>
+          <w:szCs w:val="24"/>
+        </w:rPr>
+        <w:t xml:space="preserve">7.3. Dos fronteras de la automatización</w:t>
+      </w:r>
+    </w:p>
+    <w:p>
+      <w:pPr>
+        <w:spacing w:before="0" w:after="0" w:line="480" w:lineRule="auto"/>
+        <w:ind w:firstLine="709"/>
+        <w:jc w:val="both"/>
+      </w:pPr>
+      <w:r>
+        <w:rPr>
+          <w:rFonts w:ascii="Times New Roman" w:hAnsi="Times New Roman" w:cs="Times New Roman" w:eastAsia="Times New Roman"/>
+          <w:sz w:val="24"/>
+          <w:szCs w:val="24"/>
+        </w:rPr>
+        <w:t xml:space="preserve">En este protocolo se denomina frontera cognitiva al conjunto de tareas que pueden automatizarse con modelos de lenguaje, y frontera física al conjunto de tareas que pueden automatizarse con robots. La distinción se sustenta en la clasificación de tareas cognitivas y manuales de Autor et al. (2003) y en la evidencia de Webb (2020), quien encuentra que, a diferencia del software y los robots, la inteligencia artificial se dirige a tareas de alta calificación. Si ambas tecnologías se dirigen a tareas distintas, es de esperar que una misma industria, como la manufacturera, enfrente riesgos diferentes en sus áreas de producción y en sus áreas administrativas y técnicas, lo que da origen a la primera hipótesis.</w:t>
+      </w:r>
+    </w:p>
+    <w:p>
+      <w:pPr>
+        <w:keepNext/>
+        <w:spacing w:before="240" w:after="0" w:line="480" w:lineRule="auto"/>
+        <w:jc w:val="left"/>
+      </w:pPr>
+      <w:r>
+        <w:rPr>
+          <w:rFonts w:ascii="Times New Roman" w:hAnsi="Times New Roman" w:cs="Times New Roman" w:eastAsia="Times New Roman"/>
+          <w:b/>
+          <w:sz w:val="24"/>
+          <w:szCs w:val="24"/>
+        </w:rPr>
+        <w:t xml:space="preserve">7.4. Elección del método</w:t>
+      </w:r>
+    </w:p>
+    <w:p>
+      <w:pPr>
+        <w:spacing w:before="0" w:after="0" w:line="480" w:lineRule="auto"/>
+        <w:ind w:firstLine="709"/>
+        <w:jc w:val="both"/>
+      </w:pPr>
+      <w:r>
+        <w:rPr>
+          <w:rFonts w:ascii="Times New Roman" w:hAnsi="Times New Roman" w:cs="Times New Roman" w:eastAsia="Times New Roman"/>
+          <w:sz w:val="24"/>
+          <w:szCs w:val="24"/>
+        </w:rPr>
+        <w:t xml:space="preserve">El enfoque es cuantitativo porque el riesgo se expresa en magnitudes comparables entre ocupaciones, ramas y territorios. Siguiendo a la literatura de referencia (Eloundou et al., 2023; Felten et al., 2021; Webb, 2020), la exposición se mide a partir de los descriptores de tareas y habilidades de O*NET. Los modelos estadísticos permiten contrastar las hipótesis con inferencia formal, y los modelos de aprendizaje automático aportan capacidad predictiva y medidas de importancia de las variables. La proyección por escenarios, en lugar de un pronóstico, responde a que no existe un registro histórico de automatización observada para Jalisco.</w:t>
       </w:r>
     </w:p>
     <w:p>
@@ -1298,7 +1605,7 @@
           <w:sz w:val="24"/>
           <w:szCs w:val="24"/>
         </w:rPr>
-        <w:t xml:space="preserve">Población y unidades de análisis. Trabajadores ocupados en la industria manufacturera de Jalisco (sectores 31-33 del SCIAN). Las unidades de análisis son la ocupación (clasificación SINCO 2011 y su equivalencia SOC), el trabajador, la rama manufacturera y el municipio.</w:t>
+        <w:t xml:space="preserve">Población y unidades de análisis. Trabajadores ocupados en la industria manufacturera de Jalisco, sectores 31 a 33 del Sistema de Clasificación Industrial de América del Norte. Las unidades de análisis son la ocupación, clasificada según el Sistema Nacional de Clasificación de Ocupaciones (INEGI, 2011), el trabajador, la rama manufacturera y el municipio.</w:t>
       </w:r>
     </w:p>
     <w:p>
@@ -1313,7 +1620,7 @@
           <w:sz w:val="24"/>
           <w:szCs w:val="24"/>
         </w:rPr>
-        <w:t xml:space="preserve">Fuentes de datos. Todas son públicas y se integran en una base de datos SQL Server que funciona como fuente única: O*NET 28.3 para el contenido de tareas; el apéndice de Felten et al. (2021) y la base de capacidades de Epoch AI (doce pruebas de referencia, 2022-2026) para el índice cognitivo; la ENOE del tercer trimestre de 2024 (6,147 ocupados de Jalisco con ocupación a cuatro dígitos) y once trimestres consecutivos para el análisis de informalidad; los Censos Económicos 2003 a 2023; el empleo formal mensual del IMSS 2000-2024; la inversión extranjera directa de la Secretaría de Economía; las estadísticas de robots de la Federación Internacional de Robótica; y el Índice Económico de Anthropic como medida de uso observado. El cruce entre SINCO y SOC usa las tablas comparativas oficiales del INEGI.</w:t>
+        <w:t xml:space="preserve">Fuentes de datos. Se integrarán en una base de datos SQL Server las siguientes fuentes públicas: la ENOE y los Censos Económicos (INEGI, 2025, s.f.), la base de ocupaciones O*NET (National Center for O*NET Development, 2024), el índice de exposición a la IA y sus datos de habilidades (Felten et al., 2021), los resultados de los modelos de lenguaje en pruebas de referencia (Epoch AI, s.f.), las estadísticas de robots industriales (IFR, 2025), la inversión extranjera directa (SE, 2025) y el uso observado de la IA por ocupación (Handa et al., 2025).</w:t>
       </w:r>
     </w:p>
     <w:p>
@@ -1328,7 +1635,7 @@
           <w:sz w:val="24"/>
           <w:szCs w:val="24"/>
         </w:rPr>
-        <w:t xml:space="preserve">Procedimiento. El trabajo se organiza en seis pasos, alineados con los objetivos específicos:</w:t>
+        <w:t xml:space="preserve">Procedimiento. El trabajo se organiza en seis pasos alineados con los objetivos específicos:</w:t>
       </w:r>
     </w:p>
     <w:p>
@@ -1358,7 +1665,7 @@
           <w:sz w:val="24"/>
           <w:szCs w:val="24"/>
         </w:rPr>
-        <w:t xml:space="preserve">2. Construcción de los índices DBOE y DEOE a partir de O*NET, su validación contra los índices publicados y contra la medida de robots de Webb (2020), y su traslado a las ocupaciones manufactureras mediante la cadena de cruce SINCO-SOC.</w:t>
+        <w:t xml:space="preserve">2. Construcción de los índices de exposición cognitiva y física a partir de O*NET, su validación contra índices publicados (Felten et al., 2021; Webb, 2020) y su traslado a las ocupaciones mexicanas mediante las tablas de correspondencia del INEGI.</w:t>
       </w:r>
     </w:p>
     <w:p>
@@ -1388,7 +1695,7 @@
           <w:sz w:val="24"/>
           <w:szCs w:val="24"/>
         </w:rPr>
-        <w:t xml:space="preserve">4. Modelación de la exposición frente al uso observado de la IA con un modelo de dos partes (hurdle), complementado con modelos de aprendizaje supervisado (bosques aleatorios y gradient boosting) con validación cruzada e interpretación mediante valores SHAP.</w:t>
+        <w:t xml:space="preserve">4. Modelación de la exposición frente al uso observado de la IA con un modelo de dos partes (hurdle), complementado con modelos de aprendizaje supervisado, como bosques aleatorios y gradient boosting, con validación cruzada e interpretación mediante valores SHAP.</w:t>
       </w:r>
     </w:p>
     <w:p>
@@ -1403,7 +1710,7 @@
           <w:sz w:val="24"/>
           <w:szCs w:val="24"/>
         </w:rPr>
-        <w:t xml:space="preserve">5. Contraste de H2 con un panel de los Censos Económicos y efectos fijos de periodo, usando el Índice de Rentabilidad de la Automatización rezagado e inferencia por permutación. Se propone desagregar este análisis a nivel de rama manufacturera.</w:t>
+        <w:t xml:space="preserve">5. Contraste de H2 con un panel de los Censos Económicos con efectos fijos de periodo, usando un índice de rentabilidad de la automatización rezagado e inferencia por permutación, desagregado a nivel de rama manufacturera.</w:t>
       </w:r>
     </w:p>
     <w:p>
@@ -1418,7 +1725,7 @@
           <w:sz w:val="24"/>
           <w:szCs w:val="24"/>
         </w:rPr>
-        <w:t xml:space="preserve">6. Proyección 2025-2030 en tres escenarios (conservador, base y acelerado) que combinan la exposición, la rentabilidad y las curvas de capacidad de la IA y de adopción robótica, para dimensionar la presión de sustitución en el sector, y elaboración del tablero de visualización.</w:t>
+        <w:t xml:space="preserve">6. Proyección 2025-2030 en tres escenarios (conservador, base y acelerado) que combinan la exposición, la rentabilidad y la evolución de la capacidad de la IA y de la adopción de robots, para dimensionar la presión de sustitución en el sector, y elaboración del tablero de visualización.</w:t>
       </w:r>
     </w:p>
     <w:p>
@@ -1433,7 +1740,7 @@
           <w:sz w:val="24"/>
           <w:szCs w:val="24"/>
         </w:rPr>
-        <w:t xml:space="preserve">Herramientas de análisis. Python (pandas, NumPy, statsmodels, scikit-learn, factor_analyzer y Matplotlib), SQL Server para la integración de datos y GitHub para el control de versiones y la reproducibilidad. Cada tabla y figura se genera con un script versionado.</w:t>
+        <w:t xml:space="preserve">Herramientas de análisis. Python (pandas, NumPy, statsmodels, scikit-learn, factor_analyzer y Matplotlib), SQL Server para la integración de datos y GitHub para el control de versiones y la reproducibilidad del análisis.</w:t>
       </w:r>
     </w:p>
     <w:p>
@@ -3269,7 +3576,7 @@
           <w:sz w:val="24"/>
           <w:szCs w:val="24"/>
         </w:rPr>
-        <w:t xml:space="preserve">Benítez-Rueda, M., &amp; Parrado, E. (2024). “Mirror, mirror on the wall: Which jobs will AI replace after all?”: A new index of occupational exposure (IDB Working Paper 1624). Banco Interamericano de Desarrollo.</w:t>
+        <w:t xml:space="preserve">Banco de México. (2022). Opinión empresarial sobre la relocalización de las empresas hacia México (Recuadro 2). En Reporte sobre las economías regionales, abril-junio 2022 (pp. 16-21). https://www.banxico.org.mx/publicaciones-y-prensa/reportes-sobre-las-economias-regionales/recuadros/%7BE243D1D1-63F5-6C86-38F0-28BD3CF33CE6%7D.pdf</w:t>
       </w:r>
     </w:p>
     <w:p>
@@ -3284,7 +3591,7 @@
           <w:sz w:val="24"/>
           <w:szCs w:val="24"/>
         </w:rPr>
-        <w:t xml:space="preserve">Brynjolfsson, E., Rock, D., &amp; Syverson, C. (2021). The productivity J-curve: How intangibles complement general purpose technologies. American Economic Journal: Macroeconomics, 13(1), 333-372. https://doi.org/10.1257/mac.20180386</w:t>
+        <w:t xml:space="preserve">Benítez-Rueda, M., &amp; Parrado, E. (2024). “Mirror, mirror on the wall: Which jobs will AI replace after all?”: A new index of occupational exposure (IDB Working Paper 1624). Banco Interamericano de Desarrollo.</w:t>
       </w:r>
     </w:p>
     <w:p>
@@ -3299,7 +3606,7 @@
           <w:sz w:val="24"/>
           <w:szCs w:val="24"/>
         </w:rPr>
-        <w:t xml:space="preserve">Eloundou, T., Manning, S., Mishkin, P., &amp; Rock, D. (2023). GPTs are GPTs: An early look at the labor market impact potential of large language models. arXiv. https://arxiv.org/abs/2303.10130</w:t>
+        <w:t xml:space="preserve">Brynjolfsson, E., Rock, D., &amp; Syverson, C. (2021). The productivity J-curve: How intangibles complement general purpose technologies. American Economic Journal: Macroeconomics, 13(1), 333-372. https://doi.org/10.1257/mac.20180386</w:t>
       </w:r>
     </w:p>
     <w:p>
@@ -3314,7 +3621,7 @@
           <w:sz w:val="24"/>
           <w:szCs w:val="24"/>
         </w:rPr>
-        <w:t xml:space="preserve">Faber, M. (2020). Robots and reshoring: Evidence from Mexican labor markets. Journal of International Economics, 127, 103384. https://doi.org/10.1016/j.jinteco.2020.103384</w:t>
+        <w:t xml:space="preserve">Eloundou, T., Manning, S., Mishkin, P., &amp; Rock, D. (2023). GPTs are GPTs: An early look at the labor market impact potential of large language models. arXiv. https://arxiv.org/abs/2303.10130</w:t>
       </w:r>
     </w:p>
     <w:p>
@@ -3329,7 +3636,7 @@
           <w:sz w:val="24"/>
           <w:szCs w:val="24"/>
         </w:rPr>
-        <w:t xml:space="preserve">Felten, E., Raj, M., &amp; Seamans, R. (2021). Occupational, industry, and geographic exposure to artificial intelligence: A novel dataset and its potential uses. Strategic Management Journal, 42(12), 2195-2217. https://doi.org/10.1002/smj.3286</w:t>
+        <w:t xml:space="preserve">Epoch AI. (s.f.). Datos sobre el desempeño de modelos de inteligencia artificial en pruebas de referencia [Base de datos]. https://epoch.ai/data</w:t>
       </w:r>
     </w:p>
     <w:p>
@@ -3344,7 +3651,7 @@
           <w:sz w:val="24"/>
           <w:szCs w:val="24"/>
         </w:rPr>
-        <w:t xml:space="preserve">Felten, E., Raj, M., &amp; Seamans, R. (2023). How will language modelers like ChatGPT affect occupations and industries? arXiv. https://arxiv.org/abs/2303.01157</w:t>
+        <w:t xml:space="preserve">Faber, M. (2020). Robots and reshoring: Evidence from Mexican labor markets. Journal of International Economics, 127, 103384. https://doi.org/10.1016/j.jinteco.2020.103384</w:t>
       </w:r>
     </w:p>
     <w:p>
@@ -3359,7 +3666,7 @@
           <w:sz w:val="24"/>
           <w:szCs w:val="24"/>
         </w:rPr>
-        <w:t xml:space="preserve">Frey, C. B., &amp; Osborne, M. A. (2017). The future of employment: How susceptible are jobs to computerisation? Technological Forecasting and Social Change, 114, 254-280. https://doi.org/10.1016/j.techfore.2016.08.019</w:t>
+        <w:t xml:space="preserve">Felten, E., Raj, M., &amp; Seamans, R. (2021). Occupational, industry, and geographic exposure to artificial intelligence: A novel dataset and its potential uses. Strategic Management Journal, 42(12), 2195-2217. https://doi.org/10.1002/smj.3286</w:t>
       </w:r>
     </w:p>
     <w:p>
@@ -3374,7 +3681,7 @@
           <w:sz w:val="24"/>
           <w:szCs w:val="24"/>
         </w:rPr>
-        <w:t xml:space="preserve">Gmyrek, P., Berg, J., &amp; Bescond, D. (2023). Generative AI and jobs: A global analysis of potential effects on job quantity and quality (ILO Working Paper 96). Organización Internacional del Trabajo. https://doi.org/10.54394/FHEM8239</w:t>
+        <w:t xml:space="preserve">Felten, E., Raj, M., &amp; Seamans, R. (2023). How will language modelers like ChatGPT affect occupations and industries? arXiv. https://arxiv.org/abs/2303.01157</w:t>
       </w:r>
     </w:p>
     <w:p>
@@ -3389,7 +3696,7 @@
           <w:sz w:val="24"/>
           <w:szCs w:val="24"/>
         </w:rPr>
-        <w:t xml:space="preserve">Graetz, G., &amp; Michaels, G. (2018). Robots at work. The Review of Economics and Statistics, 100(5), 753-768. https://doi.org/10.1162/rest_a_00754</w:t>
+        <w:t xml:space="preserve">Frey, C. B., &amp; Osborne, M. A. (2017). The future of employment: How susceptible are jobs to computerisation? Technological Forecasting and Social Change, 114, 254-280. https://doi.org/10.1016/j.techfore.2016.08.019</w:t>
       </w:r>
     </w:p>
     <w:p>
@@ -3404,7 +3711,7 @@
           <w:sz w:val="24"/>
           <w:szCs w:val="24"/>
         </w:rPr>
-        <w:t xml:space="preserve">Handa, K., Tamkin, A., McCain, M., Huang, S., Durmus, E., Heck, S., Mueller, J., Hong, J., Ritchie, S., Belonax, T., Troy, K. K., Amodei, D., Kaplan, J., Clark, J., &amp; Ganguli, D. (2025). Which economic tasks are performed with AI? Evidence from millions of Claude conversations. arXiv. https://arxiv.org/abs/2503.04761</w:t>
+        <w:t xml:space="preserve">Gmyrek, P., Berg, J., &amp; Bescond, D. (2023). Generative AI and jobs: A global analysis of potential effects on job quantity and quality (ILO Working Paper 96). Organización Internacional del Trabajo. https://doi.org/10.54394/FHEM8239</w:t>
       </w:r>
     </w:p>
     <w:p>
@@ -3419,7 +3726,7 @@
           <w:sz w:val="24"/>
           <w:szCs w:val="24"/>
         </w:rPr>
-        <w:t xml:space="preserve">Moravec, H. (1988). Mind children: The future of robot and human intelligence. Harvard University Press.</w:t>
+        <w:t xml:space="preserve">Graetz, G., &amp; Michaels, G. (2018). Robots at work. The Review of Economics and Statistics, 100(5), 753-768. https://doi.org/10.1162/rest_a_00754</w:t>
       </w:r>
     </w:p>
     <w:p>
@@ -3434,7 +3741,187 @@
           <w:sz w:val="24"/>
           <w:szCs w:val="24"/>
         </w:rPr>
+        <w:t xml:space="preserve">Handa, K., Tamkin, A., McCain, M., Huang, S., Durmus, E., Heck, S., Mueller, J., Hong, J., Ritchie, S., Belonax, T., Troy, K. K., Amodei, D., Kaplan, J., Clark, J., &amp; Ganguli, D. (2025). Which economic tasks are performed with AI? Evidence from millions of Claude conversations. arXiv. https://arxiv.org/abs/2503.04761</w:t>
+      </w:r>
+    </w:p>
+    <w:p>
+      <w:pPr>
+        <w:spacing w:before="0" w:after="0" w:line="360" w:lineRule="auto"/>
+        <w:ind w:left="709" w:hanging="709"/>
+        <w:jc w:val="left"/>
+      </w:pPr>
+      <w:r>
+        <w:rPr>
+          <w:rFonts w:ascii="Times New Roman" w:hAnsi="Times New Roman" w:cs="Times New Roman" w:eastAsia="Times New Roman"/>
+          <w:sz w:val="24"/>
+          <w:szCs w:val="24"/>
+        </w:rPr>
+        <w:t xml:space="preserve">Instituto Nacional de Estadística y Geografía. (2011). Sistema Nacional de Clasificación de Ocupaciones (SINCO). INEGI.</w:t>
+      </w:r>
+    </w:p>
+    <w:p>
+      <w:pPr>
+        <w:spacing w:before="0" w:after="0" w:line="360" w:lineRule="auto"/>
+        <w:ind w:left="709" w:hanging="709"/>
+        <w:jc w:val="left"/>
+      </w:pPr>
+      <w:r>
+        <w:rPr>
+          <w:rFonts w:ascii="Times New Roman" w:hAnsi="Times New Roman" w:cs="Times New Roman" w:eastAsia="Times New Roman"/>
+          <w:sz w:val="24"/>
+          <w:szCs w:val="24"/>
+        </w:rPr>
+        <w:t xml:space="preserve">Instituto Nacional de Estadística y Geografía. (2025). Encuesta Nacional de Ocupación y Empleo (ENOE), Jalisco: Cuarto trimestre de 2024 (Boletín de indicador 110/25). https://www.inegi.org.mx/contenidos/saladeprensa/boletines/2025/enoe/enoe2025_02_Jal.pdf</w:t>
+      </w:r>
+    </w:p>
+    <w:p>
+      <w:pPr>
+        <w:spacing w:before="0" w:after="0" w:line="360" w:lineRule="auto"/>
+        <w:ind w:left="709" w:hanging="709"/>
+        <w:jc w:val="left"/>
+      </w:pPr>
+      <w:r>
+        <w:rPr>
+          <w:rFonts w:ascii="Times New Roman" w:hAnsi="Times New Roman" w:cs="Times New Roman" w:eastAsia="Times New Roman"/>
+          <w:sz w:val="24"/>
+          <w:szCs w:val="24"/>
+        </w:rPr>
+        <w:t xml:space="preserve">Instituto Nacional de Estadística y Geografía. (s.f.). Censos Económicos [Programa de información]. https://www.inegi.org.mx/programas/ce/</w:t>
+      </w:r>
+    </w:p>
+    <w:p>
+      <w:pPr>
+        <w:spacing w:before="0" w:after="0" w:line="360" w:lineRule="auto"/>
+        <w:ind w:left="709" w:hanging="709"/>
+        <w:jc w:val="left"/>
+      </w:pPr>
+      <w:r>
+        <w:rPr>
+          <w:rFonts w:ascii="Times New Roman" w:hAnsi="Times New Roman" w:cs="Times New Roman" w:eastAsia="Times New Roman"/>
+          <w:sz w:val="24"/>
+          <w:szCs w:val="24"/>
+        </w:rPr>
+        <w:t xml:space="preserve">International Federation of Robotics. (2025). World Robotics 2025: Industrial robots [Resumen ejecutivo]. IFR.</w:t>
+      </w:r>
+    </w:p>
+    <w:p>
+      <w:pPr>
+        <w:spacing w:before="0" w:after="0" w:line="360" w:lineRule="auto"/>
+        <w:ind w:left="709" w:hanging="709"/>
+        <w:jc w:val="left"/>
+      </w:pPr>
+      <w:r>
+        <w:rPr>
+          <w:rFonts w:ascii="Times New Roman" w:hAnsi="Times New Roman" w:cs="Times New Roman" w:eastAsia="Times New Roman"/>
+          <w:sz w:val="24"/>
+          <w:szCs w:val="24"/>
+        </w:rPr>
+        <w:t xml:space="preserve">Maloney, W. F., &amp; Molina, C. (2019). Is automation labor-displacing in the developing countries, too? Robots, polarization, and jobs (Policy Research Working Paper). Banco Mundial. https://doi.org/10.1596/33301</w:t>
+      </w:r>
+    </w:p>
+    <w:p>
+      <w:pPr>
+        <w:spacing w:before="0" w:after="0" w:line="360" w:lineRule="auto"/>
+        <w:ind w:left="709" w:hanging="709"/>
+        <w:jc w:val="left"/>
+      </w:pPr>
+      <w:r>
+        <w:rPr>
+          <w:rFonts w:ascii="Times New Roman" w:hAnsi="Times New Roman" w:cs="Times New Roman" w:eastAsia="Times New Roman"/>
+          <w:sz w:val="24"/>
+          <w:szCs w:val="24"/>
+        </w:rPr>
+        <w:t xml:space="preserve">Márquez Stone, V., &amp; Sandoval Cabrera, S. V. (2024). Effects of automation on Mexican automotive employment: 2013-2022. The Indian Journal of Labour Economics. https://doi.org/10.1007/s41027-024-00505-5</w:t>
+      </w:r>
+    </w:p>
+    <w:p>
+      <w:pPr>
+        <w:spacing w:before="0" w:after="0" w:line="360" w:lineRule="auto"/>
+        <w:ind w:left="709" w:hanging="709"/>
+        <w:jc w:val="left"/>
+      </w:pPr>
+      <w:r>
+        <w:rPr>
+          <w:rFonts w:ascii="Times New Roman" w:hAnsi="Times New Roman" w:cs="Times New Roman" w:eastAsia="Times New Roman"/>
+          <w:sz w:val="24"/>
+          <w:szCs w:val="24"/>
+        </w:rPr>
+        <w:t xml:space="preserve">Merino, F., Di Stefano, C., &amp; Fratocchi, L. (2021). Back-shoring vs near-shoring: A comparative exploratory study in the footwear industry. Operations Management Research, 14(1-2), 17-37. https://doi.org/10.1007/s12063-020-00173-w</w:t>
+      </w:r>
+    </w:p>
+    <w:p>
+      <w:pPr>
+        <w:spacing w:before="0" w:after="0" w:line="360" w:lineRule="auto"/>
+        <w:ind w:left="709" w:hanging="709"/>
+        <w:jc w:val="left"/>
+      </w:pPr>
+      <w:r>
+        <w:rPr>
+          <w:rFonts w:ascii="Times New Roman" w:hAnsi="Times New Roman" w:cs="Times New Roman" w:eastAsia="Times New Roman"/>
+          <w:sz w:val="24"/>
+          <w:szCs w:val="24"/>
+        </w:rPr>
+        <w:t xml:space="preserve">National Center for O*NET Development. (2024). O*NET 28.3 Database [Base de datos]. U.S. Department of Labor. https://www.onetcenter.org/database.html</w:t>
+      </w:r>
+    </w:p>
+    <w:p>
+      <w:pPr>
+        <w:spacing w:before="0" w:after="0" w:line="360" w:lineRule="auto"/>
+        <w:ind w:left="709" w:hanging="709"/>
+        <w:jc w:val="left"/>
+      </w:pPr>
+      <w:r>
+        <w:rPr>
+          <w:rFonts w:ascii="Times New Roman" w:hAnsi="Times New Roman" w:cs="Times New Roman" w:eastAsia="Times New Roman"/>
+          <w:sz w:val="24"/>
+          <w:szCs w:val="24"/>
+        </w:rPr>
+        <w:t xml:space="preserve">Secretaría de Economía. (2025). Inversión extranjera directa en México: Cuarto trimestre de 2024 [Informe]. Gobierno de México. https://www.gob.mx/cms/uploads/attachment/file/980231/20250225_IED_4T_2024_Versi_n_p_blica_VF.pdf</w:t>
+      </w:r>
+    </w:p>
+    <w:p>
+      <w:pPr>
+        <w:spacing w:before="0" w:after="0" w:line="360" w:lineRule="auto"/>
+        <w:ind w:left="709" w:hanging="709"/>
+        <w:jc w:val="left"/>
+      </w:pPr>
+      <w:r>
+        <w:rPr>
+          <w:rFonts w:ascii="Times New Roman" w:hAnsi="Times New Roman" w:cs="Times New Roman" w:eastAsia="Times New Roman"/>
+          <w:sz w:val="24"/>
+          <w:szCs w:val="24"/>
+        </w:rPr>
+        <w:t xml:space="preserve">Vaswani, A., Shazeer, N., Parmar, N., Uszkoreit, J., Jones, L., Gomez, A. N., Kaiser, Ł., &amp; Polosukhin, I. (2017). Attention is all you need. Advances in Neural Information Processing Systems, 30. https://arxiv.org/abs/1706.03762</w:t>
+      </w:r>
+    </w:p>
+    <w:p>
+      <w:pPr>
+        <w:spacing w:before="0" w:after="0" w:line="360" w:lineRule="auto"/>
+        <w:ind w:left="709" w:hanging="709"/>
+        <w:jc w:val="left"/>
+      </w:pPr>
+      <w:r>
+        <w:rPr>
+          <w:rFonts w:ascii="Times New Roman" w:hAnsi="Times New Roman" w:cs="Times New Roman" w:eastAsia="Times New Roman"/>
+          <w:sz w:val="24"/>
+          <w:szCs w:val="24"/>
+        </w:rPr>
         <w:t xml:space="preserve">Webb, M. (2020). The impact of artificial intelligence on the labor market [Documento de trabajo]. Stanford University. https://www.michaelwebb.co/webb_ai.pdf</w:t>
+      </w:r>
+    </w:p>
+    <w:p>
+      <w:pPr>
+        <w:spacing w:before="0" w:after="0" w:line="360" w:lineRule="auto"/>
+        <w:ind w:left="709" w:hanging="709"/>
+        <w:jc w:val="left"/>
+      </w:pPr>
+      <w:r>
+        <w:rPr>
+          <w:rFonts w:ascii="Times New Roman" w:hAnsi="Times New Roman" w:cs="Times New Roman" w:eastAsia="Times New Roman"/>
+          <w:sz w:val="24"/>
+          <w:szCs w:val="24"/>
+        </w:rPr>
+        <w:t xml:space="preserve">Zhao, W. X., Zhou, K., Li, J., Tang, T., Wang, X., Hou, Y., Min, Y., Zhang, B., Zhang, J., Dong, Z., Du, Y., Yang, C., Chen, Y., Chen, Z., Jiang, J., Ren, R., Li, Y., Tang, X., Liu, Z., . . . Wen, J.-R. (2023). A survey of large language models. arXiv. https://arxiv.org/abs/2303.18223</w:t>
       </w:r>
     </w:p>
     <w:sectPr>

</xml_diff>

<commit_message>
Protocolo: refocus on occupational mobility in computer engineering occupations; build on Carlos's cleaned layout
</commit_message>
<xml_diff>
--- a/3er-semestre/desarrollo-proyecto-i/tareas/Protocolo/Protocolo_Investigacion_CarlosPulidoRosas.docx
+++ b/3er-semestre/desarrollo-proyecto-i/tareas/Protocolo/Protocolo_Investigacion_CarlosPulidoRosas.docx
@@ -235,7 +235,7 @@
     </w:p>
     <w:p>
       <w:pPr>
-        <w:pStyle w:val="Textoindependiente"/>
+        <w:pStyle w:val="BodyText"/>
         <w:tabs>
           <w:tab w:val="left" w:pos="8222"/>
         </w:tabs>
@@ -250,7 +250,7 @@
     </w:p>
     <w:p>
       <w:pPr>
-        <w:pStyle w:val="Textoindependiente"/>
+        <w:pStyle w:val="BodyText"/>
         <w:tabs>
           <w:tab w:val="left" w:pos="8222"/>
         </w:tabs>
@@ -267,24 +267,12 @@
           <w:sz w:val="28"/>
           <w:lang w:val="es-ES"/>
         </w:rPr>
-        <w:t>Modelo de evaluación del riesgo de sustitución laboral mediante herramientas de ciencia de datos: inteligencia artificial cognitiva y robótica en la industria manufacturera de Jalisco</w:t>
-      </w:r>
-      <w:r>
-        <w:rPr>
-          <w:sz w:val="28"/>
-          <w:lang w:val="es-ES"/>
-        </w:rPr>
-      </w:r>
-      <w:r>
-        <w:rPr>
-          <w:sz w:val="28"/>
-          <w:lang w:val="es-ES"/>
-        </w:rPr>
-      </w:r>
-    </w:p>
-    <w:p>
-      <w:pPr>
-        <w:pStyle w:val="Textoindependiente"/>
+        <w:t>Modelo de ciencia de datos para evaluar el riesgo de movilidad laboral por modelos de inteligencia artificial: caso de estudio de ingeniería informática</w:t>
+      </w:r>
+    </w:p>
+    <w:p>
+      <w:pPr>
+        <w:pStyle w:val="BodyText"/>
         <w:tabs>
           <w:tab w:val="left" w:pos="8222"/>
         </w:tabs>
@@ -299,7 +287,7 @@
     </w:p>
     <w:p>
       <w:pPr>
-        <w:pStyle w:val="Textoindependiente"/>
+        <w:pStyle w:val="BodyText"/>
         <w:tabs>
           <w:tab w:val="left" w:pos="8222"/>
         </w:tabs>
@@ -321,7 +309,7 @@
     </w:p>
     <w:p>
       <w:pPr>
-        <w:pStyle w:val="Textoindependiente"/>
+        <w:pStyle w:val="BodyText"/>
         <w:tabs>
           <w:tab w:val="left" w:pos="8222"/>
         </w:tabs>
@@ -336,7 +324,7 @@
     </w:p>
     <w:p>
       <w:pPr>
-        <w:pStyle w:val="Textoindependiente"/>
+        <w:pStyle w:val="BodyText"/>
         <w:tabs>
           <w:tab w:val="left" w:pos="8222"/>
         </w:tabs>
@@ -355,16 +343,23 @@
         </w:rPr>
         <w:t>Carlos Pulido Rosas</w:t>
       </w:r>
-      <w:r>
+    </w:p>
+    <w:p>
+      <w:pPr>
+        <w:pStyle w:val="BodyText"/>
+        <w:tabs>
+          <w:tab w:val="left" w:pos="8222"/>
+        </w:tabs>
+        <w:spacing w:line="276" w:lineRule="auto"/>
+        <w:ind w:right="49"/>
         <w:rPr>
           <w:sz w:val="28"/>
           <w:lang w:val="es-ES"/>
         </w:rPr>
-      </w:r>
-    </w:p>
-    <w:p>
-      <w:pPr>
-        <w:pStyle w:val="Textoindependiente"/>
+      </w:pPr>
+    </w:p>
+    <w:p>
+      <w:pPr>
         <w:tabs>
           <w:tab w:val="left" w:pos="8222"/>
         </w:tabs>
@@ -379,7 +374,6 @@
     </w:p>
     <w:p>
       <w:pPr>
-        <w:pStyle w:val="Textoindependiente"/>
         <w:tabs>
           <w:tab w:val="left" w:pos="8222"/>
         </w:tabs>
@@ -419,6 +413,13 @@
           <w:lang w:val="es-ES"/>
         </w:rPr>
       </w:pPr>
+      <w:r>
+        <w:rPr>
+          <w:sz w:val="28"/>
+          <w:lang w:val="es-ES"/>
+        </w:rPr>
+        <w:t>21 de octubre de 2026</w:t>
+      </w:r>
     </w:p>
     <w:p>
       <w:pPr>
@@ -429,10 +430,48 @@
         <w:ind w:right="49"/>
         <w:jc w:val="center"/>
         <w:rPr>
+          <w:w w:val="99"/>
           <w:sz w:val="28"/>
           <w:lang w:val="es-ES"/>
         </w:rPr>
       </w:pPr>
+      <w:r>
+        <w:rPr>
+          <w:sz w:val="28"/>
+          <w:lang w:val="es-ES"/>
+        </w:rPr>
+        <w:t>Datos</w:t>
+      </w:r>
+      <w:r>
+        <w:rPr>
+          <w:spacing w:val="-6"/>
+          <w:sz w:val="28"/>
+          <w:lang w:val="es-ES"/>
+        </w:rPr>
+        <w:t xml:space="preserve"> </w:t>
+      </w:r>
+      <w:r>
+        <w:rPr>
+          <w:sz w:val="28"/>
+          <w:lang w:val="es-ES"/>
+        </w:rPr>
+        <w:t>de</w:t>
+      </w:r>
+      <w:r>
+        <w:rPr>
+          <w:spacing w:val="-5"/>
+          <w:sz w:val="28"/>
+          <w:lang w:val="es-ES"/>
+        </w:rPr>
+        <w:t xml:space="preserve"> </w:t>
+      </w:r>
+      <w:r>
+        <w:rPr>
+          <w:sz w:val="28"/>
+          <w:lang w:val="es-ES"/>
+        </w:rPr>
+        <w:t>Localización</w:t>
+      </w:r>
     </w:p>
     <w:p>
       <w:pPr>
@@ -452,93 +491,7 @@
           <w:sz w:val="28"/>
           <w:lang w:val="es-ES"/>
         </w:rPr>
-        <w:t>7 de octubre de 2026</w:t>
-      </w:r>
-    </w:p>
-    <w:p>
-      <w:pPr>
-        <w:tabs>
-          <w:tab w:val="left" w:pos="8222"/>
-        </w:tabs>
-        <w:spacing w:line="276" w:lineRule="auto"/>
-        <w:ind w:right="49"/>
-        <w:jc w:val="center"/>
-        <w:rPr>
-          <w:w w:val="99"/>
-          <w:sz w:val="28"/>
-          <w:lang w:val="es-ES"/>
-        </w:rPr>
-      </w:pPr>
-      <w:r>
-        <w:rPr>
-          <w:sz w:val="28"/>
-          <w:lang w:val="es-ES"/>
-        </w:rPr>
-        <w:t>Datos</w:t>
-      </w:r>
-      <w:r>
-        <w:rPr>
-          <w:spacing w:val="-6"/>
-          <w:sz w:val="28"/>
-          <w:lang w:val="es-ES"/>
-        </w:rPr>
-        <w:t xml:space="preserve"> </w:t>
-      </w:r>
-      <w:r>
-        <w:rPr>
-          <w:sz w:val="28"/>
-          <w:lang w:val="es-ES"/>
-        </w:rPr>
-        <w:t>de</w:t>
-      </w:r>
-      <w:r>
-        <w:rPr>
-          <w:spacing w:val="-5"/>
-          <w:sz w:val="28"/>
-          <w:lang w:val="es-ES"/>
-        </w:rPr>
-        <w:t xml:space="preserve"> </w:t>
-      </w:r>
-      <w:r>
-        <w:rPr>
-          <w:sz w:val="28"/>
-          <w:lang w:val="es-ES"/>
-        </w:rPr>
-        <w:t>Localización</w:t>
-      </w:r>
-    </w:p>
-    <w:p>
-      <w:pPr>
-        <w:tabs>
-          <w:tab w:val="left" w:pos="8222"/>
-        </w:tabs>
-        <w:spacing w:line="276" w:lineRule="auto"/>
-        <w:ind w:right="49"/>
-        <w:jc w:val="center"/>
-        <w:rPr>
-          <w:sz w:val="28"/>
-          <w:lang w:val="es-ES"/>
-        </w:rPr>
-      </w:pPr>
-      <w:r>
-        <w:rPr>
-          <w:sz w:val="28"/>
-          <w:lang w:val="es-ES"/>
-        </w:rPr>
         <w:t>carlos.pulido.rosas@gmail.com</w:t>
-      </w:r>
-      <w:r>
-        <w:rPr>
-          <w:spacing w:val="-8"/>
-          <w:sz w:val="28"/>
-          <w:lang w:val="es-ES"/>
-        </w:rPr>
-      </w:r>
-      <w:r>
-        <w:rPr>
-          <w:sz w:val="28"/>
-          <w:lang w:val="es-ES"/>
-        </w:rPr>
       </w:r>
     </w:p>
     <w:p>
@@ -779,7 +732,7 @@
           <w:sz w:val="24"/>
           <w:szCs w:val="24"/>
         </w:rPr>
-        <w:t xml:space="preserve">Título: Modelo de evaluación del riesgo de sustitución laboral mediante herramientas de ciencia de datos: inteligencia artificial cognitiva y robótica en la industria manufacturera de Jalisco.</w:t>
+        <w:t xml:space="preserve">Título: Modelo de ciencia de datos para evaluar el riesgo de movilidad laboral por modelos de inteligencia artificial: caso de estudio de ingeniería informática.</w:t>
       </w:r>
     </w:p>
     <w:p>
@@ -809,7 +762,7 @@
           <w:sz w:val="24"/>
           <w:szCs w:val="24"/>
         </w:rPr>
-        <w:t xml:space="preserve">El título responde a las tres preguntas que pide la guía. Qué se pretende hacer: evaluar el riesgo de que el trabajo sea sustituido por tecnología. Con qué herramientas: un modelo construido con métodos de ciencia de datos que integra índices de exposición ocupacional, modelos estadísticos y escenarios de adopción tecnológica. Dónde se aplicará: en la industria manufacturera del estado de Jalisco.</w:t>
+        <w:t xml:space="preserve">El título responde a las tres preguntas que pide la guía. Qué se pretende hacer: evaluar el riesgo de movilidad laboral que generan los modelos de inteligencia artificial, es decir, la probabilidad de que un trabajador cambie de ocupación, quede desocupado o salga del mercado de trabajo como consecuencia de esa tecnología. Con qué herramientas: un modelo de ciencia de datos que combina medidas de exposición de las tareas a la inteligencia artificial con el seguimiento de las trayectorias laborales de los trabajadores. En dónde: en las ocupaciones de ingeniería informática en México.</w:t>
       </w:r>
     </w:p>
     <w:p>
@@ -856,7 +809,7 @@
           <w:sz w:val="24"/>
           <w:szCs w:val="24"/>
         </w:rPr>
-        <w:t xml:space="preserve">La automatización es el proceso mediante el cual el capital reemplaza al trabajo en tareas que antes realizaban las personas; su efecto inmediato es desplazar trabajo, aunque puede compensarse con la creación de tareas nuevas (Acemoglu y Restrepo, 2019). Durante décadas, este proceso se asoció sobre todo con tareas rutinarias, es decir, con actividades que siguen reglas explícitas y que por ello pueden programarse en una computadora (Autor et al., 2003).</w:t>
+        <w:t xml:space="preserve">Los modelos de lenguaje de gran escala, que se definen formalmente en el marco teórico, son sistemas de inteligencia artificial capaces de comprender y generar texto y código. Su difusión a partir de 2022 reabrió la pregunta de qué ocurre con el empleo cuando una tecnología puede realizar tareas cognitivas que antes solo hacían las personas. Eloundou et al. (2023) estimaron que alrededor del 80 % de los trabajadores de Estados Unidos podría ver afectado al menos el 10 % de sus tareas por estos modelos, y que cerca del 19 % podría ver afectada al menos la mitad. En otras palabras, la exposición no se limita a unas cuantas ocupaciones, pero solo en una de cada cinco alcanza a la mayor parte del trabajo.</w:t>
       </w:r>
     </w:p>
     <w:p>
@@ -871,7 +824,7 @@
           <w:sz w:val="24"/>
           <w:szCs w:val="24"/>
         </w:rPr>
-        <w:t xml:space="preserve">En los últimos años la automatización se extendió en dos direcciones. Por un lado, los modelos de lenguaje de gran escala, que se definen formalmente en el marco teórico, ampliaron la capacidad de las máquinas para realizar tareas cognitivas como redactar, resumir o analizar información. Eloundou et al. (2023) estiman que cerca de 80 % de los trabajadores de Estados Unidos podría tener al menos 10 % de sus tareas afectadas por estos modelos, y que alrededor de 19 % podría ver afectada la mitad o más de sus tareas. Para México, Azuara et al. (2024) estiman que 74 % de los empleos tiene más de 10 % de sus tareas expuestas, y Benítez-Rueda y Parrado (2024) calculan que alrededor de 16 millones de empleos mexicanos están muy expuestos a la inteligencia artificial en un horizonte de un año.</w:t>
+        <w:t xml:space="preserve">Las ocupaciones relacionadas con la informática están entre las más involucradas. En el análisis de millones de conversaciones con el asistente Claude, las ocupaciones de computación y matemáticas concentraron el 37.2 % de todas las consultas, la proporción más alta de cualquier grupo ocupacional, y el 57 % de los usos mostró un patrón de aumento de las capacidades humanas más que de automatización (Handa et al., 2025). Es decir, más de un tercio del uso observado de esta herramienta proviene de tareas propias de la informática, y en la mayoría de los casos el modelo trabaja junto con la persona en lugar de reemplazarla. En la misma línea, Gao y Huang (2026) calcularon un índice relativo de automatización ocupacional para Estados Unidos y encontraron que los puestos cognitivos no rutinarios que dependen de la manipulación de símbolos son los más vulnerables; los científicos de datos encabezan el índice, con un valor cercano a 0.70.</w:t>
       </w:r>
     </w:p>
     <w:p>
@@ -886,7 +839,7 @@
           <w:sz w:val="24"/>
           <w:szCs w:val="24"/>
         </w:rPr>
-        <w:t xml:space="preserve">Por otro lado, la robótica industrial sigue extendiéndose sobre las tareas físicas. México instaló 5,594 robots industriales en 2024 y es el segundo mercado de robots de América, después de Estados Unidos (International Federation of Robotics [IFR], 2025). La evidencia sobre su efecto en el empleo mexicano no es concluyente. Faber (2020) encuentra que los robots instalados en Estados Unidos reducen el empleo en los mercados laborales mexicanos, con mayor efecto en operadores de maquinaria de baja escolaridad de la manufactura, y Artuc et al. (2019) estiman que un robot adicional por cada mil trabajadores en Estados Unidos reduce 6.7 % el crecimiento de las exportaciones por trabajador de México hacia ese país. En sentido contrario, Márquez Stone y Sandoval Cabrera (2024) encuentran una correlación positiva entre la adopción de robots y el empleo y los salarios en la industria automotriz de 14 estados entre 2013 y 2022, y Maloney y Molina (2019) documentan que en los países en desarrollo el empleo de operadores y ensambladores ha crecido, aunque con indicios de polarización en México.</w:t>
+        <w:t xml:space="preserve">Sin embargo, una exposición alta no se ha traducido en pérdidas generales de empleo. Acemoglu et al. (2022) encontraron, con las vacantes publicadas en línea en Estados Unidos desde 2010, que los establecimientos que adoptan inteligencia artificial reducen sus contrataciones en puestos no relacionados con ella y cambian los requisitos de habilidades de las vacantes que mantienen, aunque el efecto todavía es demasiado pequeño para observarse en el empleo agregado. Broady et al. (2026) mostraron que, entre 2019 y 2024, las ocupaciones con mayor aplicabilidad de la inteligencia artificial aumentaron su empleo y sus salarios, por lo que proponen leer la exposición como un indicador de reestructuración de las ocupaciones y no como un pronóstico de pérdida de empleo.</w:t>
       </w:r>
     </w:p>
     <w:p>
@@ -901,7 +854,7 @@
           <w:sz w:val="24"/>
           <w:szCs w:val="24"/>
         </w:rPr>
-        <w:t xml:space="preserve">La industria manufacturera de Jalisco se ubica en el cruce de ambas tendencias. En el cuarto trimestre de 2024 empleaba a 698,147 personas, 17.9 % de los 4.0 millones de ocupados del estado, y la tasa de informalidad laboral estatal era de 46.5 % (Instituto Nacional de Estadística y Geografía [INEGI], 2025). A ello se suma la relocalización de empresas hacia México, conocida como nearshoring: según el Banco de México (2022), 16 % de las empresas con más de 100 trabajadores reportó beneficios de este fenómeno, concentrados en la región norte y en la manufactura integrada a cadenas globales de valor. Sin embargo, el efecto en Jalisco no es lineal: en 2024 el estado recibió 1,100 millones de dólares de inversión extranjera directa, 3 % del total nacional, y pasó del cuarto al noveno lugar entre las entidades (Secretaría de Economía [SE], 2025).</w:t>
+        <w:t xml:space="preserve">Donde sí aparece un cambio es en la entrada al mercado de trabajo. Con registros de nómina de millones de trabajadores de Estados Unidos, Brynjolfsson et al. (2026) encontraron que el empleo de los jóvenes de 22 a 25 años en ocupaciones expuestas a la inteligencia artificial se encuentra 19 % por debajo de donde estaría si hubiera crecido al mismo ritmo que el de sus pares en ocupaciones menos expuestas, sin una brecha comparable entre los trabajadores con más experiencia. Los autores precisan que la diferencia se explica sobre todo por menos contrataciones de jóvenes y no por más despidos, y analizan el desarrollo de software como uno de sus casos de estudio. Este resultado sugiere que el efecto de la tecnología se manifiesta en quién entra, quién sale y hacia dónde se mueven los trabajadores, más que en la desaparición de las ocupaciones.</w:t>
       </w:r>
     </w:p>
     <w:p>
@@ -932,7 +885,7 @@
           <w:sz w:val="24"/>
           <w:szCs w:val="24"/>
         </w:rPr>
-        <w:t xml:space="preserve">Las medidas disponibles no permiten saber qué ocupaciones de la manufactura jalisciense enfrentan qué tipo de riesgo. La estimación más difundida, la de Frey y Osborne (2017), se construyó a partir de 70 ocupaciones etiquetadas de forma subjetiva por un grupo de investigadores y se extrapoló al resto con datos de Estados Unidos, por lo que es estática y depende del juicio experto. Los índices posteriores miden por separado cada tecnología: unos la exposición a la IA cognitiva (Eloundou et al., 2023; Felten et al., 2021, 2023) y otros la exposición a robots (Acemoglu y Restrepo, 2020; Webb, 2020), aun cuando Webb (2020) muestra que ambas tecnologías se dirigen a tareas distintas. Además, la exposición técnica no basta para que la sustitución ocurra, pues automatizar solo resulta conveniente cuando el costo del capital es menor que el del trabajo que reemplaza (Acemoglu y Restrepo, 2018).</w:t>
+        <w:t xml:space="preserve">La mayoría de los estudios sobre inteligencia artificial y empleo miden la exposición de cada ocupación en un momento dado, pero no siguen a los trabajadores. Frank et al. (2025) mostraron, con datos mensuales de desempleo por ocupación de cada estado de Estados Unidos entre 2010 y 2020, que ningún índice de exposición por sí solo predice bien el riesgo de desempleo; solo al combinarlos se explica un 18 % adicional de la variación del riesgo de desempleo entre ocupaciones, estados y periodos, respecto a un modelo que ya considera la escolaridad, las habilidades, la estacionalidad y la región. Dicho de otro modo, saber que una ocupación está expuesta no basta para saber qué les pasará a quienes trabajan en ella.</w:t>
       </w:r>
     </w:p>
     <w:p>
@@ -947,7 +900,37 @@
           <w:sz w:val="24"/>
           <w:szCs w:val="24"/>
         </w:rPr>
-        <w:t xml:space="preserve">En consecuencia, el problema de investigación es la falta de un instrumento que permita evaluar, con datos de México, el riesgo de sustitución laboral que enfrentan las ocupaciones de la industria manufacturera de Jalisco ante dos tecnologías diferentes, la inteligencia artificial cognitiva y la robótica, considerando además si la sustitución es económicamente rentable para las empresas. Sin ese instrumento, las autoridades, las cámaras industriales y los centros de capacitación no cuentan con un diagnóstico para anticipar qué trabajadores necesitarán apoyo ni de qué tipo.</w:t>
+        <w:t xml:space="preserve">Del Rio-Chanona et al. (2021) plantean el problema desde otro ángulo: cuando la automatización afecta a una ocupación, el resultado para sus trabajadores depende de cuántas ocupaciones cercanas existen hacia donde puedan moverse. Con un modelo de red de movilidad ocupacional, encontraron que las ocupaciones ubicadas en zonas de la red con pocas opciones de transición tienen más riesgo de desempleo de largo plazo. Por su parte, Georgieff y Hyee (2022) encontraron, para 23 países de la OCDE, que en las ocupaciones con uso intensivo de computadora una mayor exposición a la inteligencia artificial se asocia con un mayor crecimiento del empleo, y Chen et al. (2022) mostraron, con 701 ocupaciones de Estados Unidos, que las habilidades digitales moderan el efecto negativo del riesgo de desplazamiento sobre los salarios y el empleo.</w:t>
+      </w:r>
+    </w:p>
+    <w:p>
+      <w:pPr>
+        <w:spacing w:before="0" w:after="0" w:line="480" w:lineRule="auto"/>
+        <w:ind w:firstLine="709"/>
+        <w:jc w:val="both"/>
+      </w:pPr>
+      <w:r>
+        <w:rPr>
+          <w:rFonts w:ascii="Times New Roman" w:hAnsi="Times New Roman" w:cs="Times New Roman" w:eastAsia="Times New Roman"/>
+          <w:sz w:val="24"/>
+          <w:szCs w:val="24"/>
+        </w:rPr>
+        <w:t xml:space="preserve">Estos trabajos coinciden en que el riesgo relevante no es solo el de perder el empleo, sino el de verse obligado a cambiar de ocupación, de empleador o de condición laboral, y en que ese riesgo depende de las habilidades del trabajador y de las rutas de transición disponibles. Sin embargo, se basan en datos de Estados Unidos o de países de la OCDE. En México no se ha medido cómo se mueven los trabajadores de las ocupaciones de ingeniería informática desde la llegada de los modelos de lenguaje, ni si esa movilidad es distinta para quienes empiezan su carrera.</w:t>
+      </w:r>
+    </w:p>
+    <w:p>
+      <w:pPr>
+        <w:spacing w:before="0" w:after="0" w:line="480" w:lineRule="auto"/>
+        <w:ind w:firstLine="709"/>
+        <w:jc w:val="both"/>
+      </w:pPr>
+      <w:r>
+        <w:rPr>
+          <w:rFonts w:ascii="Times New Roman" w:hAnsi="Times New Roman" w:cs="Times New Roman" w:eastAsia="Times New Roman"/>
+          <w:sz w:val="24"/>
+          <w:szCs w:val="24"/>
+        </w:rPr>
+        <w:t xml:space="preserve">En consecuencia, el problema de investigación es la falta de un modelo que permita evaluar, con datos de México, el riesgo de movilidad laboral que enfrentan los trabajadores de las ocupaciones de ingeniería informática ante los modelos de inteligencia artificial, es decir, con qué probabilidad cambian de ocupación, quedan desocupados o salen del mercado de trabajo, hacia qué ocupaciones se mueven y qué características del trabajador aumentan o reducen ese riesgo.</w:t>
       </w:r>
     </w:p>
     <w:p>
@@ -978,7 +961,7 @@
           <w:sz w:val="24"/>
           <w:szCs w:val="24"/>
         </w:rPr>
-        <w:t xml:space="preserve">Pregunta general: ¿cómo se distribuye el riesgo de sustitución laboral por inteligencia artificial cognitiva y por robótica entre las ocupaciones y ramas de la industria manufacturera de Jalisco, y en qué medida la rentabilidad de automatizar determina que ese riesgo se materialice?</w:t>
+        <w:t xml:space="preserve">Pregunta general: ¿cómo se relaciona la exposición a los modelos de inteligencia artificial con la movilidad laboral de los trabajadores de las ocupaciones de ingeniería informática en México?</w:t>
       </w:r>
     </w:p>
     <w:p>
@@ -993,7 +976,7 @@
           <w:sz w:val="24"/>
           <w:szCs w:val="24"/>
         </w:rPr>
-        <w:t xml:space="preserve">1. ¿Qué ocupaciones manufactureras de Jalisco están más expuestas a la IA cognitiva y cuáles a la robótica?</w:t>
+        <w:t xml:space="preserve">1. ¿Qué tareas de las ocupaciones de ingeniería informática están más expuestas a los modelos de inteligencia artificial?</w:t>
       </w:r>
     </w:p>
     <w:p>
@@ -1008,7 +991,7 @@
           <w:sz w:val="24"/>
           <w:szCs w:val="24"/>
         </w:rPr>
-        <w:t xml:space="preserve">2. ¿Las ramas manufactureras donde automatizar es más rentable sustituyen más trabajo por capital?</w:t>
+        <w:t xml:space="preserve">2. ¿Con qué frecuencia cambian de ocupación, quedan desocupados o salen del mercado de trabajo estos trabajadores, hacia qué ocupaciones se mueven y cómo cambió esa movilidad después de 2022?</w:t>
       </w:r>
     </w:p>
     <w:p>
@@ -1023,7 +1006,7 @@
           <w:sz w:val="24"/>
           <w:szCs w:val="24"/>
         </w:rPr>
-        <w:t xml:space="preserve">3. ¿Qué presión de sustitución podría enfrentar el sector hacia 2030 bajo distintos escenarios de adopción tecnológica?</w:t>
+        <w:t xml:space="preserve">3. ¿Qué características del trabajador, como la edad, la experiencia, la escolaridad y el tipo de ocupación, se asocian con un mayor riesgo de movilidad?</w:t>
       </w:r>
     </w:p>
     <w:p>
@@ -1054,7 +1037,7 @@
           <w:sz w:val="24"/>
           <w:szCs w:val="24"/>
         </w:rPr>
-        <w:t xml:space="preserve">Relevancia social. La manufactura emplea a casi una de cada cinco personas ocupadas en Jalisco y casi la mitad de los ocupados del estado trabaja en la informalidad (INEGI, 2025), es decir, en condiciones de vulnerabilidad laboral y, en muchos casos, sin seguridad social. Si la automatización desplaza trabajadores en este sector, una parte importante de ellos carecería de protección. La evidencia para México apunta a que los más afectados por la robótica son los operadores de maquinaria con baja escolaridad (Faber, 2020), un grupo con pocas opciones de reconversión laboral.</w:t>
+        <w:t xml:space="preserve">Relevancia social. Si el efecto de la inteligencia artificial se concentra en la entrada al mercado de trabajo, como sugieren Brynjolfsson et al. (2026), quienes más lo resentirían serían los egresados recientes de carreras de informática, que buscan su primer empleo en las ocupaciones más expuestas. Conocer ese riesgo permite anticiparlo en la formación universitaria y en las políticas de empleo.</w:t>
       </w:r>
     </w:p>
     <w:p>
@@ -1069,7 +1052,7 @@
           <w:sz w:val="24"/>
           <w:szCs w:val="24"/>
         </w:rPr>
-        <w:t xml:space="preserve">Relevancia práctica. Como los estudios disponibles llegan a conclusiones opuestas para México (Artuc et al., 2019; Faber, 2020; Márquez Stone y Sandoval Cabrera, 2024), hace falta un diagnóstico local que distinga ocupaciones, ramas y tecnologías. Ese diagnóstico permitiría a las instancias de desarrollo económico, trabajo y capacitación del estado orientar sus programas hacia las ocupaciones con mayor riesgo antes de que el desplazamiento ocurra. La literatura sobre la adopción de tecnologías de propósito general sugiere que sus efectos tardan en aparecer en las estadísticas (Brynjolfsson et al., 2021), lo que abre un margen de tiempo para actuar.</w:t>
+        <w:t xml:space="preserve">Relevancia práctica. Los resultados permitirán identificar qué ocupaciones de destino reciben a los trabajadores que salen de la ingeniería informática y qué habilidades facilitan esas transiciones. Paolillo et al. (2022) mostraron que es posible identificar, para cada ocupación, alternativas que reducen el riesgo de automatización con un esfuerzo de reentrenamiento moderado; un análisis similar con datos mexicanos serviría a universidades, empleadores y trabajadores para orientar la capacitación.</w:t>
       </w:r>
     </w:p>
     <w:p>
@@ -1084,7 +1067,7 @@
           <w:sz w:val="24"/>
           <w:szCs w:val="24"/>
         </w:rPr>
-        <w:t xml:space="preserve">Aportación a la ciencia. El proyecto propone construir dos índices de exposición ocupacional con la misma metodología, uno para la IA cognitiva y otro para la robótica, y combinarlos con una medida de rentabilidad de la automatización. El índice cognitivo partirá del índice de exposición a la IA de Felten et al. (2021), al que se agregará una dimensión temporal a partir de la evolución del desempeño de los modelos de lenguaje, y ambos índices se validarán contra medidas publicadas, como la exposición a robots de Webb (2020) y el uso observado de la IA de Handa et al. (2025).</w:t>
+        <w:t xml:space="preserve">Aportación a la ciencia. El proyecto propone medir la movilidad laboral asociada a la inteligencia artificial siguiendo a los mismos trabajadores en el tiempo, en lugar de comparar fotografías de la exposición en distintos años. Frank et al. (2025) muestran que la exposición por sí sola es un mal predictor de lo que ocurre con el empleo, por lo que observar las transiciones reales de los trabajadores aporta una medida más directa del riesgo.</w:t>
       </w:r>
     </w:p>
     <w:p>
@@ -1099,7 +1082,7 @@
           <w:sz w:val="24"/>
           <w:szCs w:val="24"/>
         </w:rPr>
-        <w:t xml:space="preserve">Viabilidad. Todas las fuentes de información son públicas y gratuitas: la ENOE, los Censos Económicos y la clasificación de ocupaciones del INEGI, la base O*NET, las estadísticas de la Federación Internacional de Robótica y las bases de datos que acompañan a los estudios citados.</w:t>
+        <w:t xml:space="preserve">Viabilidad. Las fuentes de información son públicas y gratuitas. La Encuesta Nacional de Ocupación y Empleo (ENOE) del INEGI tiene un diseño de panel rotatorio: la muestra se divide en cinco paneles y cada vivienda permanece en la encuesta durante cinco trimestres, de modo que en cada trimestre se mantiene el 80 % de la muestra (INEGI, 2025). Esto significa que una misma persona se entrevista hasta cinco veces seguidas, lo que permite observar si cambió de ocupación o de condición laboral entre un trimestre y otro. La ocupación se registra con el Sistema Nacional de Clasificación de Ocupaciones (INEGI, 2019), y las tareas de cada ocupación pueden obtenerse de la base O*NET (National Center for O*NET Development, 2024).</w:t>
       </w:r>
     </w:p>
     <w:p>
@@ -1146,7 +1129,7 @@
           <w:sz w:val="24"/>
           <w:szCs w:val="24"/>
         </w:rPr>
-        <w:t xml:space="preserve">Evaluar el riesgo de sustitución laboral en la industria manufacturera de Jalisco frente a la inteligencia artificial cognitiva y la robótica, mediante un modelo de ciencia de datos que integre la exposición ocupacional, la rentabilidad de automatizar y escenarios de adopción tecnológica para el periodo 2025-2030.</w:t>
+        <w:t xml:space="preserve">Evaluar el riesgo de movilidad laboral de los trabajadores de las ocupaciones de ingeniería informática en México frente a los modelos de inteligencia artificial, mediante un modelo de ciencia de datos que relacione la exposición de sus tareas con las transiciones laborales observadas.</w:t>
       </w:r>
     </w:p>
     <w:p>
@@ -1177,7 +1160,7 @@
           <w:sz w:val="24"/>
           <w:szCs w:val="24"/>
         </w:rPr>
-        <w:t xml:space="preserve">1. Identificar y caracterizar las ocupaciones y ramas de la industria manufacturera de Jalisco, así como su composición de empleo, a partir de la ENOE, los Censos Económicos y los registros del IMSS.</w:t>
+        <w:t xml:space="preserve">1. Delimitar las ocupaciones de ingeniería informática en el Sistema Nacional de Clasificación de Ocupaciones y caracterizar a sus trabajadores con la ENOE.</w:t>
       </w:r>
     </w:p>
     <w:p>
@@ -1192,7 +1175,7 @@
           <w:sz w:val="24"/>
           <w:szCs w:val="24"/>
         </w:rPr>
-        <w:t xml:space="preserve">2. Construir y validar dos índices de exposición ocupacional, uno cognitivo y uno físico, y aplicarlos a la estructura ocupacional de la manufactura.</w:t>
+        <w:t xml:space="preserve">2. Medir la exposición de las tareas de esas ocupaciones a los modelos de inteligencia artificial a partir de O*NET y de índices de exposición publicados.</w:t>
       </w:r>
     </w:p>
     <w:p>
@@ -1207,7 +1190,7 @@
           <w:sz w:val="24"/>
           <w:szCs w:val="24"/>
         </w:rPr>
-        <w:t xml:space="preserve">3. Desarrollar modelos que relacionen la exposición con el uso observado de la IA y con la sustitución de trabajo por capital en función de la rentabilidad de automatizar.</w:t>
+        <w:t xml:space="preserve">3. Construir las trayectorias trimestrales de los trabajadores con el panel de la ENOE y estimar matrices de transición entre ocupaciones y condiciones laborales, antes y después de 2022.</w:t>
       </w:r>
     </w:p>
     <w:p>
@@ -1222,7 +1205,7 @@
           <w:sz w:val="24"/>
           <w:szCs w:val="24"/>
         </w:rPr>
-        <w:t xml:space="preserve">4. Evaluar y comparar el desempeño de los modelos y la robustez de sus resultados mediante validación externa, validación cruzada e inferencia por permutación.</w:t>
+        <w:t xml:space="preserve">4. Estimar modelos que expliquen el riesgo de movilidad en función de la exposición y de las características del trabajador, y evaluar su desempeño y robustez.</w:t>
       </w:r>
     </w:p>
     <w:p>
@@ -1237,7 +1220,7 @@
           <w:sz w:val="24"/>
           <w:szCs w:val="24"/>
         </w:rPr>
-        <w:t xml:space="preserve">5. Proyectar la presión de sustitución hacia 2030 en tres escenarios de adopción y presentar los resultados en un tablero de visualización por rama, ocupación y municipio.</w:t>
+        <w:t xml:space="preserve">5. Identificar las ocupaciones de destino de quienes salen de la ingeniería informática y presentar los resultados en un tablero de visualización.</w:t>
       </w:r>
     </w:p>
     <w:p>
@@ -1268,7 +1251,7 @@
           <w:sz w:val="24"/>
           <w:szCs w:val="24"/>
         </w:rPr>
-        <w:t xml:space="preserve">H1. Dentro de la industria manufacturera de Jalisco, la exposición a la IA cognitiva y la exposición a la robótica recaen en ocupaciones distintas: los operadores y trabajadores de producción concentran la exposición física, mientras que las ocupaciones administrativas, técnicas y de supervisión concentran la exposición cognitiva. Esta hipótesis se deriva de la evidencia de Webb (2020) sobre la orientación distinta de ambas tecnologías y se contrastará con análisis factorial exploratorio y confirmatorio sobre los índices de exposición.</w:t>
+        <w:t xml:space="preserve">H1. Después de la difusión de los modelos de lenguaje en 2022, los trabajadores jóvenes de las ocupaciones de ingeniería informática presentan un riesgo de movilidad mayor que los trabajadores con más experiencia. La hipótesis se sustenta en la caída relativa del empleo de los jóvenes en ocupaciones expuestas, explicada por menos contrataciones (Brynjolfsson et al., 2026), y en la reducción de contrataciones en puestos no relacionados con la inteligencia artificial dentro de los establecimientos que la adoptan (Acemoglu et al., 2022).</w:t>
       </w:r>
     </w:p>
     <w:p>
@@ -1283,7 +1266,7 @@
           <w:sz w:val="24"/>
           <w:szCs w:val="24"/>
         </w:rPr>
-        <w:t xml:space="preserve">H2. Las ramas manufactureras con mayor rentabilidad de automatizar presentan mayor profundización de capital y menor participación del trabajo en el valor agregado. Esta hipótesis se deriva de la condición de rentabilidad de Acemoglu y Restrepo (2018) y se contrastará con un panel de los Censos Económicos con efectos fijos e inferencia por permutación.</w:t>
+        <w:t xml:space="preserve">H2. Quienes salen de las ocupaciones de ingeniería informática se mueven principalmente hacia ocupaciones cercanas en habilidades, y no hacia la desocupación, porque sus habilidades digitales son transferibles. La hipótesis se basa en el papel de la red de movilidad ocupacional en las opciones de transición (del Rio-Chanona et al., 2021) y en la protección que las habilidades digitales ofrecen frente al riesgo de desplazamiento (Chen et al., 2022; Georgieff y Hyee, 2022).</w:t>
       </w:r>
     </w:p>
     <w:p>
@@ -1314,7 +1297,7 @@
           <w:sz w:val="24"/>
           <w:szCs w:val="24"/>
         </w:rPr>
-        <w:t xml:space="preserve">Los antecedentes se presentan en orden cronológico. Autor et al. (2003) establecieron el enfoque de tareas: la tecnología sustituye tareas y no ocupaciones completas, y las tareas rutinarias son las más fáciles de automatizar. Frey y Osborne (2017) estimaron, con un clasificador de procesos gaussianos aplicado a 702 ocupaciones, que 47 % del empleo de Estados Unidos enfrentaba un riesgo alto de automatización. Acemoglu y Restrepo (2018) formalizaron el proceso como una carrera entre el desplazamiento del trabajo y la creación de tareas nuevas, e incorporaron la condición de que automatizar solo ocurre cuando es más barato que pagar salarios.</w:t>
+        <w:t xml:space="preserve">Los antecedentes se presentan en orden cronológico. Autor et al. (2003) establecieron el enfoque de tareas, según el cual la tecnología sustituye tareas y no ocupaciones completas. Kambourov y Manovskii (2008) documentaron el aumento de la movilidad ocupacional en Estados Unidos entre 1968 y 1997 y destacaron su importancia porque buena parte del capital humano de los trabajadores es específico de su ocupación, de modo que cambiar de ocupación implica perder parte de ese capital. Frey y Osborne (2017) estimaron la probabilidad de automatización de 702 ocupaciones, y Acemoglu y Restrepo (2019) formalizaron la idea de que la automatización desplaza trabajo de unas tareas mientras la creación de tareas nuevas lo reinstala en otras.</w:t>
       </w:r>
     </w:p>
     <w:p>
@@ -1329,7 +1312,7 @@
           <w:sz w:val="24"/>
           <w:szCs w:val="24"/>
         </w:rPr>
-        <w:t xml:space="preserve">Sobre la robótica, Graetz y Michaels (2018) encontraron, con datos de 17 países entre 1993 y 2007, que los robots industriales elevaron la productividad laboral, el valor agregado y los salarios, sin un efecto significativo en las horas totales trabajadas. Acemoglu y Restrepo (2019) atribuyeron el menor crecimiento del empleo en Estados Unidos durante tres décadas a un desplazamiento más rápido, sobre todo en la manufactura, y a una creación de tareas nuevas más débil. Acemoglu y Restrepo (2020) estimaron que cada robot adicional por cada mil trabajadores redujo la razón empleo-población entre 0.18 y 0.34 puntos porcentuales en las zonas laborales de ese país.</w:t>
+        <w:t xml:space="preserve">Sobre la movilidad, Meng et al. (2019) propusieron una red neuronal jerárquica con mecanismos de atención que aprende de las trayectorias laborales para predecir el siguiente empleador de una persona y cuánto tiempo permanecerá en el nuevo puesto. Del Rio-Chanona et al. (2021) construyeron una red empírica de movilidad ocupacional y simularon cómo se mueven los trabajadores ante distintos escenarios de automatización. Paolillo et al. (2022) calcularon el riesgo de automatización de casi 1,000 ocupaciones y propusieron un método para encontrar, para cada una, alternativas que reduzcan ese riesgo con el menor esfuerzo de reentrenamiento.</w:t>
       </w:r>
     </w:p>
     <w:p>
@@ -1344,7 +1327,39 @@
           <w:sz w:val="24"/>
           <w:szCs w:val="24"/>
         </w:rPr>
-        <w:t xml:space="preserve">Para México y los países en desarrollo, Artuc et al. (2019) encontraron que la automatización en Estados Unidos reduce el crecimiento de las exportaciones mexicanas y el empleo manufacturero en los municipios con ocupaciones más automatizables. Maloney y Molina (2019) no hallaron, en cambio, desplazamiento en los países en desarrollo, donde el empleo de operadores y ensambladores aumentó, aunque con indicios de polarización en México y Brasil. Faber (2020) mostró que los robots de Estados Unidos reducen el empleo en los mercados laborales mexicanos, sobre todo el de operadores de maquinaria de baja escolaridad, y Webb (2020) documentó, con el texto de las patentes, que a diferencia del software y los robots la IA se dirige a tareas de alta calificación.</w:t>
+        <w:t xml:space="preserve">Con la llegada de los modelos de lenguaje, Eloundou et al. (2023) midieron la exposición de las tareas a estos modelos, y Acemoglu et al. (2022) documentaron cambios en las contrataciones y en los requisitos de las vacantes de los establecimientos que adoptan inteligencia artificial. Georgieff y Hyee (2022) y Chen et al. (2022) mostraron que el uso de computadora y las habilidades digitales cambian el signo o moderan el efecto de la exposición. Dahlin (2024) encontró, con una encuesta en Estados Unidos, que los trabajadores de cuello blanco y con experiencia técnica son quienes más reportan haber sido desplazados por la inteligencia artificial. Más recientemente, Frank et al. (2025) relacionaron la exposición con el riesgo de desempleo, Handa et al. (2025) midieron el uso real de un modelo de lenguaje por tarea, Broady et al. (2026) compararon la exposición con la evolución del empleo entre 2019 y 2024, Gao y Huang (2026) separaron la factibilidad técnica del riesgo comercial de automatizar cada actividad, y Brynjolfsson et al. (2026) documentaron la caída relativa del empleo de los trabajadores jóvenes en ocupaciones expuestas.</w:t>
+      </w:r>
+    </w:p>
+    <w:p>
+      <w:pPr>
+        <w:keepNext/>
+        <w:spacing w:before="240" w:after="120" w:line="480" w:lineRule="auto"/>
+        <w:jc w:val="center"/>
+      </w:pPr>
+      <w:r>
+        <w:rPr>
+          <w:rFonts w:ascii="Times New Roman" w:hAnsi="Times New Roman" w:cs="Times New Roman" w:eastAsia="Times New Roman"/>
+          <w:b/>
+          <w:sz w:val="28"/>
+          <w:szCs w:val="28"/>
+        </w:rPr>
+        <w:t xml:space="preserve">VII. MARCO TEÓRICO</w:t>
+      </w:r>
+    </w:p>
+    <w:p>
+      <w:pPr>
+        <w:keepNext/>
+        <w:spacing w:before="240" w:after="0" w:line="480" w:lineRule="auto"/>
+        <w:jc w:val="left"/>
+      </w:pPr>
+      <w:r>
+        <w:rPr>
+          <w:rFonts w:ascii="Times New Roman" w:hAnsi="Times New Roman" w:cs="Times New Roman" w:eastAsia="Times New Roman"/>
+          <w:b/>
+          <w:sz w:val="24"/>
+          <w:szCs w:val="24"/>
+        </w:rPr>
+        <w:t xml:space="preserve">7.1. Conceptos y definiciones</w:t>
       </w:r>
     </w:p>
     <w:p>
@@ -1359,7 +1374,129 @@
           <w:sz w:val="24"/>
           <w:szCs w:val="24"/>
         </w:rPr>
-        <w:t xml:space="preserve">La llegada de los modelos de lenguaje abrió una nueva línea. Brynjolfsson et al. (2021) explicaron por qué los efectos de las tecnologías de propósito general tardan en aparecer en las estadísticas. Eloundou et al. (2023) midieron la exposición de las ocupaciones a estos modelos, Felten et al. (2023) adaptaron su índice de exposición a la IA a los modelos de lenguaje y Gmyrek et al. (2023) concluyeron para la Organización Internacional del Trabajo que el efecto dominante será complementar más que automatizar. En América Latina, Azuara et al. (2024) y Benítez-Rueda y Parrado (2024) estimaron la exposición del empleo mexicano. Márquez Stone y Sandoval Cabrera (2024) analizaron la adopción de robots en la industria automotriz de 14 estados del país, y Handa et al. (2025) midieron por primera vez el uso real de la IA por ocupación a partir de millones de conversaciones con un asistente.</w:t>
+        <w:t xml:space="preserve">Movilidad laboral. Se refiere a los cambios en la situación laboral de un trabajador entre dos momentos. En este protocolo incluye tres tipos de transición: el cambio de ocupación, que Kambourov y Manovskii (2008) miden como el paso de un trabajador de una ocupación a otra entre dos periodos; el paso del empleo a la desocupación; y la salida de la fuerza de trabajo. El riesgo de movilidad laboral es la probabilidad de que ocurra alguna de esas transiciones en un periodo determinado.</w:t>
+      </w:r>
+    </w:p>
+    <w:p>
+      <w:pPr>
+        <w:spacing w:before="0" w:after="0" w:line="480" w:lineRule="auto"/>
+        <w:ind w:firstLine="709"/>
+        <w:jc w:val="both"/>
+      </w:pPr>
+      <w:r>
+        <w:rPr>
+          <w:rFonts w:ascii="Times New Roman" w:hAnsi="Times New Roman" w:cs="Times New Roman" w:eastAsia="Times New Roman"/>
+          <w:sz w:val="24"/>
+          <w:szCs w:val="24"/>
+        </w:rPr>
+        <w:t xml:space="preserve">Desplazamiento y reinstalación. La automatización permite que el capital realice tareas que antes hacían las personas, lo que produce un efecto de desplazamiento del trabajo; la creación de tareas nuevas genera, en sentido contrario, un efecto de reinstalación (Acemoglu y Restrepo, 2019). La movilidad laboral es la forma en que estos dos efectos se observan en los trabajadores: unos dejan las tareas que se automatizan y otros se mueven hacia las tareas nuevas.</w:t>
+      </w:r>
+    </w:p>
+    <w:p>
+      <w:pPr>
+        <w:spacing w:before="0" w:after="0" w:line="480" w:lineRule="auto"/>
+        <w:ind w:firstLine="709"/>
+        <w:jc w:val="both"/>
+      </w:pPr>
+      <w:r>
+        <w:rPr>
+          <w:rFonts w:ascii="Times New Roman" w:hAnsi="Times New Roman" w:cs="Times New Roman" w:eastAsia="Times New Roman"/>
+          <w:sz w:val="24"/>
+          <w:szCs w:val="24"/>
+        </w:rPr>
+        <w:t xml:space="preserve">Modelos de lenguaje de gran escala. Se trata de modelos de lenguaje basados en la arquitectura Transformer que contienen cientos de miles de millones de parámetros o más, se entrenan con grandes volúmenes de texto y muestran una fuerte capacidad para comprender el lenguaje natural y resolver tareas complejas mediante la generación de texto; ejemplos de ellos son GPT-3, PaLM y LLaMA (Zhao et al., 2023). La arquitectura Transformer es una red neuronal que se apoya únicamente en mecanismos de atención (Vaswani et al., 2017).</w:t>
+      </w:r>
+    </w:p>
+    <w:p>
+      <w:pPr>
+        <w:spacing w:before="0" w:after="0" w:line="480" w:lineRule="auto"/>
+        <w:ind w:firstLine="709"/>
+        <w:jc w:val="both"/>
+      </w:pPr>
+      <w:r>
+        <w:rPr>
+          <w:rFonts w:ascii="Times New Roman" w:hAnsi="Times New Roman" w:cs="Times New Roman" w:eastAsia="Times New Roman"/>
+          <w:sz w:val="24"/>
+          <w:szCs w:val="24"/>
+        </w:rPr>
+        <w:t xml:space="preserve">Ocupaciones de ingeniería informática. En el Sistema Nacional de Clasificación de Ocupaciones 2019 corresponden al subgrupo 227, Investigadores y profesionistas en sistemas computacionales, que comprende a los desarrolladores y analistas de software y multimedia (2271) y a los administradores de bases de datos y redes de computadora (2272) (INEGI, 2019). Como posibles ocupaciones de destino cercanas se considerarán, entre otras, los técnicos en la instalación y reparación de redes, equipos y sistemas computacionales (2651) y los directores y coordinadores de informática (1321 y 1621).</w:t>
+      </w:r>
+    </w:p>
+    <w:p>
+      <w:pPr>
+        <w:spacing w:before="0" w:after="0" w:line="480" w:lineRule="auto"/>
+        <w:ind w:firstLine="709"/>
+        <w:jc w:val="both"/>
+      </w:pPr>
+      <w:r>
+        <w:rPr>
+          <w:rFonts w:ascii="Times New Roman" w:hAnsi="Times New Roman" w:cs="Times New Roman" w:eastAsia="Times New Roman"/>
+          <w:sz w:val="24"/>
+          <w:szCs w:val="24"/>
+        </w:rPr>
+        <w:t xml:space="preserve">Exposición a la inteligencia artificial. Es el grado en que las tareas de una ocupación pueden ser realizadas o asistidas por un sistema de inteligencia artificial. Eloundou et al. (2023) consideran que una tarea está expuesta cuando usar un modelo de lenguaje puede reducir al menos a la mitad el tiempo necesario para completarla con la misma calidad. La exposición no implica sustitución: puede traducirse en automatización o en aumento de las capacidades del trabajador (Handa et al., 2025).</w:t>
+      </w:r>
+    </w:p>
+    <w:p>
+      <w:pPr>
+        <w:keepNext/>
+        <w:spacing w:before="240" w:after="0" w:line="480" w:lineRule="auto"/>
+        <w:jc w:val="left"/>
+      </w:pPr>
+      <w:r>
+        <w:rPr>
+          <w:rFonts w:ascii="Times New Roman" w:hAnsi="Times New Roman" w:cs="Times New Roman" w:eastAsia="Times New Roman"/>
+          <w:b/>
+          <w:sz w:val="24"/>
+          <w:szCs w:val="24"/>
+        </w:rPr>
+        <w:t xml:space="preserve">7.2. Teoría de tareas y movilidad</w:t>
+      </w:r>
+    </w:p>
+    <w:p>
+      <w:pPr>
+        <w:spacing w:before="0" w:after="0" w:line="480" w:lineRule="auto"/>
+        <w:ind w:firstLine="709"/>
+        <w:jc w:val="both"/>
+      </w:pPr>
+      <w:r>
+        <w:rPr>
+          <w:rFonts w:ascii="Times New Roman" w:hAnsi="Times New Roman" w:cs="Times New Roman" w:eastAsia="Times New Roman"/>
+          <w:sz w:val="24"/>
+          <w:szCs w:val="24"/>
+        </w:rPr>
+        <w:t xml:space="preserve">El fundamento teórico es el enfoque de tareas (Autor et al., 2003), según el cual la tecnología no sustituye ocupaciones completas, sino tareas específicas, y la teoría del desplazamiento y la reinstalación de Acemoglu y Restrepo (2019). Si la inteligencia artificial absorbe algunas tareas de una ocupación, la demanda de trabajo se reorganiza: los trabajadores cuyas tareas se automatizan pueden cambiar de funciones dentro de la ocupación, moverse a otra ocupación o quedar sin empleo. Qué tan costoso es ese ajuste depende de cuánto capital humano específico se pierde al cambiar de ocupación (Kambourov y Manovskii, 2008) y de cuántas ocupaciones cercanas existen para recibir al trabajador (del Rio-Chanona et al., 2021).</w:t>
+      </w:r>
+    </w:p>
+    <w:p>
+      <w:pPr>
+        <w:keepNext/>
+        <w:spacing w:before="240" w:after="0" w:line="480" w:lineRule="auto"/>
+        <w:jc w:val="left"/>
+      </w:pPr>
+      <w:r>
+        <w:rPr>
+          <w:rFonts w:ascii="Times New Roman" w:hAnsi="Times New Roman" w:cs="Times New Roman" w:eastAsia="Times New Roman"/>
+          <w:b/>
+          <w:sz w:val="24"/>
+          <w:szCs w:val="24"/>
+        </w:rPr>
+        <w:t xml:space="preserve">7.3. Elección del método</w:t>
+      </w:r>
+    </w:p>
+    <w:p>
+      <w:pPr>
+        <w:spacing w:before="0" w:after="0" w:line="480" w:lineRule="auto"/>
+        <w:ind w:firstLine="709"/>
+        <w:jc w:val="both"/>
+      </w:pPr>
+      <w:r>
+        <w:rPr>
+          <w:rFonts w:ascii="Times New Roman" w:hAnsi="Times New Roman" w:cs="Times New Roman" w:eastAsia="Times New Roman"/>
+          <w:sz w:val="24"/>
+          <w:szCs w:val="24"/>
+        </w:rPr>
+        <w:t xml:space="preserve">El enfoque es cuantitativo porque el riesgo se expresa como una probabilidad comparable entre grupos de trabajadores y periodos. El panel rotatorio de la ENOE permite construir trayectorias individuales de hasta cinco trimestres, lo que hace posible estimar matrices de transición, en las que cada celda indica la proporción de trabajadores que pasa de una situación laboral a otra entre dos trimestres. Para explicar esas transiciones se usarán modelos estadísticos con inferencia formal y modelos de aprendizaje automático, en línea con los trabajos que modelan la movilidad con redes ocupacionales (del Rio-Chanona et al., 2021) y con redes neuronales (Meng et al., 2019).</w:t>
       </w:r>
     </w:p>
     <w:p>
@@ -1375,23 +1512,7 @@
           <w:sz w:val="28"/>
           <w:szCs w:val="28"/>
         </w:rPr>
-        <w:t xml:space="preserve">VII. MARCO TEÓRICO</w:t>
-      </w:r>
-    </w:p>
-    <w:p>
-      <w:pPr>
-        <w:keepNext/>
-        <w:spacing w:before="240" w:after="0" w:line="480" w:lineRule="auto"/>
-        <w:jc w:val="left"/>
-      </w:pPr>
-      <w:r>
-        <w:rPr>
-          <w:rFonts w:ascii="Times New Roman" w:hAnsi="Times New Roman" w:cs="Times New Roman" w:eastAsia="Times New Roman"/>
-          <w:b/>
-          <w:sz w:val="24"/>
-          <w:szCs w:val="24"/>
-        </w:rPr>
-        <w:t xml:space="preserve">7.1. Conceptos y definiciones</w:t>
+        <w:t xml:space="preserve">VIII. METODOLOGÍA</w:t>
       </w:r>
     </w:p>
     <w:p>
@@ -1406,7 +1527,7 @@
           <w:sz w:val="24"/>
           <w:szCs w:val="24"/>
         </w:rPr>
-        <w:t xml:space="preserve">Automatización y sustitución laboral. La automatización permite que el capital reemplace al trabajo en tareas que antes realizaban las personas, lo que produce un efecto de desplazamiento; la creación de tareas nuevas genera, en sentido contrario, un efecto de reinstalación del trabajo (Acemoglu y Restrepo, 2019). En este protocolo, el riesgo de sustitución laboral se entiende como la posibilidad de que ocurra ese desplazamiento en las tareas de una ocupación.</w:t>
+        <w:t xml:space="preserve">Tipo de estudio. Investigación cuantitativa, no experimental y longitudinal, basada en el seguimiento de trabajadores en el panel de la ENOE.</w:t>
       </w:r>
     </w:p>
     <w:p>
@@ -1421,7 +1542,7 @@
           <w:sz w:val="24"/>
           <w:szCs w:val="24"/>
         </w:rPr>
-        <w:t xml:space="preserve">Modelos de lenguaje de gran escala. Se trata de modelos de lenguaje basados en la arquitectura Transformer que contienen cientos de miles de millones de parámetros o más, se entrenan con grandes volúmenes de texto y muestran una fuerte capacidad para comprender el lenguaje natural y resolver tareas complejas mediante la generación de texto; ejemplos de ellos son GPT-3, PaLM y LLaMA (Zhao et al., 2023). La arquitectura Transformer, en la que se basan, es una red neuronal que se apoya únicamente en mecanismos de atención (Vaswani et al., 2017).</w:t>
+        <w:t xml:space="preserve">Población y unidades de análisis. Personas ocupadas en las ocupaciones de ingeniería informática (subgrupo 227 del Sistema Nacional de Clasificación de Ocupaciones 2019) en México. Jalisco se analizará como caso estatal en la medida en que el tamaño de la muestra lo permita. Las unidades de análisis son el trabajador, observado trimestre a trimestre, y la ocupación.</w:t>
       </w:r>
     </w:p>
     <w:p>
@@ -1436,7 +1557,7 @@
           <w:sz w:val="24"/>
           <w:szCs w:val="24"/>
         </w:rPr>
-        <w:t xml:space="preserve">Robot industrial. La Federación Internacional de Robótica define un robot industrial como una máquina controlada automáticamente, reprogramable y multipropósito (IFR, 2014, como se citó en Acemoglu y Restrepo, 2020).</w:t>
+        <w:t xml:space="preserve">Fuentes de datos. La ENOE (INEGI, 2025) para las trayectorias laborales y las características de los trabajadores; el Sistema Nacional de Clasificación de Ocupaciones (INEGI, 2019) para delimitar las ocupaciones; la base O*NET (National Center for O*NET Development, 2024) para las tareas de cada ocupación; e índices publicados de exposición a la inteligencia artificial (Eloundou et al., 2023; Felten et al., 2023) y de uso observado (Handa et al., 2025).</w:t>
       </w:r>
     </w:p>
     <w:p>
@@ -1451,7 +1572,82 @@
           <w:sz w:val="24"/>
           <w:szCs w:val="24"/>
         </w:rPr>
-        <w:t xml:space="preserve">Nearshoring. Es la relocalización de actividades productivas hacia países más cercanos al lugar de consumo, a diferencia del reshoring, que consiste en regresar la producción al país de origen (Banco de México, 2022). En la literatura de gestión de operaciones se le define como la reubicación de la producción hacia la región de origen de la empresa (Merino et al., 2021). Para México, la cercanía geográfica con Estados Unidos y el T-MEC lo convierten en un candidato natural para la relocalización de empresas que abastecen al mercado estadounidense (Banco de México, 2022).</w:t>
+        <w:t xml:space="preserve">Procedimiento. El trabajo se organiza en cinco pasos alineados con los objetivos específicos:</w:t>
+      </w:r>
+    </w:p>
+    <w:p>
+      <w:pPr>
+        <w:spacing w:before="0" w:after="0" w:line="480" w:lineRule="auto"/>
+        <w:ind w:left="709"/>
+        <w:jc w:val="both"/>
+      </w:pPr>
+      <w:r>
+        <w:rPr>
+          <w:rFonts w:ascii="Times New Roman" w:hAnsi="Times New Roman" w:cs="Times New Roman" w:eastAsia="Times New Roman"/>
+          <w:sz w:val="24"/>
+          <w:szCs w:val="24"/>
+        </w:rPr>
+        <w:t xml:space="preserve">1. Delimitación de las ocupaciones de ingeniería informática y de sus posibles ocupaciones de destino, y depuración de los trimestres de la ENOE disponibles antes y después de 2022.</w:t>
+      </w:r>
+    </w:p>
+    <w:p>
+      <w:pPr>
+        <w:spacing w:before="0" w:after="0" w:line="480" w:lineRule="auto"/>
+        <w:ind w:left="709"/>
+        <w:jc w:val="both"/>
+      </w:pPr>
+      <w:r>
+        <w:rPr>
+          <w:rFonts w:ascii="Times New Roman" w:hAnsi="Times New Roman" w:cs="Times New Roman" w:eastAsia="Times New Roman"/>
+          <w:sz w:val="24"/>
+          <w:szCs w:val="24"/>
+        </w:rPr>
+        <w:t xml:space="preserve">2. Asignación de las tareas de O*NET a las ocupaciones mexicanas mediante tablas de correspondencia y cálculo de su exposición a los modelos de inteligencia artificial.</w:t>
+      </w:r>
+    </w:p>
+    <w:p>
+      <w:pPr>
+        <w:spacing w:before="0" w:after="0" w:line="480" w:lineRule="auto"/>
+        <w:ind w:left="709"/>
+        <w:jc w:val="both"/>
+      </w:pPr>
+      <w:r>
+        <w:rPr>
+          <w:rFonts w:ascii="Times New Roman" w:hAnsi="Times New Roman" w:cs="Times New Roman" w:eastAsia="Times New Roman"/>
+          <w:sz w:val="24"/>
+          <w:szCs w:val="24"/>
+        </w:rPr>
+        <w:t xml:space="preserve">3. Enlace de los registros de cada persona entre trimestres y construcción de matrices de transición entre ocupaciones, desocupación e inactividad, comparando el periodo anterior y el posterior a 2022.</w:t>
+      </w:r>
+    </w:p>
+    <w:p>
+      <w:pPr>
+        <w:spacing w:before="0" w:after="0" w:line="480" w:lineRule="auto"/>
+        <w:ind w:left="709"/>
+        <w:jc w:val="both"/>
+      </w:pPr>
+      <w:r>
+        <w:rPr>
+          <w:rFonts w:ascii="Times New Roman" w:hAnsi="Times New Roman" w:cs="Times New Roman" w:eastAsia="Times New Roman"/>
+          <w:sz w:val="24"/>
+          <w:szCs w:val="24"/>
+        </w:rPr>
+        <w:t xml:space="preserve">4. Estimación de modelos de la probabilidad de transición, como regresiones logísticas multinomiales y modelos de diferencias en diferencias que comparen a jóvenes y a trabajadores con experiencia antes y después de 2022, complementados con modelos de aprendizaje automático con validación cruzada, para contrastar H1.</w:t>
+      </w:r>
+    </w:p>
+    <w:p>
+      <w:pPr>
+        <w:spacing w:before="0" w:after="0" w:line="480" w:lineRule="auto"/>
+        <w:ind w:left="709"/>
+        <w:jc w:val="both"/>
+      </w:pPr>
+      <w:r>
+        <w:rPr>
+          <w:rFonts w:ascii="Times New Roman" w:hAnsi="Times New Roman" w:cs="Times New Roman" w:eastAsia="Times New Roman"/>
+          <w:sz w:val="24"/>
+          <w:szCs w:val="24"/>
+        </w:rPr>
+        <w:t xml:space="preserve">5. Construcción de una red de movilidad con las ocupaciones de destino observadas, para contrastar H2, y elaboración del tablero de visualización.</w:t>
       </w:r>
     </w:p>
     <w:p>
@@ -1466,23 +1662,23 @@
           <w:sz w:val="24"/>
           <w:szCs w:val="24"/>
         </w:rPr>
-        <w:t xml:space="preserve">Informalidad laboral. Comprende a las personas ocupadas que son laboralmente vulnerables por la naturaleza de la unidad económica para la que trabajan, o cuyo vínculo laboral no es reconocido por su fuente de trabajo; incluye a quienes trabajan en micronegocios no registrados y a quienes laboran sin seguridad social en unidades económicas registradas (INEGI, 2025).</w:t>
+        <w:t xml:space="preserve">Herramientas de análisis. Python (pandas, NumPy, statsmodels, scikit-learn y Matplotlib), SQL Server para la integración de datos y GitHub para el control de versiones y la reproducibilidad del análisis.</w:t>
       </w:r>
     </w:p>
     <w:p>
       <w:pPr>
         <w:keepNext/>
-        <w:spacing w:before="240" w:after="0" w:line="480" w:lineRule="auto"/>
-        <w:jc w:val="left"/>
+        <w:spacing w:before="240" w:after="120" w:line="480" w:lineRule="auto"/>
+        <w:jc w:val="center"/>
       </w:pPr>
       <w:r>
         <w:rPr>
           <w:rFonts w:ascii="Times New Roman" w:hAnsi="Times New Roman" w:cs="Times New Roman" w:eastAsia="Times New Roman"/>
           <w:b/>
-          <w:sz w:val="24"/>
-          <w:szCs w:val="24"/>
-        </w:rPr>
-        <w:t xml:space="preserve">7.2. Teoría de tareas y condición de rentabilidad</w:t>
+          <w:sz w:val="28"/>
+          <w:szCs w:val="28"/>
+        </w:rPr>
+        <w:t xml:space="preserve">IX. RECURSOS</w:t>
       </w:r>
     </w:p>
     <w:p>
@@ -1497,23 +1693,7 @@
           <w:sz w:val="24"/>
           <w:szCs w:val="24"/>
         </w:rPr>
-        <w:t xml:space="preserve">El fundamento teórico del proyecto es el enfoque de tareas (Autor et al., 2003), según el cual la tecnología no sustituye ocupaciones completas, sino tareas específicas. Acemoglu y Restrepo (2018, 2019) desarrollan este enfoque como una carrera entre el desplazamiento que genera la automatización y la reinstalación que generan las tareas nuevas, y establecen que la sustitución solo se materializa cuando el costo del capital es menor que el salario. La teoría de la curva J de Brynjolfsson et al. (2021) complementa este marco al explicar por qué el efecto de las tecnologías de propósito general puede tardar varios años en observarse.</w:t>
-      </w:r>
-    </w:p>
-    <w:p>
-      <w:pPr>
-        <w:keepNext/>
-        <w:spacing w:before="240" w:after="0" w:line="480" w:lineRule="auto"/>
-        <w:jc w:val="left"/>
-      </w:pPr>
-      <w:r>
-        <w:rPr>
-          <w:rFonts w:ascii="Times New Roman" w:hAnsi="Times New Roman" w:cs="Times New Roman" w:eastAsia="Times New Roman"/>
-          <w:b/>
-          <w:sz w:val="24"/>
-          <w:szCs w:val="24"/>
-        </w:rPr>
-        <w:t xml:space="preserve">7.3. Dos fronteras de la automatización</w:t>
+        <w:t xml:space="preserve">Recursos humanos. El tesista, responsable del desarrollo del proyecto; el director de tesis, por designar; y la profesora de la unidad de aprendizaje Desarrollo de Proyecto I, que da seguimiento al protocolo.</w:t>
       </w:r>
     </w:p>
     <w:p>
@@ -1528,23 +1708,7 @@
           <w:sz w:val="24"/>
           <w:szCs w:val="24"/>
         </w:rPr>
-        <w:t xml:space="preserve">En este protocolo se denomina frontera cognitiva al conjunto de tareas que pueden automatizarse con modelos de lenguaje, y frontera física al conjunto de tareas que pueden automatizarse con robots. La distinción se sustenta en la clasificación de tareas cognitivas y manuales de Autor et al. (2003) y en la evidencia de Webb (2020), quien encuentra que, a diferencia del software y los robots, la inteligencia artificial se dirige a tareas de alta calificación. Si ambas tecnologías se dirigen a tareas distintas, es de esperar que una misma industria, como la manufacturera, enfrente riesgos diferentes en sus áreas de producción y en sus áreas administrativas y técnicas, lo que da origen a la primera hipótesis.</w:t>
-      </w:r>
-    </w:p>
-    <w:p>
-      <w:pPr>
-        <w:keepNext/>
-        <w:spacing w:before="240" w:after="0" w:line="480" w:lineRule="auto"/>
-        <w:jc w:val="left"/>
-      </w:pPr>
-      <w:r>
-        <w:rPr>
-          <w:rFonts w:ascii="Times New Roman" w:hAnsi="Times New Roman" w:cs="Times New Roman" w:eastAsia="Times New Roman"/>
-          <w:b/>
-          <w:sz w:val="24"/>
-          <w:szCs w:val="24"/>
-        </w:rPr>
-        <w:t xml:space="preserve">7.4. Elección del método</w:t>
+        <w:t xml:space="preserve">Recursos materiales. Equipo de cómputo personal, un servidor local con SQL Server para la base de datos del proyecto, software libre para el análisis (Python y sus bibliotecas) y un repositorio en GitHub. Las fuentes de información son públicas y gratuitas.</w:t>
       </w:r>
     </w:p>
     <w:p>
@@ -1559,7 +1723,7 @@
           <w:sz w:val="24"/>
           <w:szCs w:val="24"/>
         </w:rPr>
-        <w:t xml:space="preserve">El enfoque es cuantitativo porque el riesgo se expresa en magnitudes comparables entre ocupaciones, ramas y territorios. Siguiendo a la literatura de referencia (Eloundou et al., 2023; Felten et al., 2021; Webb, 2020), la exposición se mide a partir de los descriptores de tareas y habilidades de O*NET. Los modelos estadísticos permiten contrastar las hipótesis con inferencia formal, y los modelos de aprendizaje automático aportan capacidad predictiva y medidas de importancia de las variables. La proyección por escenarios, en lugar de un pronóstico, responde a que no existe un registro histórico de automatización observada para Jalisco.</w:t>
+        <w:t xml:space="preserve">Recursos económicos. El proyecto no requiere la compra de datos ni de licencias de software. Los costos se limitan al uso del equipo propio y a la conexión a internet, cubiertos por el tesista.</w:t>
       </w:r>
     </w:p>
     <w:p>
@@ -1575,7 +1739,7 @@
           <w:sz w:val="28"/>
           <w:szCs w:val="28"/>
         </w:rPr>
-        <w:t xml:space="preserve">VIII. METODOLOGÍA</w:t>
+        <w:t xml:space="preserve">X. CRONOGRAMA</w:t>
       </w:r>
     </w:p>
     <w:p>
@@ -1590,249 +1754,7 @@
           <w:sz w:val="24"/>
           <w:szCs w:val="24"/>
         </w:rPr>
-        <w:t xml:space="preserve">Tipo de estudio. Investigación cuantitativa, no experimental, que combina un análisis transversal de la exposición ocupacional con un análisis longitudinal de la sustitución de trabajo por capital y una proyección por escenarios.</w:t>
-      </w:r>
-    </w:p>
-    <w:p>
-      <w:pPr>
-        <w:spacing w:before="0" w:after="0" w:line="480" w:lineRule="auto"/>
-        <w:ind w:firstLine="709"/>
-        <w:jc w:val="both"/>
-      </w:pPr>
-      <w:r>
-        <w:rPr>
-          <w:rFonts w:ascii="Times New Roman" w:hAnsi="Times New Roman" w:cs="Times New Roman" w:eastAsia="Times New Roman"/>
-          <w:sz w:val="24"/>
-          <w:szCs w:val="24"/>
-        </w:rPr>
-        <w:t xml:space="preserve">Población y unidades de análisis. Trabajadores ocupados en la industria manufacturera de Jalisco, sectores 31 a 33 del Sistema de Clasificación Industrial de América del Norte. Las unidades de análisis son la ocupación, clasificada según el Sistema Nacional de Clasificación de Ocupaciones (INEGI, 2011), el trabajador, la rama manufacturera y el municipio.</w:t>
-      </w:r>
-    </w:p>
-    <w:p>
-      <w:pPr>
-        <w:spacing w:before="0" w:after="0" w:line="480" w:lineRule="auto"/>
-        <w:ind w:firstLine="709"/>
-        <w:jc w:val="both"/>
-      </w:pPr>
-      <w:r>
-        <w:rPr>
-          <w:rFonts w:ascii="Times New Roman" w:hAnsi="Times New Roman" w:cs="Times New Roman" w:eastAsia="Times New Roman"/>
-          <w:sz w:val="24"/>
-          <w:szCs w:val="24"/>
-        </w:rPr>
-        <w:t xml:space="preserve">Fuentes de datos. Se integrarán en una base de datos SQL Server las siguientes fuentes públicas: la ENOE y los Censos Económicos (INEGI, 2025, s.f.), la base de ocupaciones O*NET (National Center for O*NET Development, 2024), el índice de exposición a la IA y sus datos de habilidades (Felten et al., 2021), los resultados de los modelos de lenguaje en pruebas de referencia (Epoch AI, s.f.), las estadísticas de robots industriales (IFR, 2025), la inversión extranjera directa (SE, 2025) y el uso observado de la IA por ocupación (Handa et al., 2025).</w:t>
-      </w:r>
-    </w:p>
-    <w:p>
-      <w:pPr>
-        <w:spacing w:before="0" w:after="0" w:line="480" w:lineRule="auto"/>
-        <w:ind w:firstLine="709"/>
-        <w:jc w:val="both"/>
-      </w:pPr>
-      <w:r>
-        <w:rPr>
-          <w:rFonts w:ascii="Times New Roman" w:hAnsi="Times New Roman" w:cs="Times New Roman" w:eastAsia="Times New Roman"/>
-          <w:sz w:val="24"/>
-          <w:szCs w:val="24"/>
-        </w:rPr>
-        <w:t xml:space="preserve">Procedimiento. El trabajo se organiza en seis pasos alineados con los objetivos específicos:</w:t>
-      </w:r>
-    </w:p>
-    <w:p>
-      <w:pPr>
-        <w:spacing w:before="0" w:after="0" w:line="480" w:lineRule="auto"/>
-        <w:ind w:left="709"/>
-        <w:jc w:val="both"/>
-      </w:pPr>
-      <w:r>
-        <w:rPr>
-          <w:rFonts w:ascii="Times New Roman" w:hAnsi="Times New Roman" w:cs="Times New Roman" w:eastAsia="Times New Roman"/>
-          <w:sz w:val="24"/>
-          <w:szCs w:val="24"/>
-        </w:rPr>
-        <w:t xml:space="preserve">1. Integración y depuración de las fuentes, y delimitación de la población manufacturera por rama y ocupación.</w:t>
-      </w:r>
-    </w:p>
-    <w:p>
-      <w:pPr>
-        <w:spacing w:before="0" w:after="0" w:line="480" w:lineRule="auto"/>
-        <w:ind w:left="709"/>
-        <w:jc w:val="both"/>
-      </w:pPr>
-      <w:r>
-        <w:rPr>
-          <w:rFonts w:ascii="Times New Roman" w:hAnsi="Times New Roman" w:cs="Times New Roman" w:eastAsia="Times New Roman"/>
-          <w:sz w:val="24"/>
-          <w:szCs w:val="24"/>
-        </w:rPr>
-        <w:t xml:space="preserve">2. Construcción de los índices de exposición cognitiva y física a partir de O*NET, su validación contra índices publicados (Felten et al., 2021; Webb, 2020) y su traslado a las ocupaciones mexicanas mediante las tablas de correspondencia del INEGI.</w:t>
-      </w:r>
-    </w:p>
-    <w:p>
-      <w:pPr>
-        <w:spacing w:before="0" w:after="0" w:line="480" w:lineRule="auto"/>
-        <w:ind w:left="709"/>
-        <w:jc w:val="both"/>
-      </w:pPr>
-      <w:r>
-        <w:rPr>
-          <w:rFonts w:ascii="Times New Roman" w:hAnsi="Times New Roman" w:cs="Times New Roman" w:eastAsia="Times New Roman"/>
-          <w:sz w:val="24"/>
-          <w:szCs w:val="24"/>
-        </w:rPr>
-        <w:t xml:space="preserve">3. Análisis de la estructura de la exposición con análisis factorial exploratorio y confirmatorio, para contrastar H1, y descripción del perfil de exposición del sector ponderado por empleo.</w:t>
-      </w:r>
-    </w:p>
-    <w:p>
-      <w:pPr>
-        <w:spacing w:before="0" w:after="0" w:line="480" w:lineRule="auto"/>
-        <w:ind w:left="709"/>
-        <w:jc w:val="both"/>
-      </w:pPr>
-      <w:r>
-        <w:rPr>
-          <w:rFonts w:ascii="Times New Roman" w:hAnsi="Times New Roman" w:cs="Times New Roman" w:eastAsia="Times New Roman"/>
-          <w:sz w:val="24"/>
-          <w:szCs w:val="24"/>
-        </w:rPr>
-        <w:t xml:space="preserve">4. Modelación de la exposición frente al uso observado de la IA con un modelo de dos partes (hurdle), complementado con modelos de aprendizaje supervisado, como bosques aleatorios y gradient boosting, con validación cruzada e interpretación mediante valores SHAP.</w:t>
-      </w:r>
-    </w:p>
-    <w:p>
-      <w:pPr>
-        <w:spacing w:before="0" w:after="0" w:line="480" w:lineRule="auto"/>
-        <w:ind w:left="709"/>
-        <w:jc w:val="both"/>
-      </w:pPr>
-      <w:r>
-        <w:rPr>
-          <w:rFonts w:ascii="Times New Roman" w:hAnsi="Times New Roman" w:cs="Times New Roman" w:eastAsia="Times New Roman"/>
-          <w:sz w:val="24"/>
-          <w:szCs w:val="24"/>
-        </w:rPr>
-        <w:t xml:space="preserve">5. Contraste de H2 con un panel de los Censos Económicos con efectos fijos de periodo, usando un índice de rentabilidad de la automatización rezagado e inferencia por permutación, desagregado a nivel de rama manufacturera.</w:t>
-      </w:r>
-    </w:p>
-    <w:p>
-      <w:pPr>
-        <w:spacing w:before="0" w:after="0" w:line="480" w:lineRule="auto"/>
-        <w:ind w:left="709"/>
-        <w:jc w:val="both"/>
-      </w:pPr>
-      <w:r>
-        <w:rPr>
-          <w:rFonts w:ascii="Times New Roman" w:hAnsi="Times New Roman" w:cs="Times New Roman" w:eastAsia="Times New Roman"/>
-          <w:sz w:val="24"/>
-          <w:szCs w:val="24"/>
-        </w:rPr>
-        <w:t xml:space="preserve">6. Proyección 2025-2030 en tres escenarios (conservador, base y acelerado) que combinan la exposición, la rentabilidad y la evolución de la capacidad de la IA y de la adopción de robots, para dimensionar la presión de sustitución en el sector, y elaboración del tablero de visualización.</w:t>
-      </w:r>
-    </w:p>
-    <w:p>
-      <w:pPr>
-        <w:spacing w:before="0" w:after="0" w:line="480" w:lineRule="auto"/>
-        <w:ind w:firstLine="709"/>
-        <w:jc w:val="both"/>
-      </w:pPr>
-      <w:r>
-        <w:rPr>
-          <w:rFonts w:ascii="Times New Roman" w:hAnsi="Times New Roman" w:cs="Times New Roman" w:eastAsia="Times New Roman"/>
-          <w:sz w:val="24"/>
-          <w:szCs w:val="24"/>
-        </w:rPr>
-        <w:t xml:space="preserve">Herramientas de análisis. Python (pandas, NumPy, statsmodels, scikit-learn, factor_analyzer y Matplotlib), SQL Server para la integración de datos y GitHub para el control de versiones y la reproducibilidad del análisis.</w:t>
-      </w:r>
-    </w:p>
-    <w:p>
-      <w:pPr>
-        <w:keepNext/>
-        <w:spacing w:before="240" w:after="120" w:line="480" w:lineRule="auto"/>
-        <w:jc w:val="center"/>
-      </w:pPr>
-      <w:r>
-        <w:rPr>
-          <w:rFonts w:ascii="Times New Roman" w:hAnsi="Times New Roman" w:cs="Times New Roman" w:eastAsia="Times New Roman"/>
-          <w:b/>
-          <w:sz w:val="28"/>
-          <w:szCs w:val="28"/>
-        </w:rPr>
-        <w:t xml:space="preserve">IX. RECURSOS</w:t>
-      </w:r>
-    </w:p>
-    <w:p>
-      <w:pPr>
-        <w:spacing w:before="0" w:after="0" w:line="480" w:lineRule="auto"/>
-        <w:ind w:firstLine="709"/>
-        <w:jc w:val="both"/>
-      </w:pPr>
-      <w:r>
-        <w:rPr>
-          <w:rFonts w:ascii="Times New Roman" w:hAnsi="Times New Roman" w:cs="Times New Roman" w:eastAsia="Times New Roman"/>
-          <w:sz w:val="24"/>
-          <w:szCs w:val="24"/>
-        </w:rPr>
-        <w:t xml:space="preserve">Recursos humanos. El tesista, responsable del desarrollo del proyecto; el director de tesis, por designar; y la profesora de la unidad de aprendizaje Desarrollo de Proyecto I, que da seguimiento al protocolo.</w:t>
-      </w:r>
-    </w:p>
-    <w:p>
-      <w:pPr>
-        <w:spacing w:before="0" w:after="0" w:line="480" w:lineRule="auto"/>
-        <w:ind w:firstLine="709"/>
-        <w:jc w:val="both"/>
-      </w:pPr>
-      <w:r>
-        <w:rPr>
-          <w:rFonts w:ascii="Times New Roman" w:hAnsi="Times New Roman" w:cs="Times New Roman" w:eastAsia="Times New Roman"/>
-          <w:sz w:val="24"/>
-          <w:szCs w:val="24"/>
-        </w:rPr>
-        <w:t xml:space="preserve">Recursos materiales. Equipo de cómputo personal, un servidor local con SQL Server para la base de datos del proyecto, software libre para el análisis (Python y sus bibliotecas) y un repositorio en GitHub. Las fuentes de información son públicas y gratuitas.</w:t>
-      </w:r>
-    </w:p>
-    <w:p>
-      <w:pPr>
-        <w:spacing w:before="0" w:after="0" w:line="480" w:lineRule="auto"/>
-        <w:ind w:firstLine="709"/>
-        <w:jc w:val="both"/>
-      </w:pPr>
-      <w:r>
-        <w:rPr>
-          <w:rFonts w:ascii="Times New Roman" w:hAnsi="Times New Roman" w:cs="Times New Roman" w:eastAsia="Times New Roman"/>
-          <w:sz w:val="24"/>
-          <w:szCs w:val="24"/>
-        </w:rPr>
-        <w:t xml:space="preserve">Recursos económicos. El proyecto no requiere la compra de datos ni de licencias de software. Los costos se limitan al uso del equipo propio y a la conexión a internet, cubiertos por el tesista.</w:t>
-      </w:r>
-    </w:p>
-    <w:p>
-      <w:pPr>
-        <w:keepNext/>
-        <w:spacing w:before="240" w:after="120" w:line="480" w:lineRule="auto"/>
-        <w:jc w:val="center"/>
-      </w:pPr>
-      <w:r>
-        <w:rPr>
-          <w:rFonts w:ascii="Times New Roman" w:hAnsi="Times New Roman" w:cs="Times New Roman" w:eastAsia="Times New Roman"/>
-          <w:b/>
-          <w:sz w:val="28"/>
-          <w:szCs w:val="28"/>
-        </w:rPr>
-        <w:t xml:space="preserve">X. CRONOGRAMA</w:t>
-      </w:r>
-    </w:p>
-    <w:p>
-      <w:pPr>
-        <w:spacing w:before="0" w:after="0" w:line="480" w:lineRule="auto"/>
-        <w:ind w:firstLine="709"/>
-        <w:jc w:val="both"/>
-      </w:pPr>
-      <w:r>
-        <w:rPr>
-          <w:rFonts w:ascii="Times New Roman" w:hAnsi="Times New Roman" w:cs="Times New Roman" w:eastAsia="Times New Roman"/>
-          <w:sz w:val="24"/>
-          <w:szCs w:val="24"/>
-        </w:rPr>
-        <w:t xml:space="preserve">El cronograma reproduce el plan registrado en el avance de protocolo de la tesis, con la actividad de reenfoque a la industria manufacturera añadida y el estado de cada etapa a octubre de 2026.</w:t>
+        <w:t xml:space="preserve">El cronograma parte del plan registrado en el avance de protocolo de la tesis e incorpora el reenfoque hacia la movilidad laboral en las ocupaciones de ingeniería informática, con el estado de cada etapa a octubre de 2026.</w:t>
       </w:r>
     </w:p>
     <w:p>
@@ -2082,777 +2004,7 @@
                 <w:rFonts w:ascii="Times New Roman" w:hAnsi="Times New Roman" w:cs="Times New Roman" w:eastAsia="Times New Roman"/>
                 <w:sz w:val="20"/>
               </w:rPr>
-              <w:t xml:space="preserve"/>
-            </w:r>
-          </w:p>
-        </w:tc>
-        <w:tc>
-          <w:tcPr>
-            <w:tcW w:w="1000" w:type="dxa"/>
-          </w:tcPr>
-          <w:p>
-            <w:pPr>
-              <w:spacing w:before="0" w:after="0" w:line="240" w:lineRule="auto"/>
-              <w:jc w:val="center"/>
-            </w:pPr>
-            <w:r>
-              <w:rPr>
-                <w:rFonts w:ascii="Times New Roman" w:hAnsi="Times New Roman" w:cs="Times New Roman" w:eastAsia="Times New Roman"/>
-                <w:sz w:val="20"/>
-              </w:rPr>
-              <w:t xml:space="preserve"/>
-            </w:r>
-          </w:p>
-        </w:tc>
-        <w:tc>
-          <w:tcPr>
-            <w:tcW w:w="1100" w:type="dxa"/>
-          </w:tcPr>
-          <w:p>
-            <w:pPr>
-              <w:spacing w:before="0" w:after="0" w:line="240" w:lineRule="auto"/>
-              <w:jc w:val="center"/>
-            </w:pPr>
-            <w:r>
-              <w:rPr>
-                <w:rFonts w:ascii="Times New Roman" w:hAnsi="Times New Roman" w:cs="Times New Roman" w:eastAsia="Times New Roman"/>
-                <w:sz w:val="20"/>
-              </w:rPr>
-              <w:t xml:space="preserve">Concluida</w:t>
-            </w:r>
-          </w:p>
-        </w:tc>
-      </w:tr>
-      <w:tr>
-        <w:tc>
-          <w:tcPr>
-            <w:tcW w:w="3300" w:type="dxa"/>
-          </w:tcPr>
-          <w:p>
-            <w:pPr>
-              <w:spacing w:before="0" w:after="0" w:line="240" w:lineRule="auto"/>
-              <w:jc w:val="left"/>
-            </w:pPr>
-            <w:r>
-              <w:rPr>
-                <w:rFonts w:ascii="Times New Roman" w:hAnsi="Times New Roman" w:cs="Times New Roman" w:eastAsia="Times New Roman"/>
-                <w:sz w:val="20"/>
-              </w:rPr>
-              <w:t xml:space="preserve">Corrección del marco teórico y definición metodológica</w:t>
-            </w:r>
-          </w:p>
-        </w:tc>
-        <w:tc>
-          <w:tcPr>
-            <w:tcW w:w="900" w:type="dxa"/>
-          </w:tcPr>
-          <w:p>
-            <w:pPr>
-              <w:spacing w:before="0" w:after="0" w:line="240" w:lineRule="auto"/>
-              <w:jc w:val="center"/>
-            </w:pPr>
-            <w:r>
-              <w:rPr>
-                <w:rFonts w:ascii="Times New Roman" w:hAnsi="Times New Roman" w:cs="Times New Roman" w:eastAsia="Times New Roman"/>
-                <w:sz w:val="20"/>
-              </w:rPr>
-              <w:t xml:space="preserve">Sep-Oct</w:t>
-            </w:r>
-          </w:p>
-        </w:tc>
-        <w:tc>
-          <w:tcPr>
-            <w:tcW w:w="900" w:type="dxa"/>
-          </w:tcPr>
-          <w:p>
-            <w:pPr>
-              <w:spacing w:before="0" w:after="0" w:line="240" w:lineRule="auto"/>
-              <w:jc w:val="center"/>
-            </w:pPr>
-            <w:r>
-              <w:rPr>
-                <w:rFonts w:ascii="Times New Roman" w:hAnsi="Times New Roman" w:cs="Times New Roman" w:eastAsia="Times New Roman"/>
-                <w:sz w:val="20"/>
-              </w:rPr>
-              <w:t xml:space="preserve"/>
-            </w:r>
-          </w:p>
-        </w:tc>
-        <w:tc>
-          <w:tcPr>
-            <w:tcW w:w="900" w:type="dxa"/>
-          </w:tcPr>
-          <w:p>
-            <w:pPr>
-              <w:spacing w:before="0" w:after="0" w:line="240" w:lineRule="auto"/>
-              <w:jc w:val="center"/>
-            </w:pPr>
-            <w:r>
-              <w:rPr>
-                <w:rFonts w:ascii="Times New Roman" w:hAnsi="Times New Roman" w:cs="Times New Roman" w:eastAsia="Times New Roman"/>
-                <w:sz w:val="20"/>
-              </w:rPr>
-              <w:t xml:space="preserve"/>
-            </w:r>
-          </w:p>
-        </w:tc>
-        <w:tc>
-          <w:tcPr>
-            <w:tcW w:w="1000" w:type="dxa"/>
-          </w:tcPr>
-          <w:p>
-            <w:pPr>
-              <w:spacing w:before="0" w:after="0" w:line="240" w:lineRule="auto"/>
-              <w:jc w:val="center"/>
-            </w:pPr>
-            <w:r>
-              <w:rPr>
-                <w:rFonts w:ascii="Times New Roman" w:hAnsi="Times New Roman" w:cs="Times New Roman" w:eastAsia="Times New Roman"/>
-                <w:sz w:val="20"/>
-              </w:rPr>
-              <w:t xml:space="preserve"/>
-            </w:r>
-          </w:p>
-        </w:tc>
-        <w:tc>
-          <w:tcPr>
-            <w:tcW w:w="1100" w:type="dxa"/>
-          </w:tcPr>
-          <w:p>
-            <w:pPr>
-              <w:spacing w:before="0" w:after="0" w:line="240" w:lineRule="auto"/>
-              <w:jc w:val="center"/>
-            </w:pPr>
-            <w:r>
-              <w:rPr>
-                <w:rFonts w:ascii="Times New Roman" w:hAnsi="Times New Roman" w:cs="Times New Roman" w:eastAsia="Times New Roman"/>
-                <w:sz w:val="20"/>
-              </w:rPr>
-              <w:t xml:space="preserve">Concluida</w:t>
-            </w:r>
-          </w:p>
-        </w:tc>
-      </w:tr>
-      <w:tr>
-        <w:tc>
-          <w:tcPr>
-            <w:tcW w:w="3300" w:type="dxa"/>
-          </w:tcPr>
-          <w:p>
-            <w:pPr>
-              <w:spacing w:before="0" w:after="0" w:line="240" w:lineRule="auto"/>
-              <w:jc w:val="left"/>
-            </w:pPr>
-            <w:r>
-              <w:rPr>
-                <w:rFonts w:ascii="Times New Roman" w:hAnsi="Times New Roman" w:cs="Times New Roman" w:eastAsia="Times New Roman"/>
-                <w:sz w:val="20"/>
-              </w:rPr>
-              <w:t xml:space="preserve">Obtención y limpieza de datos (INEGI, O*NET)</w:t>
-            </w:r>
-          </w:p>
-        </w:tc>
-        <w:tc>
-          <w:tcPr>
-            <w:tcW w:w="900" w:type="dxa"/>
-          </w:tcPr>
-          <w:p>
-            <w:pPr>
-              <w:spacing w:before="0" w:after="0" w:line="240" w:lineRule="auto"/>
-              <w:jc w:val="center"/>
-            </w:pPr>
-            <w:r>
-              <w:rPr>
-                <w:rFonts w:ascii="Times New Roman" w:hAnsi="Times New Roman" w:cs="Times New Roman" w:eastAsia="Times New Roman"/>
-                <w:sz w:val="20"/>
-              </w:rPr>
-              <w:t xml:space="preserve">Oct-Nov</w:t>
-            </w:r>
-          </w:p>
-        </w:tc>
-        <w:tc>
-          <w:tcPr>
-            <w:tcW w:w="900" w:type="dxa"/>
-          </w:tcPr>
-          <w:p>
-            <w:pPr>
-              <w:spacing w:before="0" w:after="0" w:line="240" w:lineRule="auto"/>
-              <w:jc w:val="center"/>
-            </w:pPr>
-            <w:r>
-              <w:rPr>
-                <w:rFonts w:ascii="Times New Roman" w:hAnsi="Times New Roman" w:cs="Times New Roman" w:eastAsia="Times New Roman"/>
-                <w:sz w:val="20"/>
-              </w:rPr>
-              <w:t xml:space="preserve"/>
-            </w:r>
-          </w:p>
-        </w:tc>
-        <w:tc>
-          <w:tcPr>
-            <w:tcW w:w="900" w:type="dxa"/>
-          </w:tcPr>
-          <w:p>
-            <w:pPr>
-              <w:spacing w:before="0" w:after="0" w:line="240" w:lineRule="auto"/>
-              <w:jc w:val="center"/>
-            </w:pPr>
-            <w:r>
-              <w:rPr>
-                <w:rFonts w:ascii="Times New Roman" w:hAnsi="Times New Roman" w:cs="Times New Roman" w:eastAsia="Times New Roman"/>
-                <w:sz w:val="20"/>
-              </w:rPr>
-              <w:t xml:space="preserve"/>
-            </w:r>
-          </w:p>
-        </w:tc>
-        <w:tc>
-          <w:tcPr>
-            <w:tcW w:w="1000" w:type="dxa"/>
-          </w:tcPr>
-          <w:p>
-            <w:pPr>
-              <w:spacing w:before="0" w:after="0" w:line="240" w:lineRule="auto"/>
-              <w:jc w:val="center"/>
-            </w:pPr>
-            <w:r>
-              <w:rPr>
-                <w:rFonts w:ascii="Times New Roman" w:hAnsi="Times New Roman" w:cs="Times New Roman" w:eastAsia="Times New Roman"/>
-                <w:sz w:val="20"/>
-              </w:rPr>
-              <w:t xml:space="preserve"/>
-            </w:r>
-          </w:p>
-        </w:tc>
-        <w:tc>
-          <w:tcPr>
-            <w:tcW w:w="1100" w:type="dxa"/>
-          </w:tcPr>
-          <w:p>
-            <w:pPr>
-              <w:spacing w:before="0" w:after="0" w:line="240" w:lineRule="auto"/>
-              <w:jc w:val="center"/>
-            </w:pPr>
-            <w:r>
-              <w:rPr>
-                <w:rFonts w:ascii="Times New Roman" w:hAnsi="Times New Roman" w:cs="Times New Roman" w:eastAsia="Times New Roman"/>
-                <w:sz w:val="20"/>
-              </w:rPr>
-              <w:t xml:space="preserve">Concluida</w:t>
-            </w:r>
-          </w:p>
-        </w:tc>
-      </w:tr>
-      <w:tr>
-        <w:tc>
-          <w:tcPr>
-            <w:tcW w:w="3300" w:type="dxa"/>
-          </w:tcPr>
-          <w:p>
-            <w:pPr>
-              <w:spacing w:before="0" w:after="0" w:line="240" w:lineRule="auto"/>
-              <w:jc w:val="left"/>
-            </w:pPr>
-            <w:r>
-              <w:rPr>
-                <w:rFonts w:ascii="Times New Roman" w:hAnsi="Times New Roman" w:cs="Times New Roman" w:eastAsia="Times New Roman"/>
-                <w:sz w:val="20"/>
-              </w:rPr>
-              <w:t xml:space="preserve">Mapeo y normalización de ocupaciones</w:t>
-            </w:r>
-          </w:p>
-        </w:tc>
-        <w:tc>
-          <w:tcPr>
-            <w:tcW w:w="900" w:type="dxa"/>
-          </w:tcPr>
-          <w:p>
-            <w:pPr>
-              <w:spacing w:before="0" w:after="0" w:line="240" w:lineRule="auto"/>
-              <w:jc w:val="center"/>
-            </w:pPr>
-            <w:r>
-              <w:rPr>
-                <w:rFonts w:ascii="Times New Roman" w:hAnsi="Times New Roman" w:cs="Times New Roman" w:eastAsia="Times New Roman"/>
-                <w:sz w:val="20"/>
-              </w:rPr>
-              <w:t xml:space="preserve">Nov-Dic</w:t>
-            </w:r>
-          </w:p>
-        </w:tc>
-        <w:tc>
-          <w:tcPr>
-            <w:tcW w:w="900" w:type="dxa"/>
-          </w:tcPr>
-          <w:p>
-            <w:pPr>
-              <w:spacing w:before="0" w:after="0" w:line="240" w:lineRule="auto"/>
-              <w:jc w:val="center"/>
-            </w:pPr>
-            <w:r>
-              <w:rPr>
-                <w:rFonts w:ascii="Times New Roman" w:hAnsi="Times New Roman" w:cs="Times New Roman" w:eastAsia="Times New Roman"/>
-                <w:sz w:val="20"/>
-              </w:rPr>
-              <w:t xml:space="preserve">Ene</w:t>
-            </w:r>
-          </w:p>
-        </w:tc>
-        <w:tc>
-          <w:tcPr>
-            <w:tcW w:w="900" w:type="dxa"/>
-          </w:tcPr>
-          <w:p>
-            <w:pPr>
-              <w:spacing w:before="0" w:after="0" w:line="240" w:lineRule="auto"/>
-              <w:jc w:val="center"/>
-            </w:pPr>
-            <w:r>
-              <w:rPr>
-                <w:rFonts w:ascii="Times New Roman" w:hAnsi="Times New Roman" w:cs="Times New Roman" w:eastAsia="Times New Roman"/>
-                <w:sz w:val="20"/>
-              </w:rPr>
-              <w:t xml:space="preserve"/>
-            </w:r>
-          </w:p>
-        </w:tc>
-        <w:tc>
-          <w:tcPr>
-            <w:tcW w:w="1000" w:type="dxa"/>
-          </w:tcPr>
-          <w:p>
-            <w:pPr>
-              <w:spacing w:before="0" w:after="0" w:line="240" w:lineRule="auto"/>
-              <w:jc w:val="center"/>
-            </w:pPr>
-            <w:r>
-              <w:rPr>
-                <w:rFonts w:ascii="Times New Roman" w:hAnsi="Times New Roman" w:cs="Times New Roman" w:eastAsia="Times New Roman"/>
-                <w:sz w:val="20"/>
-              </w:rPr>
-              <w:t xml:space="preserve"/>
-            </w:r>
-          </w:p>
-        </w:tc>
-        <w:tc>
-          <w:tcPr>
-            <w:tcW w:w="1100" w:type="dxa"/>
-          </w:tcPr>
-          <w:p>
-            <w:pPr>
-              <w:spacing w:before="0" w:after="0" w:line="240" w:lineRule="auto"/>
-              <w:jc w:val="center"/>
-            </w:pPr>
-            <w:r>
-              <w:rPr>
-                <w:rFonts w:ascii="Times New Roman" w:hAnsi="Times New Roman" w:cs="Times New Roman" w:eastAsia="Times New Roman"/>
-                <w:sz w:val="20"/>
-              </w:rPr>
-              <w:t xml:space="preserve">Concluida</w:t>
-            </w:r>
-          </w:p>
-        </w:tc>
-      </w:tr>
-      <w:tr>
-        <w:tc>
-          <w:tcPr>
-            <w:tcW w:w="3300" w:type="dxa"/>
-          </w:tcPr>
-          <w:p>
-            <w:pPr>
-              <w:spacing w:before="0" w:after="0" w:line="240" w:lineRule="auto"/>
-              <w:jc w:val="left"/>
-            </w:pPr>
-            <w:r>
-              <w:rPr>
-                <w:rFonts w:ascii="Times New Roman" w:hAnsi="Times New Roman" w:cs="Times New Roman" w:eastAsia="Times New Roman"/>
-                <w:sz w:val="20"/>
-              </w:rPr>
-              <w:t xml:space="preserve">Cálculo de índices</w:t>
-            </w:r>
-          </w:p>
-        </w:tc>
-        <w:tc>
-          <w:tcPr>
-            <w:tcW w:w="900" w:type="dxa"/>
-          </w:tcPr>
-          <w:p>
-            <w:pPr>
-              <w:spacing w:before="0" w:after="0" w:line="240" w:lineRule="auto"/>
-              <w:jc w:val="center"/>
-            </w:pPr>
-            <w:r>
-              <w:rPr>
-                <w:rFonts w:ascii="Times New Roman" w:hAnsi="Times New Roman" w:cs="Times New Roman" w:eastAsia="Times New Roman"/>
-                <w:sz w:val="20"/>
-              </w:rPr>
-              <w:t xml:space="preserve"/>
-            </w:r>
-          </w:p>
-        </w:tc>
-        <w:tc>
-          <w:tcPr>
-            <w:tcW w:w="900" w:type="dxa"/>
-          </w:tcPr>
-          <w:p>
-            <w:pPr>
-              <w:spacing w:before="0" w:after="0" w:line="240" w:lineRule="auto"/>
-              <w:jc w:val="center"/>
-            </w:pPr>
-            <w:r>
-              <w:rPr>
-                <w:rFonts w:ascii="Times New Roman" w:hAnsi="Times New Roman" w:cs="Times New Roman" w:eastAsia="Times New Roman"/>
-                <w:sz w:val="20"/>
-              </w:rPr>
-              <w:t xml:space="preserve">Feb-Mar</w:t>
-            </w:r>
-          </w:p>
-        </w:tc>
-        <w:tc>
-          <w:tcPr>
-            <w:tcW w:w="900" w:type="dxa"/>
-          </w:tcPr>
-          <w:p>
-            <w:pPr>
-              <w:spacing w:before="0" w:after="0" w:line="240" w:lineRule="auto"/>
-              <w:jc w:val="center"/>
-            </w:pPr>
-            <w:r>
-              <w:rPr>
-                <w:rFonts w:ascii="Times New Roman" w:hAnsi="Times New Roman" w:cs="Times New Roman" w:eastAsia="Times New Roman"/>
-                <w:sz w:val="20"/>
-              </w:rPr>
-              <w:t xml:space="preserve"/>
-            </w:r>
-          </w:p>
-        </w:tc>
-        <w:tc>
-          <w:tcPr>
-            <w:tcW w:w="1000" w:type="dxa"/>
-          </w:tcPr>
-          <w:p>
-            <w:pPr>
-              <w:spacing w:before="0" w:after="0" w:line="240" w:lineRule="auto"/>
-              <w:jc w:val="center"/>
-            </w:pPr>
-            <w:r>
-              <w:rPr>
-                <w:rFonts w:ascii="Times New Roman" w:hAnsi="Times New Roman" w:cs="Times New Roman" w:eastAsia="Times New Roman"/>
-                <w:sz w:val="20"/>
-              </w:rPr>
-              <w:t xml:space="preserve"/>
-            </w:r>
-          </w:p>
-        </w:tc>
-        <w:tc>
-          <w:tcPr>
-            <w:tcW w:w="1100" w:type="dxa"/>
-          </w:tcPr>
-          <w:p>
-            <w:pPr>
-              <w:spacing w:before="0" w:after="0" w:line="240" w:lineRule="auto"/>
-              <w:jc w:val="center"/>
-            </w:pPr>
-            <w:r>
-              <w:rPr>
-                <w:rFonts w:ascii="Times New Roman" w:hAnsi="Times New Roman" w:cs="Times New Roman" w:eastAsia="Times New Roman"/>
-                <w:sz w:val="20"/>
-              </w:rPr>
-              <w:t xml:space="preserve">Concluida</w:t>
-            </w:r>
-          </w:p>
-        </w:tc>
-      </w:tr>
-      <w:tr>
-        <w:tc>
-          <w:tcPr>
-            <w:tcW w:w="3300" w:type="dxa"/>
-          </w:tcPr>
-          <w:p>
-            <w:pPr>
-              <w:spacing w:before="0" w:after="0" w:line="240" w:lineRule="auto"/>
-              <w:jc w:val="left"/>
-            </w:pPr>
-            <w:r>
-              <w:rPr>
-                <w:rFonts w:ascii="Times New Roman" w:hAnsi="Times New Roman" w:cs="Times New Roman" w:eastAsia="Times New Roman"/>
-                <w:sz w:val="20"/>
-              </w:rPr>
-              <w:t xml:space="preserve">Incorporación de indicadores emergentes de IA</w:t>
-            </w:r>
-          </w:p>
-        </w:tc>
-        <w:tc>
-          <w:tcPr>
-            <w:tcW w:w="900" w:type="dxa"/>
-          </w:tcPr>
-          <w:p>
-            <w:pPr>
-              <w:spacing w:before="0" w:after="0" w:line="240" w:lineRule="auto"/>
-              <w:jc w:val="center"/>
-            </w:pPr>
-            <w:r>
-              <w:rPr>
-                <w:rFonts w:ascii="Times New Roman" w:hAnsi="Times New Roman" w:cs="Times New Roman" w:eastAsia="Times New Roman"/>
-                <w:sz w:val="20"/>
-              </w:rPr>
-              <w:t xml:space="preserve"/>
-            </w:r>
-          </w:p>
-        </w:tc>
-        <w:tc>
-          <w:tcPr>
-            <w:tcW w:w="900" w:type="dxa"/>
-          </w:tcPr>
-          <w:p>
-            <w:pPr>
-              <w:spacing w:before="0" w:after="0" w:line="240" w:lineRule="auto"/>
-              <w:jc w:val="center"/>
-            </w:pPr>
-            <w:r>
-              <w:rPr>
-                <w:rFonts w:ascii="Times New Roman" w:hAnsi="Times New Roman" w:cs="Times New Roman" w:eastAsia="Times New Roman"/>
-                <w:sz w:val="20"/>
-              </w:rPr>
-              <w:t xml:space="preserve">Mar-Abr</w:t>
-            </w:r>
-          </w:p>
-        </w:tc>
-        <w:tc>
-          <w:tcPr>
-            <w:tcW w:w="900" w:type="dxa"/>
-          </w:tcPr>
-          <w:p>
-            <w:pPr>
-              <w:spacing w:before="0" w:after="0" w:line="240" w:lineRule="auto"/>
-              <w:jc w:val="center"/>
-            </w:pPr>
-            <w:r>
-              <w:rPr>
-                <w:rFonts w:ascii="Times New Roman" w:hAnsi="Times New Roman" w:cs="Times New Roman" w:eastAsia="Times New Roman"/>
-                <w:sz w:val="20"/>
-              </w:rPr>
-              <w:t xml:space="preserve"/>
-            </w:r>
-          </w:p>
-        </w:tc>
-        <w:tc>
-          <w:tcPr>
-            <w:tcW w:w="1000" w:type="dxa"/>
-          </w:tcPr>
-          <w:p>
-            <w:pPr>
-              <w:spacing w:before="0" w:after="0" w:line="240" w:lineRule="auto"/>
-              <w:jc w:val="center"/>
-            </w:pPr>
-            <w:r>
-              <w:rPr>
-                <w:rFonts w:ascii="Times New Roman" w:hAnsi="Times New Roman" w:cs="Times New Roman" w:eastAsia="Times New Roman"/>
-                <w:sz w:val="20"/>
-              </w:rPr>
-              <w:t xml:space="preserve"/>
-            </w:r>
-          </w:p>
-        </w:tc>
-        <w:tc>
-          <w:tcPr>
-            <w:tcW w:w="1100" w:type="dxa"/>
-          </w:tcPr>
-          <w:p>
-            <w:pPr>
-              <w:spacing w:before="0" w:after="0" w:line="240" w:lineRule="auto"/>
-              <w:jc w:val="center"/>
-            </w:pPr>
-            <w:r>
-              <w:rPr>
-                <w:rFonts w:ascii="Times New Roman" w:hAnsi="Times New Roman" w:cs="Times New Roman" w:eastAsia="Times New Roman"/>
-                <w:sz w:val="20"/>
-              </w:rPr>
-              <w:t xml:space="preserve">Concluida</w:t>
-            </w:r>
-          </w:p>
-        </w:tc>
-      </w:tr>
-      <w:tr>
-        <w:tc>
-          <w:tcPr>
-            <w:tcW w:w="3300" w:type="dxa"/>
-          </w:tcPr>
-          <w:p>
-            <w:pPr>
-              <w:spacing w:before="0" w:after="0" w:line="240" w:lineRule="auto"/>
-              <w:jc w:val="left"/>
-            </w:pPr>
-            <w:r>
-              <w:rPr>
-                <w:rFonts w:ascii="Times New Roman" w:hAnsi="Times New Roman" w:cs="Times New Roman" w:eastAsia="Times New Roman"/>
-                <w:sz w:val="20"/>
-              </w:rPr>
-              <w:t xml:space="preserve">Desarrollo y entrenamiento de modelos</w:t>
-            </w:r>
-          </w:p>
-        </w:tc>
-        <w:tc>
-          <w:tcPr>
-            <w:tcW w:w="900" w:type="dxa"/>
-          </w:tcPr>
-          <w:p>
-            <w:pPr>
-              <w:spacing w:before="0" w:after="0" w:line="240" w:lineRule="auto"/>
-              <w:jc w:val="center"/>
-            </w:pPr>
-            <w:r>
-              <w:rPr>
-                <w:rFonts w:ascii="Times New Roman" w:hAnsi="Times New Roman" w:cs="Times New Roman" w:eastAsia="Times New Roman"/>
-                <w:sz w:val="20"/>
-              </w:rPr>
-              <w:t xml:space="preserve"/>
-            </w:r>
-          </w:p>
-        </w:tc>
-        <w:tc>
-          <w:tcPr>
-            <w:tcW w:w="900" w:type="dxa"/>
-          </w:tcPr>
-          <w:p>
-            <w:pPr>
-              <w:spacing w:before="0" w:after="0" w:line="240" w:lineRule="auto"/>
-              <w:jc w:val="center"/>
-            </w:pPr>
-            <w:r>
-              <w:rPr>
-                <w:rFonts w:ascii="Times New Roman" w:hAnsi="Times New Roman" w:cs="Times New Roman" w:eastAsia="Times New Roman"/>
-                <w:sz w:val="20"/>
-              </w:rPr>
-              <w:t xml:space="preserve">May-Jul</w:t>
-            </w:r>
-          </w:p>
-        </w:tc>
-        <w:tc>
-          <w:tcPr>
-            <w:tcW w:w="900" w:type="dxa"/>
-          </w:tcPr>
-          <w:p>
-            <w:pPr>
-              <w:spacing w:before="0" w:after="0" w:line="240" w:lineRule="auto"/>
-              <w:jc w:val="center"/>
-            </w:pPr>
-            <w:r>
-              <w:rPr>
-                <w:rFonts w:ascii="Times New Roman" w:hAnsi="Times New Roman" w:cs="Times New Roman" w:eastAsia="Times New Roman"/>
-                <w:sz w:val="20"/>
-              </w:rPr>
-              <w:t xml:space="preserve">Ago-Sep</w:t>
-            </w:r>
-          </w:p>
-        </w:tc>
-        <w:tc>
-          <w:tcPr>
-            <w:tcW w:w="1000" w:type="dxa"/>
-          </w:tcPr>
-          <w:p>
-            <w:pPr>
-              <w:spacing w:before="0" w:after="0" w:line="240" w:lineRule="auto"/>
-              <w:jc w:val="center"/>
-            </w:pPr>
-            <w:r>
-              <w:rPr>
-                <w:rFonts w:ascii="Times New Roman" w:hAnsi="Times New Roman" w:cs="Times New Roman" w:eastAsia="Times New Roman"/>
-                <w:sz w:val="20"/>
-              </w:rPr>
-              <w:t xml:space="preserve"/>
-            </w:r>
-          </w:p>
-        </w:tc>
-        <w:tc>
-          <w:tcPr>
-            <w:tcW w:w="1100" w:type="dxa"/>
-          </w:tcPr>
-          <w:p>
-            <w:pPr>
-              <w:spacing w:before="0" w:after="0" w:line="240" w:lineRule="auto"/>
-              <w:jc w:val="center"/>
-            </w:pPr>
-            <w:r>
-              <w:rPr>
-                <w:rFonts w:ascii="Times New Roman" w:hAnsi="Times New Roman" w:cs="Times New Roman" w:eastAsia="Times New Roman"/>
-                <w:sz w:val="20"/>
-              </w:rPr>
-              <w:t xml:space="preserve">Concluida</w:t>
-            </w:r>
-          </w:p>
-        </w:tc>
-      </w:tr>
-      <w:tr>
-        <w:tc>
-          <w:tcPr>
-            <w:tcW w:w="3300" w:type="dxa"/>
-          </w:tcPr>
-          <w:p>
-            <w:pPr>
-              <w:spacing w:before="0" w:after="0" w:line="240" w:lineRule="auto"/>
-              <w:jc w:val="left"/>
-            </w:pPr>
-            <w:r>
-              <w:rPr>
-                <w:rFonts w:ascii="Times New Roman" w:hAnsi="Times New Roman" w:cs="Times New Roman" w:eastAsia="Times New Roman"/>
-                <w:sz w:val="20"/>
-              </w:rPr>
-              <w:t xml:space="preserve">Reenfoque a la industria manufacturera</w:t>
-            </w:r>
-          </w:p>
-        </w:tc>
-        <w:tc>
-          <w:tcPr>
-            <w:tcW w:w="900" w:type="dxa"/>
-          </w:tcPr>
-          <w:p>
-            <w:pPr>
-              <w:spacing w:before="0" w:after="0" w:line="240" w:lineRule="auto"/>
-              <w:jc w:val="center"/>
-            </w:pPr>
-            <w:r>
-              <w:rPr>
-                <w:rFonts w:ascii="Times New Roman" w:hAnsi="Times New Roman" w:cs="Times New Roman" w:eastAsia="Times New Roman"/>
-                <w:sz w:val="20"/>
-              </w:rPr>
-              <w:t xml:space="preserve"/>
-            </w:r>
-          </w:p>
-        </w:tc>
-        <w:tc>
-          <w:tcPr>
-            <w:tcW w:w="900" w:type="dxa"/>
-          </w:tcPr>
-          <w:p>
-            <w:pPr>
-              <w:spacing w:before="0" w:after="0" w:line="240" w:lineRule="auto"/>
-              <w:jc w:val="center"/>
-            </w:pPr>
-            <w:r>
-              <w:rPr>
-                <w:rFonts w:ascii="Times New Roman" w:hAnsi="Times New Roman" w:cs="Times New Roman" w:eastAsia="Times New Roman"/>
-                <w:sz w:val="20"/>
-              </w:rPr>
-              <w:t xml:space="preserve"/>
-            </w:r>
-          </w:p>
-        </w:tc>
-        <w:tc>
-          <w:tcPr>
-            <w:tcW w:w="900" w:type="dxa"/>
-          </w:tcPr>
-          <w:p>
-            <w:pPr>
-              <w:spacing w:before="0" w:after="0" w:line="240" w:lineRule="auto"/>
-              <w:jc w:val="center"/>
-            </w:pPr>
-            <w:r>
-              <w:rPr>
-                <w:rFonts w:ascii="Times New Roman" w:hAnsi="Times New Roman" w:cs="Times New Roman" w:eastAsia="Times New Roman"/>
-                <w:sz w:val="20"/>
-              </w:rPr>
-              <w:t xml:space="preserve">Ago-Oct</w:t>
+              <w:t xml:space="preserve">Oct</w:t>
             </w:r>
           </w:p>
         </w:tc>
@@ -2908,7 +2060,7 @@
                 <w:rFonts w:ascii="Times New Roman" w:hAnsi="Times New Roman" w:cs="Times New Roman" w:eastAsia="Times New Roman"/>
                 <w:sz w:val="20"/>
               </w:rPr>
-              <w:t xml:space="preserve">Evaluación y validación del modelo</w:t>
+              <w:t xml:space="preserve">Reenfoque a movilidad laboral en ingeniería informática</w:t>
             </w:r>
           </w:p>
         </w:tc>
@@ -2962,7 +2114,7 @@
                 <w:rFonts w:ascii="Times New Roman" w:hAnsi="Times New Roman" w:cs="Times New Roman" w:eastAsia="Times New Roman"/>
                 <w:sz w:val="20"/>
               </w:rPr>
-              <w:t xml:space="preserve">Sep-Nov</w:t>
+              <w:t xml:space="preserve">Oct-Nov</w:t>
             </w:r>
           </w:p>
         </w:tc>
@@ -3018,7 +2170,7 @@
                 <w:rFonts w:ascii="Times New Roman" w:hAnsi="Times New Roman" w:cs="Times New Roman" w:eastAsia="Times New Roman"/>
                 <w:sz w:val="20"/>
               </w:rPr>
-              <w:t xml:space="preserve">Visualización y desarrollo del tablero</w:t>
+              <w:t xml:space="preserve">Obtención y depuración del panel de la ENOE</w:t>
             </w:r>
           </w:p>
         </w:tc>
@@ -3090,7 +2242,7 @@
                 <w:rFonts w:ascii="Times New Roman" w:hAnsi="Times New Roman" w:cs="Times New Roman" w:eastAsia="Times New Roman"/>
                 <w:sz w:val="20"/>
               </w:rPr>
-              <w:t xml:space="preserve">Ene</w:t>
+              <w:t xml:space="preserve"/>
             </w:r>
           </w:p>
         </w:tc>
@@ -3128,7 +2280,117 @@
                 <w:rFonts w:ascii="Times New Roman" w:hAnsi="Times New Roman" w:cs="Times New Roman" w:eastAsia="Times New Roman"/>
                 <w:sz w:val="20"/>
               </w:rPr>
-              <w:t xml:space="preserve">Redacción de resultados y análisis de impacto</w:t>
+              <w:t xml:space="preserve">Mapeo de ocupaciones y tareas (SINCO, O*NET)</w:t>
+            </w:r>
+          </w:p>
+        </w:tc>
+        <w:tc>
+          <w:tcPr>
+            <w:tcW w:w="900" w:type="dxa"/>
+          </w:tcPr>
+          <w:p>
+            <w:pPr>
+              <w:spacing w:before="0" w:after="0" w:line="240" w:lineRule="auto"/>
+              <w:jc w:val="center"/>
+            </w:pPr>
+            <w:r>
+              <w:rPr>
+                <w:rFonts w:ascii="Times New Roman" w:hAnsi="Times New Roman" w:cs="Times New Roman" w:eastAsia="Times New Roman"/>
+                <w:sz w:val="20"/>
+              </w:rPr>
+              <w:t xml:space="preserve"/>
+            </w:r>
+          </w:p>
+        </w:tc>
+        <w:tc>
+          <w:tcPr>
+            <w:tcW w:w="900" w:type="dxa"/>
+          </w:tcPr>
+          <w:p>
+            <w:pPr>
+              <w:spacing w:before="0" w:after="0" w:line="240" w:lineRule="auto"/>
+              <w:jc w:val="center"/>
+            </w:pPr>
+            <w:r>
+              <w:rPr>
+                <w:rFonts w:ascii="Times New Roman" w:hAnsi="Times New Roman" w:cs="Times New Roman" w:eastAsia="Times New Roman"/>
+                <w:sz w:val="20"/>
+              </w:rPr>
+              <w:t xml:space="preserve"/>
+            </w:r>
+          </w:p>
+        </w:tc>
+        <w:tc>
+          <w:tcPr>
+            <w:tcW w:w="900" w:type="dxa"/>
+          </w:tcPr>
+          <w:p>
+            <w:pPr>
+              <w:spacing w:before="0" w:after="0" w:line="240" w:lineRule="auto"/>
+              <w:jc w:val="center"/>
+            </w:pPr>
+            <w:r>
+              <w:rPr>
+                <w:rFonts w:ascii="Times New Roman" w:hAnsi="Times New Roman" w:cs="Times New Roman" w:eastAsia="Times New Roman"/>
+                <w:sz w:val="20"/>
+              </w:rPr>
+              <w:t xml:space="preserve">Nov-Dic</w:t>
+            </w:r>
+          </w:p>
+        </w:tc>
+        <w:tc>
+          <w:tcPr>
+            <w:tcW w:w="1000" w:type="dxa"/>
+          </w:tcPr>
+          <w:p>
+            <w:pPr>
+              <w:spacing w:before="0" w:after="0" w:line="240" w:lineRule="auto"/>
+              <w:jc w:val="center"/>
+            </w:pPr>
+            <w:r>
+              <w:rPr>
+                <w:rFonts w:ascii="Times New Roman" w:hAnsi="Times New Roman" w:cs="Times New Roman" w:eastAsia="Times New Roman"/>
+                <w:sz w:val="20"/>
+              </w:rPr>
+              <w:t xml:space="preserve"/>
+            </w:r>
+          </w:p>
+        </w:tc>
+        <w:tc>
+          <w:tcPr>
+            <w:tcW w:w="1100" w:type="dxa"/>
+          </w:tcPr>
+          <w:p>
+            <w:pPr>
+              <w:spacing w:before="0" w:after="0" w:line="240" w:lineRule="auto"/>
+              <w:jc w:val="center"/>
+            </w:pPr>
+            <w:r>
+              <w:rPr>
+                <w:rFonts w:ascii="Times New Roman" w:hAnsi="Times New Roman" w:cs="Times New Roman" w:eastAsia="Times New Roman"/>
+                <w:sz w:val="20"/>
+              </w:rPr>
+              <w:t xml:space="preserve">Pendiente</w:t>
+            </w:r>
+          </w:p>
+        </w:tc>
+      </w:tr>
+      <w:tr>
+        <w:tc>
+          <w:tcPr>
+            <w:tcW w:w="3300" w:type="dxa"/>
+          </w:tcPr>
+          <w:p>
+            <w:pPr>
+              <w:spacing w:before="0" w:after="0" w:line="240" w:lineRule="auto"/>
+              <w:jc w:val="left"/>
+            </w:pPr>
+            <w:r>
+              <w:rPr>
+                <w:rFonts w:ascii="Times New Roman" w:hAnsi="Times New Roman" w:cs="Times New Roman" w:eastAsia="Times New Roman"/>
+                <w:sz w:val="20"/>
+              </w:rPr>
+              <w:t xml:space="preserve">Cálculo de la exposición de las tareas</w:t>
             </w:r>
           </w:p>
         </w:tc>
@@ -3200,7 +2462,7 @@
                 <w:rFonts w:ascii="Times New Roman" w:hAnsi="Times New Roman" w:cs="Times New Roman" w:eastAsia="Times New Roman"/>
                 <w:sz w:val="20"/>
               </w:rPr>
-              <w:t xml:space="preserve">Feb-Mar</w:t>
+              <w:t xml:space="preserve">Ene</w:t>
             </w:r>
           </w:p>
         </w:tc>
@@ -3218,7 +2480,337 @@
                 <w:rFonts w:ascii="Times New Roman" w:hAnsi="Times New Roman" w:cs="Times New Roman" w:eastAsia="Times New Roman"/>
                 <w:sz w:val="20"/>
               </w:rPr>
-              <w:t xml:space="preserve">En curso</w:t>
+              <w:t xml:space="preserve">Pendiente</w:t>
+            </w:r>
+          </w:p>
+        </w:tc>
+      </w:tr>
+      <w:tr>
+        <w:tc>
+          <w:tcPr>
+            <w:tcW w:w="3300" w:type="dxa"/>
+          </w:tcPr>
+          <w:p>
+            <w:pPr>
+              <w:spacing w:before="0" w:after="0" w:line="240" w:lineRule="auto"/>
+              <w:jc w:val="left"/>
+            </w:pPr>
+            <w:r>
+              <w:rPr>
+                <w:rFonts w:ascii="Times New Roman" w:hAnsi="Times New Roman" w:cs="Times New Roman" w:eastAsia="Times New Roman"/>
+                <w:sz w:val="20"/>
+              </w:rPr>
+              <w:t xml:space="preserve">Construcción de trayectorias y matrices de transición</w:t>
+            </w:r>
+          </w:p>
+        </w:tc>
+        <w:tc>
+          <w:tcPr>
+            <w:tcW w:w="900" w:type="dxa"/>
+          </w:tcPr>
+          <w:p>
+            <w:pPr>
+              <w:spacing w:before="0" w:after="0" w:line="240" w:lineRule="auto"/>
+              <w:jc w:val="center"/>
+            </w:pPr>
+            <w:r>
+              <w:rPr>
+                <w:rFonts w:ascii="Times New Roman" w:hAnsi="Times New Roman" w:cs="Times New Roman" w:eastAsia="Times New Roman"/>
+                <w:sz w:val="20"/>
+              </w:rPr>
+              <w:t xml:space="preserve"/>
+            </w:r>
+          </w:p>
+        </w:tc>
+        <w:tc>
+          <w:tcPr>
+            <w:tcW w:w="900" w:type="dxa"/>
+          </w:tcPr>
+          <w:p>
+            <w:pPr>
+              <w:spacing w:before="0" w:after="0" w:line="240" w:lineRule="auto"/>
+              <w:jc w:val="center"/>
+            </w:pPr>
+            <w:r>
+              <w:rPr>
+                <w:rFonts w:ascii="Times New Roman" w:hAnsi="Times New Roman" w:cs="Times New Roman" w:eastAsia="Times New Roman"/>
+                <w:sz w:val="20"/>
+              </w:rPr>
+              <w:t xml:space="preserve"/>
+            </w:r>
+          </w:p>
+        </w:tc>
+        <w:tc>
+          <w:tcPr>
+            <w:tcW w:w="900" w:type="dxa"/>
+          </w:tcPr>
+          <w:p>
+            <w:pPr>
+              <w:spacing w:before="0" w:after="0" w:line="240" w:lineRule="auto"/>
+              <w:jc w:val="center"/>
+            </w:pPr>
+            <w:r>
+              <w:rPr>
+                <w:rFonts w:ascii="Times New Roman" w:hAnsi="Times New Roman" w:cs="Times New Roman" w:eastAsia="Times New Roman"/>
+                <w:sz w:val="20"/>
+              </w:rPr>
+              <w:t xml:space="preserve"/>
+            </w:r>
+          </w:p>
+        </w:tc>
+        <w:tc>
+          <w:tcPr>
+            <w:tcW w:w="1000" w:type="dxa"/>
+          </w:tcPr>
+          <w:p>
+            <w:pPr>
+              <w:spacing w:before="0" w:after="0" w:line="240" w:lineRule="auto"/>
+              <w:jc w:val="center"/>
+            </w:pPr>
+            <w:r>
+              <w:rPr>
+                <w:rFonts w:ascii="Times New Roman" w:hAnsi="Times New Roman" w:cs="Times New Roman" w:eastAsia="Times New Roman"/>
+                <w:sz w:val="20"/>
+              </w:rPr>
+              <w:t xml:space="preserve">Ene-Feb</w:t>
+            </w:r>
+          </w:p>
+        </w:tc>
+        <w:tc>
+          <w:tcPr>
+            <w:tcW w:w="1100" w:type="dxa"/>
+          </w:tcPr>
+          <w:p>
+            <w:pPr>
+              <w:spacing w:before="0" w:after="0" w:line="240" w:lineRule="auto"/>
+              <w:jc w:val="center"/>
+            </w:pPr>
+            <w:r>
+              <w:rPr>
+                <w:rFonts w:ascii="Times New Roman" w:hAnsi="Times New Roman" w:cs="Times New Roman" w:eastAsia="Times New Roman"/>
+                <w:sz w:val="20"/>
+              </w:rPr>
+              <w:t xml:space="preserve">Pendiente</w:t>
+            </w:r>
+          </w:p>
+        </w:tc>
+      </w:tr>
+      <w:tr>
+        <w:tc>
+          <w:tcPr>
+            <w:tcW w:w="3300" w:type="dxa"/>
+          </w:tcPr>
+          <w:p>
+            <w:pPr>
+              <w:spacing w:before="0" w:after="0" w:line="240" w:lineRule="auto"/>
+              <w:jc w:val="left"/>
+            </w:pPr>
+            <w:r>
+              <w:rPr>
+                <w:rFonts w:ascii="Times New Roman" w:hAnsi="Times New Roman" w:cs="Times New Roman" w:eastAsia="Times New Roman"/>
+                <w:sz w:val="20"/>
+              </w:rPr>
+              <w:t xml:space="preserve">Estimación y validación de modelos</w:t>
+            </w:r>
+          </w:p>
+        </w:tc>
+        <w:tc>
+          <w:tcPr>
+            <w:tcW w:w="900" w:type="dxa"/>
+          </w:tcPr>
+          <w:p>
+            <w:pPr>
+              <w:spacing w:before="0" w:after="0" w:line="240" w:lineRule="auto"/>
+              <w:jc w:val="center"/>
+            </w:pPr>
+            <w:r>
+              <w:rPr>
+                <w:rFonts w:ascii="Times New Roman" w:hAnsi="Times New Roman" w:cs="Times New Roman" w:eastAsia="Times New Roman"/>
+                <w:sz w:val="20"/>
+              </w:rPr>
+              <w:t xml:space="preserve"/>
+            </w:r>
+          </w:p>
+        </w:tc>
+        <w:tc>
+          <w:tcPr>
+            <w:tcW w:w="900" w:type="dxa"/>
+          </w:tcPr>
+          <w:p>
+            <w:pPr>
+              <w:spacing w:before="0" w:after="0" w:line="240" w:lineRule="auto"/>
+              <w:jc w:val="center"/>
+            </w:pPr>
+            <w:r>
+              <w:rPr>
+                <w:rFonts w:ascii="Times New Roman" w:hAnsi="Times New Roman" w:cs="Times New Roman" w:eastAsia="Times New Roman"/>
+                <w:sz w:val="20"/>
+              </w:rPr>
+              <w:t xml:space="preserve"/>
+            </w:r>
+          </w:p>
+        </w:tc>
+        <w:tc>
+          <w:tcPr>
+            <w:tcW w:w="900" w:type="dxa"/>
+          </w:tcPr>
+          <w:p>
+            <w:pPr>
+              <w:spacing w:before="0" w:after="0" w:line="240" w:lineRule="auto"/>
+              <w:jc w:val="center"/>
+            </w:pPr>
+            <w:r>
+              <w:rPr>
+                <w:rFonts w:ascii="Times New Roman" w:hAnsi="Times New Roman" w:cs="Times New Roman" w:eastAsia="Times New Roman"/>
+                <w:sz w:val="20"/>
+              </w:rPr>
+              <w:t xml:space="preserve"/>
+            </w:r>
+          </w:p>
+        </w:tc>
+        <w:tc>
+          <w:tcPr>
+            <w:tcW w:w="1000" w:type="dxa"/>
+          </w:tcPr>
+          <w:p>
+            <w:pPr>
+              <w:spacing w:before="0" w:after="0" w:line="240" w:lineRule="auto"/>
+              <w:jc w:val="center"/>
+            </w:pPr>
+            <w:r>
+              <w:rPr>
+                <w:rFonts w:ascii="Times New Roman" w:hAnsi="Times New Roman" w:cs="Times New Roman" w:eastAsia="Times New Roman"/>
+                <w:sz w:val="20"/>
+              </w:rPr>
+              <w:t xml:space="preserve">Feb-Abr</w:t>
+            </w:r>
+          </w:p>
+        </w:tc>
+        <w:tc>
+          <w:tcPr>
+            <w:tcW w:w="1100" w:type="dxa"/>
+          </w:tcPr>
+          <w:p>
+            <w:pPr>
+              <w:spacing w:before="0" w:after="0" w:line="240" w:lineRule="auto"/>
+              <w:jc w:val="center"/>
+            </w:pPr>
+            <w:r>
+              <w:rPr>
+                <w:rFonts w:ascii="Times New Roman" w:hAnsi="Times New Roman" w:cs="Times New Roman" w:eastAsia="Times New Roman"/>
+                <w:sz w:val="20"/>
+              </w:rPr>
+              <w:t xml:space="preserve">Pendiente</w:t>
+            </w:r>
+          </w:p>
+        </w:tc>
+      </w:tr>
+      <w:tr>
+        <w:tc>
+          <w:tcPr>
+            <w:tcW w:w="3300" w:type="dxa"/>
+          </w:tcPr>
+          <w:p>
+            <w:pPr>
+              <w:spacing w:before="0" w:after="0" w:line="240" w:lineRule="auto"/>
+              <w:jc w:val="left"/>
+            </w:pPr>
+            <w:r>
+              <w:rPr>
+                <w:rFonts w:ascii="Times New Roman" w:hAnsi="Times New Roman" w:cs="Times New Roman" w:eastAsia="Times New Roman"/>
+                <w:sz w:val="20"/>
+              </w:rPr>
+              <w:t xml:space="preserve">Red de movilidad y tablero de visualización</w:t>
+            </w:r>
+          </w:p>
+        </w:tc>
+        <w:tc>
+          <w:tcPr>
+            <w:tcW w:w="900" w:type="dxa"/>
+          </w:tcPr>
+          <w:p>
+            <w:pPr>
+              <w:spacing w:before="0" w:after="0" w:line="240" w:lineRule="auto"/>
+              <w:jc w:val="center"/>
+            </w:pPr>
+            <w:r>
+              <w:rPr>
+                <w:rFonts w:ascii="Times New Roman" w:hAnsi="Times New Roman" w:cs="Times New Roman" w:eastAsia="Times New Roman"/>
+                <w:sz w:val="20"/>
+              </w:rPr>
+              <w:t xml:space="preserve"/>
+            </w:r>
+          </w:p>
+        </w:tc>
+        <w:tc>
+          <w:tcPr>
+            <w:tcW w:w="900" w:type="dxa"/>
+          </w:tcPr>
+          <w:p>
+            <w:pPr>
+              <w:spacing w:before="0" w:after="0" w:line="240" w:lineRule="auto"/>
+              <w:jc w:val="center"/>
+            </w:pPr>
+            <w:r>
+              <w:rPr>
+                <w:rFonts w:ascii="Times New Roman" w:hAnsi="Times New Roman" w:cs="Times New Roman" w:eastAsia="Times New Roman"/>
+                <w:sz w:val="20"/>
+              </w:rPr>
+              <w:t xml:space="preserve"/>
+            </w:r>
+          </w:p>
+        </w:tc>
+        <w:tc>
+          <w:tcPr>
+            <w:tcW w:w="900" w:type="dxa"/>
+          </w:tcPr>
+          <w:p>
+            <w:pPr>
+              <w:spacing w:before="0" w:after="0" w:line="240" w:lineRule="auto"/>
+              <w:jc w:val="center"/>
+            </w:pPr>
+            <w:r>
+              <w:rPr>
+                <w:rFonts w:ascii="Times New Roman" w:hAnsi="Times New Roman" w:cs="Times New Roman" w:eastAsia="Times New Roman"/>
+                <w:sz w:val="20"/>
+              </w:rPr>
+              <w:t xml:space="preserve"/>
+            </w:r>
+          </w:p>
+        </w:tc>
+        <w:tc>
+          <w:tcPr>
+            <w:tcW w:w="1000" w:type="dxa"/>
+          </w:tcPr>
+          <w:p>
+            <w:pPr>
+              <w:spacing w:before="0" w:after="0" w:line="240" w:lineRule="auto"/>
+              <w:jc w:val="center"/>
+            </w:pPr>
+            <w:r>
+              <w:rPr>
+                <w:rFonts w:ascii="Times New Roman" w:hAnsi="Times New Roman" w:cs="Times New Roman" w:eastAsia="Times New Roman"/>
+                <w:sz w:val="20"/>
+              </w:rPr>
+              <w:t xml:space="preserve">Abr-May</w:t>
+            </w:r>
+          </w:p>
+        </w:tc>
+        <w:tc>
+          <w:tcPr>
+            <w:tcW w:w="1100" w:type="dxa"/>
+          </w:tcPr>
+          <w:p>
+            <w:pPr>
+              <w:spacing w:before="0" w:after="0" w:line="240" w:lineRule="auto"/>
+              <w:jc w:val="center"/>
+            </w:pPr>
+            <w:r>
+              <w:rPr>
+                <w:rFonts w:ascii="Times New Roman" w:hAnsi="Times New Roman" w:cs="Times New Roman" w:eastAsia="Times New Roman"/>
+                <w:sz w:val="20"/>
+              </w:rPr>
+              <w:t xml:space="preserve">Pendiente</w:t>
             </w:r>
           </w:p>
         </w:tc>
@@ -3310,7 +2902,7 @@
                 <w:rFonts w:ascii="Times New Roman" w:hAnsi="Times New Roman" w:cs="Times New Roman" w:eastAsia="Times New Roman"/>
                 <w:sz w:val="20"/>
               </w:rPr>
-              <w:t xml:space="preserve">Mar-Jun</w:t>
+              <w:t xml:space="preserve">May-Jun</w:t>
             </w:r>
           </w:p>
         </w:tc>
@@ -3486,7 +3078,7 @@
           <w:sz w:val="24"/>
           <w:szCs w:val="24"/>
         </w:rPr>
-        <w:t xml:space="preserve">Acemoglu, D., &amp; Restrepo, P. (2018). The race between man and machine: Implications of technology for growth, factor shares, and employment. American Economic Review, 108(6), 1488-1542. https://doi.org/10.1257/aer.20160696</w:t>
+        <w:t xml:space="preserve">Acemoglu, D., Autor, D., Hazell, J., &amp; Restrepo, P. (2022). Artificial intelligence and jobs: Evidence from online vacancies. Journal of Labor Economics, 40(S1), S293-S340. https://doi.org/10.1086/718327</w:t>
       </w:r>
     </w:p>
     <w:p>
@@ -3516,7 +3108,7 @@
           <w:sz w:val="24"/>
           <w:szCs w:val="24"/>
         </w:rPr>
-        <w:t xml:space="preserve">Acemoglu, D., &amp; Restrepo, P. (2020). Robots and jobs: Evidence from US labor markets. Journal of Political Economy, 128(6), 2188-2244. https://doi.org/10.1086/705716</w:t>
+        <w:t xml:space="preserve">Autor, D. H., Levy, F., &amp; Murnane, R. J. (2003). The skill content of recent technological change: An empirical exploration. The Quarterly Journal of Economics, 118(4), 1279-1333. https://doi.org/10.1162/003355303322552801</w:t>
       </w:r>
     </w:p>
     <w:p>
@@ -3531,7 +3123,7 @@
           <w:sz w:val="24"/>
           <w:szCs w:val="24"/>
         </w:rPr>
-        <w:t xml:space="preserve">Artuc, E., Christiaensen, L., &amp; Winkler, H. (2019). Does automation in rich countries hurt developing ones? Evidence from the U.S. and Mexico (Policy Research Working Paper 8741). Banco Mundial.</w:t>
+        <w:t xml:space="preserve">Broady, K. E., Dunson, C., &amp; Barr, A. (2026). Rethinking automation risk: AI applicability and occupational outcomes, 2019-24 (Working Paper 2026-12). Federal Reserve Bank of Chicago. https://doi.org/10.21033/wp-2026-12</w:t>
       </w:r>
     </w:p>
     <w:p>
@@ -3546,7 +3138,7 @@
           <w:sz w:val="24"/>
           <w:szCs w:val="24"/>
         </w:rPr>
-        <w:t xml:space="preserve">Autor, D. H., Levy, F., &amp; Murnane, R. J. (2003). The skill content of recent technological change: An empirical exploration. The Quarterly Journal of Economics, 118(4), 1279-1333. https://doi.org/10.1162/003355303322552801</w:t>
+        <w:t xml:space="preserve">Brynjolfsson, E., Chandar, B., &amp; Chen, R. (2026). Canaries in the coal mine? Six facts about the recent employment effects of artificial intelligence [Documento de trabajo, versión de agosto de 2026]. Stanford Digital Economy Lab. https://digitaleconomy.stanford.edu/publications/canaries-in-the-coal-mine/</w:t>
       </w:r>
     </w:p>
     <w:p>
@@ -3561,7 +3153,7 @@
           <w:sz w:val="24"/>
           <w:szCs w:val="24"/>
         </w:rPr>
-        <w:t xml:space="preserve">Azuara, O., Ripani, L., &amp; Torres, E. (2024). AI and the increase of productivity and labor inequality in Latin America: Potential impact of large language models on Latin American workforce (IDB Discussion Paper 01076). Banco Interamericano de Desarrollo.</w:t>
+        <w:t xml:space="preserve">Chen, N., Li, Z., &amp; Tang, B. (2022). Can digital skill protect against job displacement risk caused by artificial intelligence? Empirical evidence from 701 detailed occupations. PLOS ONE, 17(11), e0277280. https://doi.org/10.1371/journal.pone.0277280</w:t>
       </w:r>
     </w:p>
     <w:p>
@@ -3576,7 +3168,7 @@
           <w:sz w:val="24"/>
           <w:szCs w:val="24"/>
         </w:rPr>
-        <w:t xml:space="preserve">Banco de México. (2022). Opinión empresarial sobre la relocalización de las empresas hacia México (Recuadro 2). En Reporte sobre las economías regionales, abril-junio 2022 (pp. 16-21). https://www.banxico.org.mx/publicaciones-y-prensa/reportes-sobre-las-economias-regionales/recuadros/%7BE243D1D1-63F5-6C86-38F0-28BD3CF33CE6%7D.pdf</w:t>
+        <w:t xml:space="preserve">Dahlin, E. (2024). Who says artificial intelligence is stealing our jobs? Socius, 10. https://doi.org/10.1177/23780231241259672</w:t>
       </w:r>
     </w:p>
     <w:p>
@@ -3591,7 +3183,7 @@
           <w:sz w:val="24"/>
           <w:szCs w:val="24"/>
         </w:rPr>
-        <w:t xml:space="preserve">Benítez-Rueda, M., &amp; Parrado, E. (2024). “Mirror, mirror on the wall: Which jobs will AI replace after all?”: A new index of occupational exposure (IDB Working Paper 1624). Banco Interamericano de Desarrollo.</w:t>
+        <w:t xml:space="preserve">del Rio-Chanona, R. M., Mealy, P., Beguerisse-Díaz, M., Lafond, F., &amp; Farmer, J. D. (2021). Occupational mobility and automation: A data-driven network model. Journal of the Royal Society Interface, 18(174), 20200898. https://doi.org/10.1098/rsif.2020.0898</w:t>
       </w:r>
     </w:p>
     <w:p>
@@ -3606,7 +3198,7 @@
           <w:sz w:val="24"/>
           <w:szCs w:val="24"/>
         </w:rPr>
-        <w:t xml:space="preserve">Brynjolfsson, E., Rock, D., &amp; Syverson, C. (2021). The productivity J-curve: How intangibles complement general purpose technologies. American Economic Journal: Macroeconomics, 13(1), 333-372. https://doi.org/10.1257/mac.20180386</w:t>
+        <w:t xml:space="preserve">Eloundou, T., Manning, S., Mishkin, P., &amp; Rock, D. (2023). GPTs are GPTs: An early look at the labor market impact potential of large language models. arXiv. https://arxiv.org/abs/2303.10130</w:t>
       </w:r>
     </w:p>
     <w:p>
@@ -3621,7 +3213,7 @@
           <w:sz w:val="24"/>
           <w:szCs w:val="24"/>
         </w:rPr>
-        <w:t xml:space="preserve">Eloundou, T., Manning, S., Mishkin, P., &amp; Rock, D. (2023). GPTs are GPTs: An early look at the labor market impact potential of large language models. arXiv. https://arxiv.org/abs/2303.10130</w:t>
+        <w:t xml:space="preserve">Felten, E., Raj, M., &amp; Seamans, R. (2023). How will language modelers like ChatGPT affect occupations and industries? arXiv. https://arxiv.org/abs/2303.01157</w:t>
       </w:r>
     </w:p>
     <w:p>
@@ -3636,7 +3228,7 @@
           <w:sz w:val="24"/>
           <w:szCs w:val="24"/>
         </w:rPr>
-        <w:t xml:space="preserve">Epoch AI. (s.f.). Datos sobre el desempeño de modelos de inteligencia artificial en pruebas de referencia [Base de datos]. https://epoch.ai/data</w:t>
+        <w:t xml:space="preserve">Frank, M. R., Ahn, Y.-Y., &amp; Moro, E. (2025). AI exposure predicts unemployment risk: A new approach to technology-driven job loss. PNAS Nexus, 4(4), pgaf107. https://doi.org/10.1093/pnasnexus/pgaf107</w:t>
       </w:r>
     </w:p>
     <w:p>
@@ -3651,7 +3243,7 @@
           <w:sz w:val="24"/>
           <w:szCs w:val="24"/>
         </w:rPr>
-        <w:t xml:space="preserve">Faber, M. (2020). Robots and reshoring: Evidence from Mexican labor markets. Journal of International Economics, 127, 103384. https://doi.org/10.1016/j.jinteco.2020.103384</w:t>
+        <w:t xml:space="preserve">Frey, C. B., &amp; Osborne, M. A. (2017). The future of employment: How susceptible are jobs to computerisation? Technological Forecasting and Social Change, 114, 254-280. https://doi.org/10.1016/j.techfore.2016.08.019</w:t>
       </w:r>
     </w:p>
     <w:p>
@@ -3666,7 +3258,7 @@
           <w:sz w:val="24"/>
           <w:szCs w:val="24"/>
         </w:rPr>
-        <w:t xml:space="preserve">Felten, E., Raj, M., &amp; Seamans, R. (2021). Occupational, industry, and geographic exposure to artificial intelligence: A novel dataset and its potential uses. Strategic Management Journal, 42(12), 2195-2217. https://doi.org/10.1002/smj.3286</w:t>
+        <w:t xml:space="preserve">Gao, S., &amp; Huang, M. (2026). Bounded by risk, not capability: Quantifying AI occupational substitution rates via a tech-risk dual-factor model. arXiv. https://doi.org/10.48550/arXiv.2604.04464</w:t>
       </w:r>
     </w:p>
     <w:p>
@@ -3681,7 +3273,7 @@
           <w:sz w:val="24"/>
           <w:szCs w:val="24"/>
         </w:rPr>
-        <w:t xml:space="preserve">Felten, E., Raj, M., &amp; Seamans, R. (2023). How will language modelers like ChatGPT affect occupations and industries? arXiv. https://arxiv.org/abs/2303.01157</w:t>
+        <w:t xml:space="preserve">Georgieff, A., &amp; Hyee, R. (2022). Artificial intelligence and employment: New cross-country evidence. Frontiers in Artificial Intelligence, 5, 832736. https://doi.org/10.3389/frai.2022.832736</w:t>
       </w:r>
     </w:p>
     <w:p>
@@ -3696,7 +3288,7 @@
           <w:sz w:val="24"/>
           <w:szCs w:val="24"/>
         </w:rPr>
-        <w:t xml:space="preserve">Frey, C. B., &amp; Osborne, M. A. (2017). The future of employment: How susceptible are jobs to computerisation? Technological Forecasting and Social Change, 114, 254-280. https://doi.org/10.1016/j.techfore.2016.08.019</w:t>
+        <w:t xml:space="preserve">Handa, K., Tamkin, A., McCain, M., Huang, S., Durmus, E., Heck, S., Mueller, J., Hong, J., Ritchie, S., Belonax, T., Troy, K. K., Amodei, D., Kaplan, J., Clark, J., &amp; Ganguli, D. (2025). Which economic tasks are performed with AI? Evidence from millions of Claude conversations. arXiv. https://arxiv.org/abs/2503.04761</w:t>
       </w:r>
     </w:p>
     <w:p>
@@ -3711,7 +3303,7 @@
           <w:sz w:val="24"/>
           <w:szCs w:val="24"/>
         </w:rPr>
-        <w:t xml:space="preserve">Gmyrek, P., Berg, J., &amp; Bescond, D. (2023). Generative AI and jobs: A global analysis of potential effects on job quantity and quality (ILO Working Paper 96). Organización Internacional del Trabajo. https://doi.org/10.54394/FHEM8239</w:t>
+        <w:t xml:space="preserve">Instituto Nacional de Estadística y Geografía. (2019). Sistema Nacional de Clasificación de Ocupaciones (SINCO) 2019. INEGI.</w:t>
       </w:r>
     </w:p>
     <w:p>
@@ -3726,7 +3318,7 @@
           <w:sz w:val="24"/>
           <w:szCs w:val="24"/>
         </w:rPr>
-        <w:t xml:space="preserve">Graetz, G., &amp; Michaels, G. (2018). Robots at work. The Review of Economics and Statistics, 100(5), 753-768. https://doi.org/10.1162/rest_a_00754</w:t>
+        <w:t xml:space="preserve">Instituto Nacional de Estadística y Geografía. (2025). Encuesta Nacional de Ocupación y Empleo 2025, cuestionario ampliado, primer trimestre [Metadatos y bases de datos]. Red Nacional de Metadatos. https://www.inegi.org.mx/rnm/index.php/catalog/1104</w:t>
       </w:r>
     </w:p>
     <w:p>
@@ -3741,7 +3333,7 @@
           <w:sz w:val="24"/>
           <w:szCs w:val="24"/>
         </w:rPr>
-        <w:t xml:space="preserve">Handa, K., Tamkin, A., McCain, M., Huang, S., Durmus, E., Heck, S., Mueller, J., Hong, J., Ritchie, S., Belonax, T., Troy, K. K., Amodei, D., Kaplan, J., Clark, J., &amp; Ganguli, D. (2025). Which economic tasks are performed with AI? Evidence from millions of Claude conversations. arXiv. https://arxiv.org/abs/2503.04761</w:t>
+        <w:t xml:space="preserve">Kambourov, G., &amp; Manovskii, I. (2008). Rising occupational and industry mobility in the United States: 1968-97. International Economic Review, 49(1), 41-79. https://doi.org/10.1111/j.1468-2354.2008.00473.x</w:t>
       </w:r>
     </w:p>
     <w:p>
@@ -3756,7 +3348,7 @@
           <w:sz w:val="24"/>
           <w:szCs w:val="24"/>
         </w:rPr>
-        <w:t xml:space="preserve">Instituto Nacional de Estadística y Geografía. (2011). Sistema Nacional de Clasificación de Ocupaciones (SINCO). INEGI.</w:t>
+        <w:t xml:space="preserve">Meng, Q., Zhu, H., Xiao, K., Zhang, L., &amp; Xiong, H. (2019). A hierarchical career-path-aware neural network for job mobility prediction. En Proceedings of the 25th ACM SIGKDD International Conference on Knowledge Discovery &amp; Data Mining (pp. 14-24). ACM. https://doi.org/10.1145/3292500.3330969</w:t>
       </w:r>
     </w:p>
     <w:p>
@@ -3771,7 +3363,7 @@
           <w:sz w:val="24"/>
           <w:szCs w:val="24"/>
         </w:rPr>
-        <w:t xml:space="preserve">Instituto Nacional de Estadística y Geografía. (2025). Encuesta Nacional de Ocupación y Empleo (ENOE), Jalisco: Cuarto trimestre de 2024 (Boletín de indicador 110/25). https://www.inegi.org.mx/contenidos/saladeprensa/boletines/2025/enoe/enoe2025_02_Jal.pdf</w:t>
+        <w:t xml:space="preserve">National Center for O*NET Development. (2024). O*NET 28.3 Database [Base de datos]. U.S. Department of Labor. https://www.onetcenter.org/database.html</w:t>
       </w:r>
     </w:p>
     <w:p>
@@ -3786,7 +3378,7 @@
           <w:sz w:val="24"/>
           <w:szCs w:val="24"/>
         </w:rPr>
-        <w:t xml:space="preserve">Instituto Nacional de Estadística y Geografía. (s.f.). Censos Económicos [Programa de información]. https://www.inegi.org.mx/programas/ce/</w:t>
+        <w:t xml:space="preserve">Paolillo, A., Colella, F., Nosengo, N., Schiano, F., Stewart, W., Zambrano, D., Chappuis, I., Lalive, R., &amp; Floreano, D. (2022). How to compete with robots by assessing job automation risks and resilient alternatives. Science Robotics, 7(65), eabg5561. https://doi.org/10.1126/scirobotics.abg5561</w:t>
       </w:r>
     </w:p>
     <w:p>
@@ -3801,112 +3393,7 @@
           <w:sz w:val="24"/>
           <w:szCs w:val="24"/>
         </w:rPr>
-        <w:t xml:space="preserve">International Federation of Robotics. (2025). World Robotics 2025: Industrial robots [Resumen ejecutivo]. IFR.</w:t>
-      </w:r>
-    </w:p>
-    <w:p>
-      <w:pPr>
-        <w:spacing w:before="0" w:after="0" w:line="360" w:lineRule="auto"/>
-        <w:ind w:left="709" w:hanging="709"/>
-        <w:jc w:val="left"/>
-      </w:pPr>
-      <w:r>
-        <w:rPr>
-          <w:rFonts w:ascii="Times New Roman" w:hAnsi="Times New Roman" w:cs="Times New Roman" w:eastAsia="Times New Roman"/>
-          <w:sz w:val="24"/>
-          <w:szCs w:val="24"/>
-        </w:rPr>
-        <w:t xml:space="preserve">Maloney, W. F., &amp; Molina, C. (2019). Is automation labor-displacing in the developing countries, too? Robots, polarization, and jobs (Policy Research Working Paper). Banco Mundial. https://doi.org/10.1596/33301</w:t>
-      </w:r>
-    </w:p>
-    <w:p>
-      <w:pPr>
-        <w:spacing w:before="0" w:after="0" w:line="360" w:lineRule="auto"/>
-        <w:ind w:left="709" w:hanging="709"/>
-        <w:jc w:val="left"/>
-      </w:pPr>
-      <w:r>
-        <w:rPr>
-          <w:rFonts w:ascii="Times New Roman" w:hAnsi="Times New Roman" w:cs="Times New Roman" w:eastAsia="Times New Roman"/>
-          <w:sz w:val="24"/>
-          <w:szCs w:val="24"/>
-        </w:rPr>
-        <w:t xml:space="preserve">Márquez Stone, V., &amp; Sandoval Cabrera, S. V. (2024). Effects of automation on Mexican automotive employment: 2013-2022. The Indian Journal of Labour Economics. https://doi.org/10.1007/s41027-024-00505-5</w:t>
-      </w:r>
-    </w:p>
-    <w:p>
-      <w:pPr>
-        <w:spacing w:before="0" w:after="0" w:line="360" w:lineRule="auto"/>
-        <w:ind w:left="709" w:hanging="709"/>
-        <w:jc w:val="left"/>
-      </w:pPr>
-      <w:r>
-        <w:rPr>
-          <w:rFonts w:ascii="Times New Roman" w:hAnsi="Times New Roman" w:cs="Times New Roman" w:eastAsia="Times New Roman"/>
-          <w:sz w:val="24"/>
-          <w:szCs w:val="24"/>
-        </w:rPr>
-        <w:t xml:space="preserve">Merino, F., Di Stefano, C., &amp; Fratocchi, L. (2021). Back-shoring vs near-shoring: A comparative exploratory study in the footwear industry. Operations Management Research, 14(1-2), 17-37. https://doi.org/10.1007/s12063-020-00173-w</w:t>
-      </w:r>
-    </w:p>
-    <w:p>
-      <w:pPr>
-        <w:spacing w:before="0" w:after="0" w:line="360" w:lineRule="auto"/>
-        <w:ind w:left="709" w:hanging="709"/>
-        <w:jc w:val="left"/>
-      </w:pPr>
-      <w:r>
-        <w:rPr>
-          <w:rFonts w:ascii="Times New Roman" w:hAnsi="Times New Roman" w:cs="Times New Roman" w:eastAsia="Times New Roman"/>
-          <w:sz w:val="24"/>
-          <w:szCs w:val="24"/>
-        </w:rPr>
-        <w:t xml:space="preserve">National Center for O*NET Development. (2024). O*NET 28.3 Database [Base de datos]. U.S. Department of Labor. https://www.onetcenter.org/database.html</w:t>
-      </w:r>
-    </w:p>
-    <w:p>
-      <w:pPr>
-        <w:spacing w:before="0" w:after="0" w:line="360" w:lineRule="auto"/>
-        <w:ind w:left="709" w:hanging="709"/>
-        <w:jc w:val="left"/>
-      </w:pPr>
-      <w:r>
-        <w:rPr>
-          <w:rFonts w:ascii="Times New Roman" w:hAnsi="Times New Roman" w:cs="Times New Roman" w:eastAsia="Times New Roman"/>
-          <w:sz w:val="24"/>
-          <w:szCs w:val="24"/>
-        </w:rPr>
-        <w:t xml:space="preserve">Secretaría de Economía. (2025). Inversión extranjera directa en México: Cuarto trimestre de 2024 [Informe]. Gobierno de México. https://www.gob.mx/cms/uploads/attachment/file/980231/20250225_IED_4T_2024_Versi_n_p_blica_VF.pdf</w:t>
-      </w:r>
-    </w:p>
-    <w:p>
-      <w:pPr>
-        <w:spacing w:before="0" w:after="0" w:line="360" w:lineRule="auto"/>
-        <w:ind w:left="709" w:hanging="709"/>
-        <w:jc w:val="left"/>
-      </w:pPr>
-      <w:r>
-        <w:rPr>
-          <w:rFonts w:ascii="Times New Roman" w:hAnsi="Times New Roman" w:cs="Times New Roman" w:eastAsia="Times New Roman"/>
-          <w:sz w:val="24"/>
-          <w:szCs w:val="24"/>
-        </w:rPr>
         <w:t xml:space="preserve">Vaswani, A., Shazeer, N., Parmar, N., Uszkoreit, J., Jones, L., Gomez, A. N., Kaiser, Ł., &amp; Polosukhin, I. (2017). Attention is all you need. Advances in Neural Information Processing Systems, 30. https://arxiv.org/abs/1706.03762</w:t>
-      </w:r>
-    </w:p>
-    <w:p>
-      <w:pPr>
-        <w:spacing w:before="0" w:after="0" w:line="360" w:lineRule="auto"/>
-        <w:ind w:left="709" w:hanging="709"/>
-        <w:jc w:val="left"/>
-      </w:pPr>
-      <w:r>
-        <w:rPr>
-          <w:rFonts w:ascii="Times New Roman" w:hAnsi="Times New Roman" w:cs="Times New Roman" w:eastAsia="Times New Roman"/>
-          <w:sz w:val="24"/>
-          <w:szCs w:val="24"/>
-        </w:rPr>
-        <w:t xml:space="preserve">Webb, M. (2020). The impact of artificial intelligence on the labor market [Documento de trabajo]. Stanford University. https://www.michaelwebb.co/webb_ai.pdf</w:t>
       </w:r>
     </w:p>
     <w:p>
@@ -3958,7 +3445,7 @@
 <w:ftr xmlns:wpc="http://schemas.microsoft.com/office/word/2010/wordprocessingCanvas" xmlns:cx="http://schemas.microsoft.com/office/drawing/2014/chartex" xmlns:cx1="http://schemas.microsoft.com/office/drawing/2015/9/8/chartex" xmlns:cx2="http://schemas.microsoft.com/office/drawing/2015/10/21/chartex" xmlns:cx3="http://schemas.microsoft.com/office/drawing/2016/5/9/chartex" xmlns:cx4="http://schemas.microsoft.com/office/drawing/2016/5/10/chartex" xmlns:cx5="http://schemas.microsoft.com/office/drawing/2016/5/11/chartex" xmlns:cx6="http://schemas.microsoft.com/office/drawing/2016/5/12/chartex" xmlns:cx7="http://schemas.microsoft.com/office/drawing/2016/5/13/chartex" xmlns:cx8="http://schemas.microsoft.com/office/drawing/2016/5/14/chartex" xmlns:mc="http://schemas.openxmlformats.org/markup-compatibility/2006" xmlns:aink="http://schemas.microsoft.com/office/drawing/2016/ink" xmlns:am3d="http://schemas.microsoft.com/office/drawing/2017/model3d" xmlns:o="urn:schemas-microsoft-com:office:office" xmlns:oel="http://schemas.microsoft.com/office/2019/extlst" xmlns:r="http://schemas.openxmlformats.org/officeDocument/2006/relationships" xmlns:m="http://schemas.openxmlformats.org/officeDocument/2006/math" xmlns:v="urn:schemas-microsoft-com:vml" xmlns:wp14="http://schemas.microsoft.com/office/word/2010/wordprocessingDrawing" xmlns:wp="http://schemas.openxmlformats.org/drawingml/2006/wordprocessingDrawing" xmlns:w10="urn:schemas-microsoft-com:office:word" xmlns:w="http://schemas.openxmlformats.org/wordprocessingml/2006/main" xmlns:w14="http://schemas.microsoft.com/office/word/2010/wordml" xmlns:w15="http://schemas.microsoft.com/office/word/2012/wordml" xmlns:w16cex="http://schemas.microsoft.com/office/word/2018/wordml/cex" xmlns:w16cid="http://schemas.microsoft.com/office/word/2016/wordml/cid" xmlns:w16="http://schemas.microsoft.com/office/word/2018/wordml" xmlns:w16du="http://schemas.microsoft.com/office/word/2023/wordml/word16du" xmlns:w16sdtdh="http://schemas.microsoft.com/office/word/2020/wordml/sdtdatahash" xmlns:w16sdtfl="http://schemas.microsoft.com/office/word/2024/wordml/sdtformatlock" xmlns:w16se="http://schemas.microsoft.com/office/word/2015/wordml/symex" xmlns:wpg="http://schemas.microsoft.com/office/word/2010/wordprocessingGroup" xmlns:wpi="http://schemas.microsoft.com/office/word/2010/wordprocessingInk" xmlns:wne="http://schemas.microsoft.com/office/word/2006/wordml" xmlns:wps="http://schemas.microsoft.com/office/word/2010/wordprocessingShape" mc:Ignorable="w14 w15 w16se w16cid w16 w16cex w16sdtdh w16sdtfl w16du wp14">
   <w:p>
     <w:pPr>
-      <w:pStyle w:val="Piedepgina"/>
+      <w:pStyle w:val="Footer"/>
       <w:jc w:val="center"/>
     </w:pPr>
   </w:p>
@@ -3969,7 +3456,7 @@
 <w:ftr xmlns:wpc="http://schemas.microsoft.com/office/word/2010/wordprocessingCanvas" xmlns:cx="http://schemas.microsoft.com/office/drawing/2014/chartex" xmlns:cx1="http://schemas.microsoft.com/office/drawing/2015/9/8/chartex" xmlns:cx2="http://schemas.microsoft.com/office/drawing/2015/10/21/chartex" xmlns:cx3="http://schemas.microsoft.com/office/drawing/2016/5/9/chartex" xmlns:cx4="http://schemas.microsoft.com/office/drawing/2016/5/10/chartex" xmlns:cx5="http://schemas.microsoft.com/office/drawing/2016/5/11/chartex" xmlns:cx6="http://schemas.microsoft.com/office/drawing/2016/5/12/chartex" xmlns:cx7="http://schemas.microsoft.com/office/drawing/2016/5/13/chartex" xmlns:cx8="http://schemas.microsoft.com/office/drawing/2016/5/14/chartex" xmlns:mc="http://schemas.openxmlformats.org/markup-compatibility/2006" xmlns:aink="http://schemas.microsoft.com/office/drawing/2016/ink" xmlns:am3d="http://schemas.microsoft.com/office/drawing/2017/model3d" xmlns:o="urn:schemas-microsoft-com:office:office" xmlns:oel="http://schemas.microsoft.com/office/2019/extlst" xmlns:r="http://schemas.openxmlformats.org/officeDocument/2006/relationships" xmlns:m="http://schemas.openxmlformats.org/officeDocument/2006/math" xmlns:v="urn:schemas-microsoft-com:vml" xmlns:wp14="http://schemas.microsoft.com/office/word/2010/wordprocessingDrawing" xmlns:wp="http://schemas.openxmlformats.org/drawingml/2006/wordprocessingDrawing" xmlns:w10="urn:schemas-microsoft-com:office:word" xmlns:w="http://schemas.openxmlformats.org/wordprocessingml/2006/main" xmlns:w14="http://schemas.microsoft.com/office/word/2010/wordml" xmlns:w15="http://schemas.microsoft.com/office/word/2012/wordml" xmlns:w16cex="http://schemas.microsoft.com/office/word/2018/wordml/cex" xmlns:w16cid="http://schemas.microsoft.com/office/word/2016/wordml/cid" xmlns:w16="http://schemas.microsoft.com/office/word/2018/wordml" xmlns:w16du="http://schemas.microsoft.com/office/word/2023/wordml/word16du" xmlns:w16sdtdh="http://schemas.microsoft.com/office/word/2020/wordml/sdtdatahash" xmlns:w16sdtfl="http://schemas.microsoft.com/office/word/2024/wordml/sdtformatlock" xmlns:w16se="http://schemas.microsoft.com/office/word/2015/wordml/symex" xmlns:wpg="http://schemas.microsoft.com/office/word/2010/wordprocessingGroup" xmlns:wpi="http://schemas.microsoft.com/office/word/2010/wordprocessingInk" xmlns:wne="http://schemas.microsoft.com/office/word/2006/wordml" xmlns:wps="http://schemas.microsoft.com/office/word/2010/wordprocessingShape" mc:Ignorable="w14 w15 w16se w16cid w16 w16cex w16sdtdh w16sdtfl w16du wp14">
   <w:p>
     <w:pPr>
-      <w:pStyle w:val="Textoindependiente"/>
+      <w:pStyle w:val="BodyText"/>
       <w:spacing w:line="14" w:lineRule="auto"/>
       <w:rPr>
         <w:sz w:val="20"/>
@@ -4118,7 +3605,7 @@
                       <w:txbxContent>
                         <w:p>
                           <w:pPr>
-                            <w:pStyle w:val="Textoindependiente"/>
+                            <w:pStyle w:val="BodyText"/>
                             <w:spacing w:line="264" w:lineRule="exact"/>
                             <w:ind w:left="60"/>
                             <w:rPr>
@@ -4165,13 +3652,13 @@
             </wp:anchor>
           </w:drawing>
         </mc:Choice>
-        <mc:Fallback xmlns="">
+        <mc:Fallback>
           <w:pict>
             <v:shapetype w14:anchorId="4A6E72AA" id="_x0000_t202" coordsize="21600,21600" o:spt="202" path="m,l,21600r21600,l21600,xe">
               <v:stroke joinstyle="miter"/>
               <v:path gradientshapeok="t" o:connecttype="rect"/>
             </v:shapetype>
-            <v:shape id="Text Box 1" o:spid="_x0000_s1026" type="#_x0000_t202" style="position:absolute;margin-left:519.55pt;margin-top:754.9pt;width:12.1pt;height:14pt;z-index:-251657728;visibility:visible;mso-wrap-style:square;mso-width-percent:0;mso-height-percent:0;mso-wrap-distance-left:9pt;mso-wrap-distance-top:0;mso-wrap-distance-right:9pt;mso-wrap-distance-bottom:0;mso-position-horizontal:absolute;mso-position-horizontal-relative:page;mso-position-vertical:absolute;mso-position-vertical-relative:page;mso-width-percent:0;mso-height-percent:0;mso-width-relative:page;mso-height-relative:page;v-text-anchor:top" o:gfxdata="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" filled="f" stroked="f">
+            <v:shape id="Text Box 1" o:spid="_x0000_s1026" type="#_x0000_t202" style="position:absolute;margin-left:519.55pt;margin-top:754.9pt;width:12.1pt;height:14pt;z-index:-251657728;visibility:visible;mso-wrap-style:square;mso-width-percent:0;mso-height-percent:0;mso-wrap-distance-left:9pt;mso-wrap-distance-top:0;mso-wrap-distance-right:9pt;mso-wrap-distance-bottom:0;mso-position-horizontal:absolute;mso-position-horizontal-relative:page;mso-position-vertical:absolute;mso-position-vertical-relative:page;mso-width-percent:0;mso-height-percent:0;mso-width-relative:page;mso-height-relative:page;v-text-anchor:top" o:gfxdata="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" filled="f" stroked="f">
               <v:path arrowok="t"/>
               <v:textbox inset="0,0,0,0">
                 <w:txbxContent>
@@ -9468,7 +8955,7 @@
       <w:rFonts w:ascii="Arial" w:eastAsia="Arial" w:hAnsi="Arial" w:cs="Arial"/>
     </w:rPr>
   </w:style>
-  <w:style w:type="paragraph" w:styleId="Ttulo1">
+  <w:style w:type="paragraph" w:styleId="Heading1">
     <w:name w:val="heading 1"/>
     <w:basedOn w:val="Normal"/>
     <w:uiPriority w:val="1"/>
@@ -9482,13 +8969,13 @@
       <w:bCs/>
     </w:rPr>
   </w:style>
-  <w:style w:type="character" w:default="1" w:styleId="Fuentedeprrafopredeter">
+  <w:style w:type="character" w:default="1" w:styleId="DefaultParagraphFont">
     <w:name w:val="Default Paragraph Font"/>
     <w:uiPriority w:val="1"/>
     <w:semiHidden/>
     <w:unhideWhenUsed/>
   </w:style>
-  <w:style w:type="table" w:default="1" w:styleId="Tablanormal">
+  <w:style w:type="table" w:default="1" w:styleId="TableNormal">
     <w:name w:val="Normal Table"/>
     <w:uiPriority w:val="99"/>
     <w:semiHidden/>
@@ -9503,14 +8990,14 @@
       </w:tblCellMar>
     </w:tblPr>
   </w:style>
-  <w:style w:type="numbering" w:default="1" w:styleId="Sinlista">
+  <w:style w:type="numbering" w:default="1" w:styleId="NoList">
     <w:name w:val="No List"/>
     <w:uiPriority w:val="99"/>
     <w:semiHidden/>
     <w:unhideWhenUsed/>
   </w:style>
-  <w:style w:type="table" w:customStyle="1" w:styleId="TableNormal">
-    <w:name w:val="Table Normal"/>
+  <w:style w:type="table" w:customStyle="1" w:styleId="TableNormal1">
+    <w:name w:val="Table Normal1"/>
     <w:uiPriority w:val="2"/>
     <w:semiHidden/>
     <w:unhideWhenUsed/>
@@ -9525,13 +9012,13 @@
       </w:tblCellMar>
     </w:tblPr>
   </w:style>
-  <w:style w:type="paragraph" w:styleId="Textoindependiente">
+  <w:style w:type="paragraph" w:styleId="BodyText">
     <w:name w:val="Body Text"/>
     <w:basedOn w:val="Normal"/>
     <w:uiPriority w:val="1"/>
     <w:qFormat/>
   </w:style>
-  <w:style w:type="paragraph" w:styleId="Prrafodelista">
+  <w:style w:type="paragraph" w:styleId="ListParagraph">
     <w:name w:val="List Paragraph"/>
     <w:basedOn w:val="Normal"/>
     <w:uiPriority w:val="1"/>
@@ -9546,10 +9033,10 @@
     <w:uiPriority w:val="1"/>
     <w:qFormat/>
   </w:style>
-  <w:style w:type="paragraph" w:styleId="Textodeglobo">
+  <w:style w:type="paragraph" w:styleId="BalloonText">
     <w:name w:val="Balloon Text"/>
     <w:basedOn w:val="Normal"/>
-    <w:link w:val="TextodegloboCar"/>
+    <w:link w:val="BalloonTextChar"/>
     <w:uiPriority w:val="99"/>
     <w:semiHidden/>
     <w:unhideWhenUsed/>
@@ -9560,10 +9047,10 @@
       <w:szCs w:val="18"/>
     </w:rPr>
   </w:style>
-  <w:style w:type="character" w:customStyle="1" w:styleId="TextodegloboCar">
-    <w:name w:val="Texto de globo Car"/>
-    <w:basedOn w:val="Fuentedeprrafopredeter"/>
-    <w:link w:val="Textodeglobo"/>
+  <w:style w:type="character" w:customStyle="1" w:styleId="BalloonTextChar">
+    <w:name w:val="Balloon Text Char"/>
+    <w:basedOn w:val="DefaultParagraphFont"/>
+    <w:link w:val="BalloonText"/>
     <w:uiPriority w:val="99"/>
     <w:semiHidden/>
     <w:rsid w:val="0088111C"/>
@@ -9573,10 +9060,10 @@
       <w:szCs w:val="18"/>
     </w:rPr>
   </w:style>
-  <w:style w:type="paragraph" w:styleId="Encabezado">
+  <w:style w:type="paragraph" w:styleId="Header">
     <w:name w:val="header"/>
     <w:basedOn w:val="Normal"/>
-    <w:link w:val="EncabezadoCar"/>
+    <w:link w:val="HeaderChar"/>
     <w:uiPriority w:val="99"/>
     <w:unhideWhenUsed/>
     <w:rsid w:val="00E75D08"/>
@@ -9587,20 +9074,20 @@
       </w:tabs>
     </w:pPr>
   </w:style>
-  <w:style w:type="character" w:customStyle="1" w:styleId="EncabezadoCar">
-    <w:name w:val="Encabezado Car"/>
-    <w:basedOn w:val="Fuentedeprrafopredeter"/>
-    <w:link w:val="Encabezado"/>
+  <w:style w:type="character" w:customStyle="1" w:styleId="HeaderChar">
+    <w:name w:val="Header Char"/>
+    <w:basedOn w:val="DefaultParagraphFont"/>
+    <w:link w:val="Header"/>
     <w:uiPriority w:val="99"/>
     <w:rsid w:val="00E75D08"/>
     <w:rPr>
       <w:rFonts w:ascii="Arial" w:eastAsia="Arial" w:hAnsi="Arial" w:cs="Arial"/>
     </w:rPr>
   </w:style>
-  <w:style w:type="paragraph" w:styleId="Piedepgina">
+  <w:style w:type="paragraph" w:styleId="Footer">
     <w:name w:val="footer"/>
     <w:basedOn w:val="Normal"/>
-    <w:link w:val="PiedepginaCar"/>
+    <w:link w:val="FooterChar"/>
     <w:uiPriority w:val="99"/>
     <w:unhideWhenUsed/>
     <w:rsid w:val="00E75D08"/>
@@ -9611,19 +9098,19 @@
       </w:tabs>
     </w:pPr>
   </w:style>
-  <w:style w:type="character" w:customStyle="1" w:styleId="PiedepginaCar">
-    <w:name w:val="Pie de página Car"/>
-    <w:basedOn w:val="Fuentedeprrafopredeter"/>
-    <w:link w:val="Piedepgina"/>
+  <w:style w:type="character" w:customStyle="1" w:styleId="FooterChar">
+    <w:name w:val="Footer Char"/>
+    <w:basedOn w:val="DefaultParagraphFont"/>
+    <w:link w:val="Footer"/>
     <w:uiPriority w:val="99"/>
     <w:rsid w:val="00E75D08"/>
     <w:rPr>
       <w:rFonts w:ascii="Arial" w:eastAsia="Arial" w:hAnsi="Arial" w:cs="Arial"/>
     </w:rPr>
   </w:style>
-  <w:style w:type="character" w:styleId="Hipervnculo">
+  <w:style w:type="character" w:styleId="Hyperlink">
     <w:name w:val="Hyperlink"/>
-    <w:basedOn w:val="Fuentedeprrafopredeter"/>
+    <w:basedOn w:val="DefaultParagraphFont"/>
     <w:uiPriority w:val="99"/>
     <w:unhideWhenUsed/>
     <w:rsid w:val="00E53AAA"/>
@@ -9632,9 +9119,9 @@
       <w:u w:val="single"/>
     </w:rPr>
   </w:style>
-  <w:style w:type="character" w:styleId="Mencinsinresolver">
+  <w:style w:type="character" w:styleId="UnresolvedMention">
     <w:name w:val="Unresolved Mention"/>
-    <w:basedOn w:val="Fuentedeprrafopredeter"/>
+    <w:basedOn w:val="DefaultParagraphFont"/>
     <w:uiPriority w:val="99"/>
     <w:semiHidden/>
     <w:unhideWhenUsed/>
@@ -9644,9 +9131,9 @@
       <w:shd w:val="clear" w:color="auto" w:fill="E1DFDD"/>
     </w:rPr>
   </w:style>
-  <w:style w:type="character" w:styleId="Hipervnculovisitado">
+  <w:style w:type="character" w:styleId="FollowedHyperlink">
     <w:name w:val="FollowedHyperlink"/>
-    <w:basedOn w:val="Fuentedeprrafopredeter"/>
+    <w:basedOn w:val="DefaultParagraphFont"/>
     <w:uiPriority w:val="99"/>
     <w:semiHidden/>
     <w:unhideWhenUsed/>

</xml_diff>

<commit_message>
Protocolo: apply advisor review (no identification section, informatics and data science careers, Khan and Varshney 2026)
</commit_message>
<xml_diff>
--- a/3er-semestre/desarrollo-proyecto-i/tareas/Protocolo/Protocolo_Investigacion_CarlosPulidoRosas.docx
+++ b/3er-semestre/desarrollo-proyecto-i/tareas/Protocolo/Protocolo_Investigacion_CarlosPulidoRosas.docx
@@ -267,7 +267,7 @@
           <w:sz w:val="28"/>
           <w:lang w:val="es-ES"/>
         </w:rPr>
-        <w:t>Modelo de ciencia de datos para evaluar el riesgo de movilidad laboral por modelos de inteligencia artificial: caso de estudio de ingeniería informática</w:t>
+        <w:t>Modelo de ciencia de datos para evaluar el riesgo de movilidad laboral por modelos de inteligencia artificial: carreras de informática y ciencia de datos</w:t>
       </w:r>
     </w:p>
     <w:p>
@@ -691,7 +691,7 @@
     <w:p>
       <w:pPr>
         <w:keepNext/>
-        <w:spacing w:before="0" w:after="240" w:line="480" w:lineRule="auto"/>
+        <w:spacing w:before="240" w:after="120" w:line="480" w:lineRule="auto"/>
         <w:jc w:val="center"/>
       </w:pPr>
       <w:r>
@@ -701,7 +701,235 @@
           <w:sz w:val="28"/>
           <w:szCs w:val="28"/>
         </w:rPr>
-        <w:t xml:space="preserve">Protocolo de investigación</w:t>
+        <w:t xml:space="preserve">I. PLANTEAMIENTO DEL PROBLEMA</w:t>
+      </w:r>
+    </w:p>
+    <w:p>
+      <w:pPr>
+        <w:keepNext/>
+        <w:spacing w:before="240" w:after="0" w:line="480" w:lineRule="auto"/>
+        <w:jc w:val="left"/>
+      </w:pPr>
+      <w:r>
+        <w:rPr>
+          <w:rFonts w:ascii="Times New Roman" w:hAnsi="Times New Roman" w:cs="Times New Roman" w:eastAsia="Times New Roman"/>
+          <w:b/>
+          <w:sz w:val="24"/>
+          <w:szCs w:val="24"/>
+        </w:rPr>
+        <w:t xml:space="preserve">1.1. Contexto</w:t>
+      </w:r>
+    </w:p>
+    <w:p>
+      <w:pPr>
+        <w:spacing w:before="0" w:after="0" w:line="480" w:lineRule="auto"/>
+        <w:ind w:firstLine="709"/>
+        <w:jc w:val="both"/>
+      </w:pPr>
+      <w:r>
+        <w:rPr>
+          <w:rFonts w:ascii="Times New Roman" w:hAnsi="Times New Roman" w:cs="Times New Roman" w:eastAsia="Times New Roman"/>
+          <w:sz w:val="24"/>
+          <w:szCs w:val="24"/>
+        </w:rPr>
+        <w:t xml:space="preserve">Los modelos de lenguaje de gran escala son sistemas de inteligencia artificial capaces de comprender y generar texto y código, y se definen formalmente en el marco teórico. Su difusión a partir de 2022 reabrió la pregunta de qué ocurre con el empleo cuando una tecnología puede realizar tareas cognitivas que antes solo hacían las personas. Eloundou et al. (2023) estimaron que alrededor del 80 % de los trabajadores de Estados Unidos podría ver afectado al menos el 10 % de sus tareas por estos modelos, y que cerca del 19 % podría ver afectada al menos la mitad. En otras palabras, la exposición alcanza a casi todas las ocupaciones, pero solo en una de cada cinco toca la mayor parte del trabajo.</w:t>
+      </w:r>
+    </w:p>
+    <w:p>
+      <w:pPr>
+        <w:spacing w:before="0" w:after="0" w:line="480" w:lineRule="auto"/>
+        <w:ind w:firstLine="709"/>
+        <w:jc w:val="both"/>
+      </w:pPr>
+      <w:r>
+        <w:rPr>
+          <w:rFonts w:ascii="Times New Roman" w:hAnsi="Times New Roman" w:cs="Times New Roman" w:eastAsia="Times New Roman"/>
+          <w:sz w:val="24"/>
+          <w:szCs w:val="24"/>
+        </w:rPr>
+        <w:t xml:space="preserve">Las ocupaciones relacionadas con la informática y el análisis de datos están entre las más involucradas. En el análisis de millones de conversaciones con el asistente Claude, las ocupaciones de computación y matemáticas concentraron el 37.2 % de todas las consultas, la proporción más alta de cualquier grupo ocupacional, y el 57 % de los usos mostró un patrón de aumento de las capacidades humanas más que de automatización (Handa et al., 2025). Es decir, más de un tercio del uso observado de esta herramienta proviene de tareas de informática y matemáticas, y en la mayoría de los casos el modelo trabaja junto con la persona en lugar de reemplazarla. Gao y Huang (2026), por su parte, calcularon un índice relativo de automatización ocupacional para Estados Unidos y encontraron que los puestos cognitivos no rutinarios que dependen de la manipulación de símbolos son los más vulnerables; los científicos de datos encabezan ese índice, con un valor cercano a 0.70.</w:t>
+      </w:r>
+    </w:p>
+    <w:p>
+      <w:pPr>
+        <w:spacing w:before="0" w:after="0" w:line="480" w:lineRule="auto"/>
+        <w:ind w:firstLine="709"/>
+        <w:jc w:val="both"/>
+      </w:pPr>
+      <w:r>
+        <w:rPr>
+          <w:rFonts w:ascii="Times New Roman" w:hAnsi="Times New Roman" w:cs="Times New Roman" w:eastAsia="Times New Roman"/>
+          <w:sz w:val="24"/>
+          <w:szCs w:val="24"/>
+        </w:rPr>
+        <w:t xml:space="preserve">Sin embargo, una exposición alta no se ha traducido en pérdidas generales de empleo. Acemoglu et al. (2022) encontraron, con las vacantes publicadas en línea en Estados Unidos desde 2010, que los establecimientos que adoptan inteligencia artificial reducen sus contrataciones en puestos no relacionados con ella y cambian los requisitos de habilidades de las vacantes que mantienen, aunque el efecto todavía es demasiado pequeño para observarse en el empleo agregado. Broady et al. (2026) mostraron que, entre 2019 y 2024, las ocupaciones con mayor aplicabilidad de la inteligencia artificial aumentaron su empleo y sus salarios, por lo que proponen leer la exposición como un indicador de reestructuración de las ocupaciones y no como un pronóstico de pérdida de empleo.</w:t>
+      </w:r>
+    </w:p>
+    <w:p>
+      <w:pPr>
+        <w:spacing w:before="0" w:after="0" w:line="480" w:lineRule="auto"/>
+        <w:ind w:firstLine="709"/>
+        <w:jc w:val="both"/>
+      </w:pPr>
+      <w:r>
+        <w:rPr>
+          <w:rFonts w:ascii="Times New Roman" w:hAnsi="Times New Roman" w:cs="Times New Roman" w:eastAsia="Times New Roman"/>
+          <w:sz w:val="24"/>
+          <w:szCs w:val="24"/>
+        </w:rPr>
+        <w:t xml:space="preserve">Donde sí aparece un cambio es en la entrada al mercado de trabajo. Con registros de nómina de millones de trabajadores de Estados Unidos, Brynjolfsson et al. (2026) encontraron que el empleo de los jóvenes de 22 a 25 años en ocupaciones expuestas a la inteligencia artificial se encuentra 19 % por debajo de donde estaría si hubiera crecido al mismo ritmo que el de sus pares en ocupaciones menos expuestas, sin una brecha comparable entre los trabajadores con más experiencia. Los autores precisan que la diferencia se explica sobre todo por menos contrataciones de jóvenes y no por más despidos, y analizan el desarrollo de software como uno de sus casos de estudio. Este resultado sugiere que el efecto de la tecnología se manifiesta en quién entra, quién sale y hacia dónde se mueven los trabajadores, más que en la desaparición de las ocupaciones.</w:t>
+      </w:r>
+    </w:p>
+    <w:p>
+      <w:pPr>
+        <w:keepNext/>
+        <w:spacing w:before="240" w:after="0" w:line="480" w:lineRule="auto"/>
+        <w:jc w:val="left"/>
+      </w:pPr>
+      <w:r>
+        <w:rPr>
+          <w:rFonts w:ascii="Times New Roman" w:hAnsi="Times New Roman" w:cs="Times New Roman" w:eastAsia="Times New Roman"/>
+          <w:b/>
+          <w:sz w:val="24"/>
+          <w:szCs w:val="24"/>
+        </w:rPr>
+        <w:t xml:space="preserve">1.2. Definición del problema</w:t>
+      </w:r>
+    </w:p>
+    <w:p>
+      <w:pPr>
+        <w:spacing w:before="0" w:after="0" w:line="480" w:lineRule="auto"/>
+        <w:ind w:firstLine="709"/>
+        <w:jc w:val="both"/>
+      </w:pPr>
+      <w:r>
+        <w:rPr>
+          <w:rFonts w:ascii="Times New Roman" w:hAnsi="Times New Roman" w:cs="Times New Roman" w:eastAsia="Times New Roman"/>
+          <w:sz w:val="24"/>
+          <w:szCs w:val="24"/>
+        </w:rPr>
+        <w:t xml:space="preserve">La mayoría de los estudios sobre inteligencia artificial y empleo miden la exposición de cada ocupación en un momento dado, pero no siguen a los trabajadores. Frank et al. (2025) mostraron, con datos mensuales de desempleo por ocupación de cada estado de Estados Unidos entre 2010 y 2020, que ningún índice de exposición por sí solo predice bien el riesgo de desempleo; solo al combinarlos se explica un 18 % adicional de la variación del riesgo de desempleo entre ocupaciones, estados y periodos, respecto a un modelo que ya considera la escolaridad, las habilidades, la estacionalidad y la región. Dicho de otro modo, saber que una ocupación está expuesta no basta para saber qué les pasará a quienes trabajan en ella.</w:t>
+      </w:r>
+    </w:p>
+    <w:p>
+      <w:pPr>
+        <w:spacing w:before="0" w:after="0" w:line="480" w:lineRule="auto"/>
+        <w:ind w:firstLine="709"/>
+        <w:jc w:val="both"/>
+      </w:pPr>
+      <w:r>
+        <w:rPr>
+          <w:rFonts w:ascii="Times New Roman" w:hAnsi="Times New Roman" w:cs="Times New Roman" w:eastAsia="Times New Roman"/>
+          <w:sz w:val="24"/>
+          <w:szCs w:val="24"/>
+        </w:rPr>
+        <w:t xml:space="preserve">Del Rio-Chanona et al. (2021) plantean el problema desde otro ángulo: cuando la automatización afecta a una ocupación, el resultado para sus trabajadores depende de cuántas ocupaciones cercanas existen hacia donde puedan moverse. Con un modelo de red de movilidad ocupacional, encontraron que las ocupaciones ubicadas en zonas de la red con pocas opciones de transición tienen más riesgo de desempleo de largo plazo. Por su parte, Georgieff y Hyee (2022) encontraron, para 23 países de la OCDE, que en las ocupaciones con uso intensivo de computadora una mayor exposición a la inteligencia artificial se asocia con un mayor crecimiento del empleo, y Chen et al. (2022) mostraron, con 701 ocupaciones de Estados Unidos, que las habilidades digitales moderan el efecto negativo del riesgo de desplazamiento sobre los salarios y el empleo.</w:t>
+      </w:r>
+    </w:p>
+    <w:p>
+      <w:pPr>
+        <w:spacing w:before="0" w:after="0" w:line="480" w:lineRule="auto"/>
+        <w:ind w:firstLine="709"/>
+        <w:jc w:val="both"/>
+      </w:pPr>
+      <w:r>
+        <w:rPr>
+          <w:rFonts w:ascii="Times New Roman" w:hAnsi="Times New Roman" w:cs="Times New Roman" w:eastAsia="Times New Roman"/>
+          <w:sz w:val="24"/>
+          <w:szCs w:val="24"/>
+        </w:rPr>
+        <w:t xml:space="preserve">Estos trabajos coinciden en que el riesgo relevante no es solo el de perder el empleo, sino el de verse obligado a cambiar de ocupación, de empleador o de condición laboral, y en que ese riesgo depende de las habilidades del trabajador y de las rutas de transición disponibles. Además, como muestran Khan y Varshney (2026), estimar ese riesgo implica medir también su incertidumbre, porque en sus resultados el error de predicción es mayor justamente en las ocupaciones de riesgo alto. Sin embargo, estos estudios se basan en datos de Estados Unidos o de países de la OCDE. En México no se ha medido cómo se mueven las personas que estudiaron una carrera de informática o de ciencia de datos, o que trabajan en esas ocupaciones, desde la llegada de los modelos de lenguaje, ni si esa movilidad es distinta para quienes empiezan su carrera profesional.</w:t>
+      </w:r>
+    </w:p>
+    <w:p>
+      <w:pPr>
+        <w:spacing w:before="0" w:after="0" w:line="480" w:lineRule="auto"/>
+        <w:ind w:firstLine="709"/>
+        <w:jc w:val="both"/>
+      </w:pPr>
+      <w:r>
+        <w:rPr>
+          <w:rFonts w:ascii="Times New Roman" w:hAnsi="Times New Roman" w:cs="Times New Roman" w:eastAsia="Times New Roman"/>
+          <w:sz w:val="24"/>
+          <w:szCs w:val="24"/>
+        </w:rPr>
+        <w:t xml:space="preserve">En consecuencia, el problema de investigación es la falta de un modelo que permita evaluar, con datos de México, el riesgo de movilidad laboral que enfrentan las personas formadas o empleadas en informática y ciencia de datos ante los modelos de inteligencia artificial, es decir, con qué probabilidad cambian de ocupación, quedan desocupadas o salen del mercado de trabajo, hacia qué ocupaciones se mueven, qué características aumentan o reducen ese riesgo y cómo difiere entre carreras.</w:t>
+      </w:r>
+    </w:p>
+    <w:p>
+      <w:pPr>
+        <w:keepNext/>
+        <w:spacing w:before="240" w:after="0" w:line="480" w:lineRule="auto"/>
+        <w:jc w:val="left"/>
+      </w:pPr>
+      <w:r>
+        <w:rPr>
+          <w:rFonts w:ascii="Times New Roman" w:hAnsi="Times New Roman" w:cs="Times New Roman" w:eastAsia="Times New Roman"/>
+          <w:b/>
+          <w:sz w:val="24"/>
+          <w:szCs w:val="24"/>
+        </w:rPr>
+        <w:t xml:space="preserve">1.3. Preguntas de investigación</w:t>
+      </w:r>
+    </w:p>
+    <w:p>
+      <w:pPr>
+        <w:spacing w:before="0" w:after="0" w:line="480" w:lineRule="auto"/>
+        <w:ind w:firstLine="709"/>
+        <w:jc w:val="both"/>
+      </w:pPr>
+      <w:r>
+        <w:rPr>
+          <w:rFonts w:ascii="Times New Roman" w:hAnsi="Times New Roman" w:cs="Times New Roman" w:eastAsia="Times New Roman"/>
+          <w:sz w:val="24"/>
+          <w:szCs w:val="24"/>
+        </w:rPr>
+        <w:t xml:space="preserve">Pregunta general: ¿cómo se relaciona la exposición a los modelos de inteligencia artificial con la movilidad laboral de las personas formadas o empleadas en informática y ciencia de datos en México?</w:t>
+      </w:r>
+    </w:p>
+    <w:p>
+      <w:pPr>
+        <w:spacing w:before="0" w:after="0" w:line="480" w:lineRule="auto"/>
+        <w:ind w:left="709"/>
+        <w:jc w:val="both"/>
+      </w:pPr>
+      <w:r>
+        <w:rPr>
+          <w:rFonts w:ascii="Times New Roman" w:hAnsi="Times New Roman" w:cs="Times New Roman" w:eastAsia="Times New Roman"/>
+          <w:sz w:val="24"/>
+          <w:szCs w:val="24"/>
+        </w:rPr>
+        <w:t xml:space="preserve">1. ¿Qué tareas de las ocupaciones de informática y ciencia de datos están más expuestas a los modelos de inteligencia artificial?</w:t>
+      </w:r>
+    </w:p>
+    <w:p>
+      <w:pPr>
+        <w:spacing w:before="0" w:after="0" w:line="480" w:lineRule="auto"/>
+        <w:ind w:left="709"/>
+        <w:jc w:val="both"/>
+      </w:pPr>
+      <w:r>
+        <w:rPr>
+          <w:rFonts w:ascii="Times New Roman" w:hAnsi="Times New Roman" w:cs="Times New Roman" w:eastAsia="Times New Roman"/>
+          <w:sz w:val="24"/>
+          <w:szCs w:val="24"/>
+        </w:rPr>
+        <w:t xml:space="preserve">2. ¿Con qué frecuencia estas personas cambian de ocupación, quedan desocupadas o salen del mercado de trabajo, hacia qué ocupaciones se mueven y cómo cambió esa movilidad después de 2022?</w:t>
+      </w:r>
+    </w:p>
+    <w:p>
+      <w:pPr>
+        <w:spacing w:before="0" w:after="0" w:line="480" w:lineRule="auto"/>
+        <w:ind w:left="709"/>
+        <w:jc w:val="both"/>
+      </w:pPr>
+      <w:r>
+        <w:rPr>
+          <w:rFonts w:ascii="Times New Roman" w:hAnsi="Times New Roman" w:cs="Times New Roman" w:eastAsia="Times New Roman"/>
+          <w:sz w:val="24"/>
+          <w:szCs w:val="24"/>
+        </w:rPr>
+        <w:t xml:space="preserve">3. ¿Cómo difiere el riesgo de movilidad entre carreras y qué características de la persona, como la edad, la experiencia y la escolaridad, se asocian con un riesgo mayor?</w:t>
       </w:r>
     </w:p>
     <w:p>
@@ -717,7 +945,7 @@
           <w:sz w:val="28"/>
           <w:szCs w:val="28"/>
         </w:rPr>
-        <w:t xml:space="preserve">I. DATOS DE IDENTIFICACIÓN Y TÍTULO</w:t>
+        <w:t xml:space="preserve">II. JUSTIFICACIÓN</w:t>
       </w:r>
     </w:p>
     <w:p>
@@ -732,7 +960,7 @@
           <w:sz w:val="24"/>
           <w:szCs w:val="24"/>
         </w:rPr>
-        <w:t xml:space="preserve">Título: Modelo de ciencia de datos para evaluar el riesgo de movilidad laboral por modelos de inteligencia artificial: caso de estudio de ingeniería informática.</w:t>
+        <w:t xml:space="preserve">Relevancia social. Si el efecto de la inteligencia artificial se concentra en la entrada al mercado de trabajo, como sugieren Brynjolfsson et al. (2026), quienes más lo resentirían serían los egresados recientes de carreras de informática y ciencia de datos, que buscan su primer empleo en las ocupaciones más expuestas. Un modelo que compare el riesgo de movilidad entre carreras serviría a los estudiantes que eligen una carrera universitaria y a las instituciones que diseñan sus planes de estudio.</w:t>
       </w:r>
     </w:p>
     <w:p>
@@ -747,7 +975,7 @@
           <w:sz w:val="24"/>
           <w:szCs w:val="24"/>
         </w:rPr>
-        <w:t xml:space="preserve">Alumno: Carlos Pulido Rosas. Programa: Maestría en Ciencia de los Datos, Centro Universitario de Ciencias Económico Administrativas, Universidad de Guadalajara. Generación 2025-2027, modalidad ejecutiva. Unidad de aprendizaje: Desarrollo de Proyecto I, impartida por la Dra. Ana Rosa Jiménez Meza. Director de tesis: por designar. Línea de generación y aplicación del conocimiento: Smart Data (LGAC 2), por el uso de técnicas de aprendizaje automatizado y analítica de datos.</w:t>
+        <w:t xml:space="preserve">Relevancia práctica. Los resultados permitirán identificar qué ocupaciones reciben a las personas que salen de la informática y la ciencia de datos, y qué habilidades facilitan esas transiciones. Paolillo et al. (2022) mostraron que es posible identificar, para cada ocupación, alternativas que reducen el riesgo de automatización con un esfuerzo de reentrenamiento moderado; un análisis similar con datos mexicanos serviría a universidades, empleadores y trabajadores para orientar la capacitación.</w:t>
       </w:r>
     </w:p>
     <w:p>
@@ -762,7 +990,22 @@
           <w:sz w:val="24"/>
           <w:szCs w:val="24"/>
         </w:rPr>
-        <w:t xml:space="preserve">El título responde a las tres preguntas que pide la guía. Qué se pretende hacer: evaluar el riesgo de movilidad laboral que generan los modelos de inteligencia artificial, es decir, la probabilidad de que un trabajador cambie de ocupación, quede desocupado o salga del mercado de trabajo como consecuencia de esa tecnología. Con qué herramientas: un modelo de ciencia de datos que combina medidas de exposición de las tareas a la inteligencia artificial con el seguimiento de las trayectorias laborales de los trabajadores. En dónde: en las ocupaciones de ingeniería informática en México.</w:t>
+        <w:t xml:space="preserve">Aportación a la ciencia. El proyecto propone medir la movilidad laboral asociada a la inteligencia artificial siguiendo a las mismas personas en el tiempo, en lugar de comparar fotografías de la exposición en distintos años. Frank et al. (2025) muestran que la exposición por sí sola es un mal predictor de lo que ocurre con el empleo, por lo que observar las transiciones reales aporta una medida más directa del riesgo. Además, incorporar la incertidumbre de la estimación, como proponen Khan y Varshney (2026), permitiría distinguir los casos en los que el modelo es confiable de aquellos en los que no lo es.</w:t>
+      </w:r>
+    </w:p>
+    <w:p>
+      <w:pPr>
+        <w:spacing w:before="0" w:after="0" w:line="480" w:lineRule="auto"/>
+        <w:ind w:firstLine="709"/>
+        <w:jc w:val="both"/>
+      </w:pPr>
+      <w:r>
+        <w:rPr>
+          <w:rFonts w:ascii="Times New Roman" w:hAnsi="Times New Roman" w:cs="Times New Roman" w:eastAsia="Times New Roman"/>
+          <w:sz w:val="24"/>
+          <w:szCs w:val="24"/>
+        </w:rPr>
+        <w:t xml:space="preserve">Viabilidad. Las fuentes de información son públicas y gratuitas. La Encuesta Nacional de Ocupación y Empleo (ENOE) del INEGI tiene un diseño de panel rotatorio: la muestra se divide en cinco paneles y cada vivienda permanece en la encuesta durante cinco trimestres, de modo que en cada trimestre se mantiene el 80 % de la muestra (INEGI, 2025). Esto significa que una misma persona se entrevista hasta cinco veces seguidas, lo que permite observar si cambió de ocupación o de condición laboral entre un trimestre y otro. La encuesta registra además la carrera que estudió cada persona mediante un código de carrera (INEGI, 2025), y la ocupación con el Sistema Nacional de Clasificación de Ocupaciones (INEGI, 2019). Las tareas de cada ocupación pueden obtenerse de la base O*NET (National Center for O*NET Development, 2024).</w:t>
       </w:r>
     </w:p>
     <w:p>
@@ -778,7 +1021,7 @@
           <w:sz w:val="28"/>
           <w:szCs w:val="28"/>
         </w:rPr>
-        <w:t xml:space="preserve">II. PLANTEAMIENTO DEL PROBLEMA</w:t>
+        <w:t xml:space="preserve">III. OBJETIVOS</w:t>
       </w:r>
     </w:p>
     <w:p>
@@ -794,7 +1037,7 @@
           <w:sz w:val="24"/>
           <w:szCs w:val="24"/>
         </w:rPr>
-        <w:t xml:space="preserve">2.1. Contexto</w:t>
+        <w:t xml:space="preserve">3.1. Objetivo general</w:t>
       </w:r>
     </w:p>
     <w:p>
@@ -809,7 +1052,114 @@
           <w:sz w:val="24"/>
           <w:szCs w:val="24"/>
         </w:rPr>
-        <w:t xml:space="preserve">Los modelos de lenguaje de gran escala, que se definen formalmente en el marco teórico, son sistemas de inteligencia artificial capaces de comprender y generar texto y código. Su difusión a partir de 2022 reabrió la pregunta de qué ocurre con el empleo cuando una tecnología puede realizar tareas cognitivas que antes solo hacían las personas. Eloundou et al. (2023) estimaron que alrededor del 80 % de los trabajadores de Estados Unidos podría ver afectado al menos el 10 % de sus tareas por estos modelos, y que cerca del 19 % podría ver afectada al menos la mitad. En otras palabras, la exposición no se limita a unas cuantas ocupaciones, pero solo en una de cada cinco alcanza a la mayor parte del trabajo.</w:t>
+        <w:t xml:space="preserve">Evaluar el riesgo de movilidad laboral de las personas formadas o empleadas en informática y ciencia de datos en México frente a los modelos de inteligencia artificial, mediante un modelo de ciencia de datos que relacione la exposición de las tareas con las transiciones laborales observadas y permita comparar ese riesgo entre carreras.</w:t>
+      </w:r>
+    </w:p>
+    <w:p>
+      <w:pPr>
+        <w:keepNext/>
+        <w:spacing w:before="240" w:after="0" w:line="480" w:lineRule="auto"/>
+        <w:jc w:val="left"/>
+      </w:pPr>
+      <w:r>
+        <w:rPr>
+          <w:rFonts w:ascii="Times New Roman" w:hAnsi="Times New Roman" w:cs="Times New Roman" w:eastAsia="Times New Roman"/>
+          <w:b/>
+          <w:sz w:val="24"/>
+          <w:szCs w:val="24"/>
+        </w:rPr>
+        <w:t xml:space="preserve">3.2. Objetivos específicos</w:t>
+      </w:r>
+    </w:p>
+    <w:p>
+      <w:pPr>
+        <w:spacing w:before="0" w:after="0" w:line="480" w:lineRule="auto"/>
+        <w:ind w:left="709"/>
+        <w:jc w:val="both"/>
+      </w:pPr>
+      <w:r>
+        <w:rPr>
+          <w:rFonts w:ascii="Times New Roman" w:hAnsi="Times New Roman" w:cs="Times New Roman" w:eastAsia="Times New Roman"/>
+          <w:sz w:val="24"/>
+          <w:szCs w:val="24"/>
+        </w:rPr>
+        <w:t xml:space="preserve">1. Delimitar las carreras de informática y ciencia de datos en la Clasificación Mexicana de Planes de Estudio y las ocupaciones correspondientes en el Sistema Nacional de Clasificación de Ocupaciones, y caracterizar a estas personas con la ENOE.</w:t>
+      </w:r>
+    </w:p>
+    <w:p>
+      <w:pPr>
+        <w:spacing w:before="0" w:after="0" w:line="480" w:lineRule="auto"/>
+        <w:ind w:left="709"/>
+        <w:jc w:val="both"/>
+      </w:pPr>
+      <w:r>
+        <w:rPr>
+          <w:rFonts w:ascii="Times New Roman" w:hAnsi="Times New Roman" w:cs="Times New Roman" w:eastAsia="Times New Roman"/>
+          <w:sz w:val="24"/>
+          <w:szCs w:val="24"/>
+        </w:rPr>
+        <w:t xml:space="preserve">2. Medir la exposición de las tareas de esas ocupaciones a los modelos de inteligencia artificial a partir de O*NET y de índices de exposición publicados.</w:t>
+      </w:r>
+    </w:p>
+    <w:p>
+      <w:pPr>
+        <w:spacing w:before="0" w:after="0" w:line="480" w:lineRule="auto"/>
+        <w:ind w:left="709"/>
+        <w:jc w:val="both"/>
+      </w:pPr>
+      <w:r>
+        <w:rPr>
+          <w:rFonts w:ascii="Times New Roman" w:hAnsi="Times New Roman" w:cs="Times New Roman" w:eastAsia="Times New Roman"/>
+          <w:sz w:val="24"/>
+          <w:szCs w:val="24"/>
+        </w:rPr>
+        <w:t xml:space="preserve">3. Construir las trayectorias trimestrales con el panel de la ENOE y estimar matrices de transición entre ocupaciones y condiciones laborales, antes y después de 2022.</w:t>
+      </w:r>
+    </w:p>
+    <w:p>
+      <w:pPr>
+        <w:spacing w:before="0" w:after="0" w:line="480" w:lineRule="auto"/>
+        <w:ind w:left="709"/>
+        <w:jc w:val="both"/>
+      </w:pPr>
+      <w:r>
+        <w:rPr>
+          <w:rFonts w:ascii="Times New Roman" w:hAnsi="Times New Roman" w:cs="Times New Roman" w:eastAsia="Times New Roman"/>
+          <w:sz w:val="24"/>
+          <w:szCs w:val="24"/>
+        </w:rPr>
+        <w:t xml:space="preserve">4. Estimar modelos que expliquen el riesgo de movilidad en función de la exposición, la carrera y las características de la persona, cuantificar la incertidumbre de sus estimaciones y evaluar su desempeño.</w:t>
+      </w:r>
+    </w:p>
+    <w:p>
+      <w:pPr>
+        <w:spacing w:before="0" w:after="0" w:line="480" w:lineRule="auto"/>
+        <w:ind w:left="709"/>
+        <w:jc w:val="both"/>
+      </w:pPr>
+      <w:r>
+        <w:rPr>
+          <w:rFonts w:ascii="Times New Roman" w:hAnsi="Times New Roman" w:cs="Times New Roman" w:eastAsia="Times New Roman"/>
+          <w:sz w:val="24"/>
+          <w:szCs w:val="24"/>
+        </w:rPr>
+        <w:t xml:space="preserve">5. Identificar las ocupaciones de destino y presentar el riesgo de movilidad por carrera en un tablero de visualización.</w:t>
+      </w:r>
+    </w:p>
+    <w:p>
+      <w:pPr>
+        <w:keepNext/>
+        <w:spacing w:before="240" w:after="120" w:line="480" w:lineRule="auto"/>
+        <w:jc w:val="center"/>
+      </w:pPr>
+      <w:r>
+        <w:rPr>
+          <w:rFonts w:ascii="Times New Roman" w:hAnsi="Times New Roman" w:cs="Times New Roman" w:eastAsia="Times New Roman"/>
+          <w:b/>
+          <w:sz w:val="28"/>
+          <w:szCs w:val="28"/>
+        </w:rPr>
+        <w:t xml:space="preserve">IV. HIPÓTESIS</w:t>
       </w:r>
     </w:p>
     <w:p>
@@ -824,7 +1174,7 @@
           <w:sz w:val="24"/>
           <w:szCs w:val="24"/>
         </w:rPr>
-        <w:t xml:space="preserve">Las ocupaciones relacionadas con la informática están entre las más involucradas. En el análisis de millones de conversaciones con el asistente Claude, las ocupaciones de computación y matemáticas concentraron el 37.2 % de todas las consultas, la proporción más alta de cualquier grupo ocupacional, y el 57 % de los usos mostró un patrón de aumento de las capacidades humanas más que de automatización (Handa et al., 2025). Es decir, más de un tercio del uso observado de esta herramienta proviene de tareas propias de la informática, y en la mayoría de los casos el modelo trabaja junto con la persona en lugar de reemplazarla. En la misma línea, Gao y Huang (2026) calcularon un índice relativo de automatización ocupacional para Estados Unidos y encontraron que los puestos cognitivos no rutinarios que dependen de la manipulación de símbolos son los más vulnerables; los científicos de datos encabezan el índice, con un valor cercano a 0.70.</w:t>
+        <w:t xml:space="preserve">H1. Después de la difusión de los modelos de lenguaje en 2022, las personas jóvenes formadas o empleadas en informática y ciencia de datos presentan un riesgo de movilidad mayor que las que tienen más experiencia. La hipótesis se sustenta en la caída relativa del empleo de los jóvenes en ocupaciones expuestas, explicada por menos contrataciones (Brynjolfsson et al., 2026), y en la reducción de contrataciones en puestos no relacionados con la inteligencia artificial dentro de los establecimientos que la adoptan (Acemoglu et al., 2022).</w:t>
       </w:r>
     </w:p>
     <w:p>
@@ -839,7 +1189,23 @@
           <w:sz w:val="24"/>
           <w:szCs w:val="24"/>
         </w:rPr>
-        <w:t xml:space="preserve">Sin embargo, una exposición alta no se ha traducido en pérdidas generales de empleo. Acemoglu et al. (2022) encontraron, con las vacantes publicadas en línea en Estados Unidos desde 2010, que los establecimientos que adoptan inteligencia artificial reducen sus contrataciones en puestos no relacionados con ella y cambian los requisitos de habilidades de las vacantes que mantienen, aunque el efecto todavía es demasiado pequeño para observarse en el empleo agregado. Broady et al. (2026) mostraron que, entre 2019 y 2024, las ocupaciones con mayor aplicabilidad de la inteligencia artificial aumentaron su empleo y sus salarios, por lo que proponen leer la exposición como un indicador de reestructuración de las ocupaciones y no como un pronóstico de pérdida de empleo.</w:t>
+        <w:t xml:space="preserve">H2. Quienes salen de las ocupaciones de informática y ciencia de datos se mueven principalmente hacia ocupaciones cercanas en habilidades, y no hacia la desocupación, porque sus habilidades digitales son transferibles. La hipótesis se basa en el papel de la red de movilidad ocupacional en las opciones de transición (del Rio-Chanona et al., 2021) y en la protección que las habilidades digitales ofrecen frente al riesgo de desplazamiento (Chen et al., 2022; Georgieff y Hyee, 2022).</w:t>
+      </w:r>
+    </w:p>
+    <w:p>
+      <w:pPr>
+        <w:keepNext/>
+        <w:spacing w:before="240" w:after="120" w:line="480" w:lineRule="auto"/>
+        <w:jc w:val="center"/>
+      </w:pPr>
+      <w:r>
+        <w:rPr>
+          <w:rFonts w:ascii="Times New Roman" w:hAnsi="Times New Roman" w:cs="Times New Roman" w:eastAsia="Times New Roman"/>
+          <w:b/>
+          <w:sz w:val="28"/>
+          <w:szCs w:val="28"/>
+        </w:rPr>
+        <w:t xml:space="preserve">V. ANTECEDENTES</w:t>
       </w:r>
     </w:p>
     <w:p>
@@ -854,7 +1220,68 @@
           <w:sz w:val="24"/>
           <w:szCs w:val="24"/>
         </w:rPr>
-        <w:t xml:space="preserve">Donde sí aparece un cambio es en la entrada al mercado de trabajo. Con registros de nómina de millones de trabajadores de Estados Unidos, Brynjolfsson et al. (2026) encontraron que el empleo de los jóvenes de 22 a 25 años en ocupaciones expuestas a la inteligencia artificial se encuentra 19 % por debajo de donde estaría si hubiera crecido al mismo ritmo que el de sus pares en ocupaciones menos expuestas, sin una brecha comparable entre los trabajadores con más experiencia. Los autores precisan que la diferencia se explica sobre todo por menos contrataciones de jóvenes y no por más despidos, y analizan el desarrollo de software como uno de sus casos de estudio. Este resultado sugiere que el efecto de la tecnología se manifiesta en quién entra, quién sale y hacia dónde se mueven los trabajadores, más que en la desaparición de las ocupaciones.</w:t>
+        <w:t xml:space="preserve">Los antecedentes se presentan en orden cronológico. Autor et al. (2003) establecieron el enfoque de tareas, según el cual la tecnología sustituye tareas y no ocupaciones completas. Kambourov y Manovskii (2008) documentaron el aumento de la movilidad ocupacional en Estados Unidos entre 1968 y 1997 y destacaron su importancia porque buena parte del capital humano de los trabajadores es específico de su ocupación, de modo que cambiar de ocupación implica perder parte de ese capital. Frey y Osborne (2017) estimaron la probabilidad de automatización de 702 ocupaciones, y Acemoglu y Restrepo (2019) formalizaron la idea de que la automatización desplaza trabajo de unas tareas mientras la creación de tareas nuevas lo reinstala en otras.</w:t>
+      </w:r>
+    </w:p>
+    <w:p>
+      <w:pPr>
+        <w:spacing w:before="0" w:after="0" w:line="480" w:lineRule="auto"/>
+        <w:ind w:firstLine="709"/>
+        <w:jc w:val="both"/>
+      </w:pPr>
+      <w:r>
+        <w:rPr>
+          <w:rFonts w:ascii="Times New Roman" w:hAnsi="Times New Roman" w:cs="Times New Roman" w:eastAsia="Times New Roman"/>
+          <w:sz w:val="24"/>
+          <w:szCs w:val="24"/>
+        </w:rPr>
+        <w:t xml:space="preserve">Sobre la movilidad, Meng et al. (2019) propusieron una red neuronal jerárquica con mecanismos de atención que aprende de las trayectorias laborales para predecir el siguiente empleador de una persona y cuánto tiempo permanecerá en el nuevo puesto. Del Rio-Chanona et al. (2021) construyeron una red empírica de movilidad ocupacional y simularon cómo se mueven los trabajadores ante distintos escenarios de automatización. Paolillo et al. (2022) calcularon el riesgo de automatización de casi 1,000 ocupaciones y propusieron un método para encontrar, para cada una, alternativas que reduzcan ese riesgo con el menor esfuerzo de reentrenamiento.</w:t>
+      </w:r>
+    </w:p>
+    <w:p>
+      <w:pPr>
+        <w:spacing w:before="0" w:after="0" w:line="480" w:lineRule="auto"/>
+        <w:ind w:firstLine="709"/>
+        <w:jc w:val="both"/>
+      </w:pPr>
+      <w:r>
+        <w:rPr>
+          <w:rFonts w:ascii="Times New Roman" w:hAnsi="Times New Roman" w:cs="Times New Roman" w:eastAsia="Times New Roman"/>
+          <w:sz w:val="24"/>
+          <w:szCs w:val="24"/>
+        </w:rPr>
+        <w:t xml:space="preserve">Con la llegada de los modelos de lenguaje, Eloundou et al. (2023) midieron la exposición de las tareas a estos modelos, y Acemoglu et al. (2022) documentaron cambios en las contrataciones y en los requisitos de las vacantes de los establecimientos que adoptan inteligencia artificial. Georgieff y Hyee (2022) y Chen et al. (2022) mostraron que el uso de computadora y las habilidades digitales cambian el signo o moderan el efecto de la exposición. Dahlin (2024) encontró, con una encuesta en Estados Unidos, que los trabajadores de cuello blanco y con experiencia técnica son quienes más reportan haber sido desplazados por la inteligencia artificial. Frank et al. (2025) relacionaron la exposición con el riesgo de desempleo, y Handa et al. (2025) midieron el uso real de un modelo de lenguaje por tarea.</w:t>
+      </w:r>
+    </w:p>
+    <w:p>
+      <w:pPr>
+        <w:spacing w:before="0" w:after="0" w:line="480" w:lineRule="auto"/>
+        <w:ind w:firstLine="709"/>
+        <w:jc w:val="both"/>
+      </w:pPr>
+      <w:r>
+        <w:rPr>
+          <w:rFonts w:ascii="Times New Roman" w:hAnsi="Times New Roman" w:cs="Times New Roman" w:eastAsia="Times New Roman"/>
+          <w:sz w:val="24"/>
+          <w:szCs w:val="24"/>
+        </w:rPr>
+        <w:t xml:space="preserve">En 2026, Broady et al. compararon la exposición con la evolución del empleo entre 2019 y 2024; Gao y Huang separaron la factibilidad técnica del riesgo comercial de automatizar cada actividad; y Brynjolfsson et al. documentaron la caída relativa del empleo de los trabajadores jóvenes en ocupaciones expuestas. En el mismo año, Khan y Varshney propusieron un modelo probabilístico de aprendizaje profundo para predecir el riesgo de desplazamiento por tarea: combina redes neuronales bayesianas, redes profundas deterministas y la técnica de Monte Carlo Dropout, y lo probaron con 18,796 registros de tareas. Su modelo explica una parte pequeña de la variación del riesgo (un coeficiente de determinación de 0.067), pero muestra que la incertidumbre estimada crece junto con el error real, lo que permite saber cuándo confiar en una predicción, y que el error es menor en las ocupaciones de riesgo medio y mayor en las de riesgo alto.</w:t>
+      </w:r>
+    </w:p>
+    <w:p>
+      <w:pPr>
+        <w:keepNext/>
+        <w:spacing w:before="240" w:after="120" w:line="480" w:lineRule="auto"/>
+        <w:jc w:val="center"/>
+      </w:pPr>
+      <w:r>
+        <w:rPr>
+          <w:rFonts w:ascii="Times New Roman" w:hAnsi="Times New Roman" w:cs="Times New Roman" w:eastAsia="Times New Roman"/>
+          <w:b/>
+          <w:sz w:val="28"/>
+          <w:szCs w:val="28"/>
+        </w:rPr>
+        <w:t xml:space="preserve">VI. MARCO TEÓRICO</w:t>
       </w:r>
     </w:p>
     <w:p>
@@ -870,7 +1297,7 @@
           <w:sz w:val="24"/>
           <w:szCs w:val="24"/>
         </w:rPr>
-        <w:t xml:space="preserve">2.2. Definición del problema</w:t>
+        <w:t xml:space="preserve">6.1. Conceptos y definiciones</w:t>
       </w:r>
     </w:p>
     <w:p>
@@ -885,7 +1312,7 @@
           <w:sz w:val="24"/>
           <w:szCs w:val="24"/>
         </w:rPr>
-        <w:t xml:space="preserve">La mayoría de los estudios sobre inteligencia artificial y empleo miden la exposición de cada ocupación en un momento dado, pero no siguen a los trabajadores. Frank et al. (2025) mostraron, con datos mensuales de desempleo por ocupación de cada estado de Estados Unidos entre 2010 y 2020, que ningún índice de exposición por sí solo predice bien el riesgo de desempleo; solo al combinarlos se explica un 18 % adicional de la variación del riesgo de desempleo entre ocupaciones, estados y periodos, respecto a un modelo que ya considera la escolaridad, las habilidades, la estacionalidad y la región. Dicho de otro modo, saber que una ocupación está expuesta no basta para saber qué les pasará a quienes trabajan en ella.</w:t>
+        <w:t xml:space="preserve">Movilidad laboral. Se refiere a los cambios en la situación laboral de una persona entre dos momentos. En este protocolo incluye tres tipos de transición: el cambio de ocupación, que Kambourov y Manovskii (2008) miden como el paso de un trabajador de una ocupación a otra entre dos periodos; el paso del empleo a la desocupación; y la salida de la fuerza de trabajo. El riesgo de movilidad laboral es la probabilidad de que ocurra alguna de esas transiciones en un periodo determinado.</w:t>
       </w:r>
     </w:p>
     <w:p>
@@ -900,7 +1327,7 @@
           <w:sz w:val="24"/>
           <w:szCs w:val="24"/>
         </w:rPr>
-        <w:t xml:space="preserve">Del Rio-Chanona et al. (2021) plantean el problema desde otro ángulo: cuando la automatización afecta a una ocupación, el resultado para sus trabajadores depende de cuántas ocupaciones cercanas existen hacia donde puedan moverse. Con un modelo de red de movilidad ocupacional, encontraron que las ocupaciones ubicadas en zonas de la red con pocas opciones de transición tienen más riesgo de desempleo de largo plazo. Por su parte, Georgieff y Hyee (2022) encontraron, para 23 países de la OCDE, que en las ocupaciones con uso intensivo de computadora una mayor exposición a la inteligencia artificial se asocia con un mayor crecimiento del empleo, y Chen et al. (2022) mostraron, con 701 ocupaciones de Estados Unidos, que las habilidades digitales moderan el efecto negativo del riesgo de desplazamiento sobre los salarios y el empleo.</w:t>
+        <w:t xml:space="preserve">Desplazamiento y reinstalación. La automatización permite que el capital realice tareas que antes hacían las personas, lo que produce un efecto de desplazamiento del trabajo; la creación de tareas nuevas genera, en sentido contrario, un efecto de reinstalación (Acemoglu y Restrepo, 2019). La movilidad laboral es la forma en que estos dos efectos se observan en las personas: unas dejan las tareas que se automatizan y otras se mueven hacia las tareas nuevas.</w:t>
       </w:r>
     </w:p>
     <w:p>
@@ -915,7 +1342,7 @@
           <w:sz w:val="24"/>
           <w:szCs w:val="24"/>
         </w:rPr>
-        <w:t xml:space="preserve">Estos trabajos coinciden en que el riesgo relevante no es solo el de perder el empleo, sino el de verse obligado a cambiar de ocupación, de empleador o de condición laboral, y en que ese riesgo depende de las habilidades del trabajador y de las rutas de transición disponibles. Sin embargo, se basan en datos de Estados Unidos o de países de la OCDE. En México no se ha medido cómo se mueven los trabajadores de las ocupaciones de ingeniería informática desde la llegada de los modelos de lenguaje, ni si esa movilidad es distinta para quienes empiezan su carrera.</w:t>
+        <w:t xml:space="preserve">Modelos de lenguaje de gran escala. Se trata de modelos de lenguaje basados en la arquitectura Transformer que contienen cientos de miles de millones de parámetros o más, se entrenan con grandes volúmenes de texto y muestran una fuerte capacidad para comprender el lenguaje natural y resolver tareas complejas mediante la generación de texto; ejemplos de ellos son GPT-3, PaLM y LLaMA (Zhao et al., 2023). La arquitectura Transformer es una red neuronal que se apoya únicamente en mecanismos de atención (Vaswani et al., 2017).</w:t>
       </w:r>
     </w:p>
     <w:p>
@@ -930,7 +1357,37 @@
           <w:sz w:val="24"/>
           <w:szCs w:val="24"/>
         </w:rPr>
-        <w:t xml:space="preserve">En consecuencia, el problema de investigación es la falta de un modelo que permita evaluar, con datos de México, el riesgo de movilidad laboral que enfrentan los trabajadores de las ocupaciones de ingeniería informática ante los modelos de inteligencia artificial, es decir, con qué probabilidad cambian de ocupación, quedan desocupados o salen del mercado de trabajo, hacia qué ocupaciones se mueven y qué características del trabajador aumentan o reducen ese riesgo.</w:t>
+        <w:t xml:space="preserve">Exposición a la inteligencia artificial. Es el grado en que las tareas de una ocupación pueden ser realizadas o asistidas por un sistema de inteligencia artificial. Eloundou et al. (2023) consideran que una tarea está expuesta cuando usar un modelo de lenguaje puede reducir al menos a la mitad el tiempo necesario para completarla con la misma calidad. La exposición no implica sustitución: puede traducirse en automatización o en aumento de las capacidades del trabajador (Handa et al., 2025).</w:t>
+      </w:r>
+    </w:p>
+    <w:p>
+      <w:pPr>
+        <w:spacing w:before="0" w:after="0" w:line="480" w:lineRule="auto"/>
+        <w:ind w:firstLine="709"/>
+        <w:jc w:val="both"/>
+      </w:pPr>
+      <w:r>
+        <w:rPr>
+          <w:rFonts w:ascii="Times New Roman" w:hAnsi="Times New Roman" w:cs="Times New Roman" w:eastAsia="Times New Roman"/>
+          <w:sz w:val="24"/>
+          <w:szCs w:val="24"/>
+        </w:rPr>
+        <w:t xml:space="preserve">Carreras de informática y ciencia de datos. Se delimitarán con la Clasificación Mexicana de Planes de Estudio por Campos de Formación Académica 2016 (INEGI, 2016). En ella, el campo amplio 06, Tecnologías de la información y la comunicación, comprende la innovación en tecnologías de la información (061: ciencias computacionales, desarrollo de hardware y desarrollo de software) y su implementación (062: telecomunicaciones, informática, y soporte y servicios de mantenimiento). La ciencia de datos aparece explícitamente dentro del campo 0613, Desarrollo de software, y las carreras de estadística y actuaría forman el campo 0532 (INEGI, 2016).</w:t>
+      </w:r>
+    </w:p>
+    <w:p>
+      <w:pPr>
+        <w:spacing w:before="0" w:after="0" w:line="480" w:lineRule="auto"/>
+        <w:ind w:firstLine="709"/>
+        <w:jc w:val="both"/>
+      </w:pPr>
+      <w:r>
+        <w:rPr>
+          <w:rFonts w:ascii="Times New Roman" w:hAnsi="Times New Roman" w:cs="Times New Roman" w:eastAsia="Times New Roman"/>
+          <w:sz w:val="24"/>
+          <w:szCs w:val="24"/>
+        </w:rPr>
+        <w:t xml:space="preserve">Ocupaciones de informática y ciencia de datos. En el Sistema Nacional de Clasificación de Ocupaciones 2019 corresponden principalmente a los desarrolladores y analistas de software y multimedia (2271), los administradores de bases de datos y redes de computadora (2272) y los investigadores y profesionistas en matemáticas, estadística y actuaría (2212). Como ocupaciones cercanas se considerarán los técnicos en la instalación y reparación de redes, equipos y sistemas computacionales (2651) y los directores y coordinadores de informática (1321 y 1621) (INEGI, 2019).</w:t>
       </w:r>
     </w:p>
     <w:p>
@@ -946,7 +1403,7 @@
           <w:sz w:val="24"/>
           <w:szCs w:val="24"/>
         </w:rPr>
-        <w:t xml:space="preserve">2.3. Preguntas de investigación</w:t>
+        <w:t xml:space="preserve">6.2. Teoría de tareas y movilidad</w:t>
       </w:r>
     </w:p>
     <w:p>
@@ -961,7 +1418,114 @@
           <w:sz w:val="24"/>
           <w:szCs w:val="24"/>
         </w:rPr>
-        <w:t xml:space="preserve">Pregunta general: ¿cómo se relaciona la exposición a los modelos de inteligencia artificial con la movilidad laboral de los trabajadores de las ocupaciones de ingeniería informática en México?</w:t>
+        <w:t xml:space="preserve">El fundamento teórico es el enfoque de tareas (Autor et al., 2003), según el cual la tecnología no sustituye ocupaciones completas, sino tareas específicas, y la teoría del desplazamiento y la reinstalación de Acemoglu y Restrepo (2019). Si la inteligencia artificial absorbe algunas tareas de una ocupación, la demanda de trabajo se reorganiza: las personas cuyas tareas se automatizan pueden cambiar de funciones dentro de la ocupación, moverse a otra ocupación o quedar sin empleo. Qué tan costoso es ese ajuste depende de cuánto capital humano específico se pierde al cambiar de ocupación (Kambourov y Manovskii, 2008) y de cuántas ocupaciones cercanas existen para recibir a la persona (del Rio-Chanona et al., 2021).</w:t>
+      </w:r>
+    </w:p>
+    <w:p>
+      <w:pPr>
+        <w:keepNext/>
+        <w:spacing w:before="240" w:after="0" w:line="480" w:lineRule="auto"/>
+        <w:jc w:val="left"/>
+      </w:pPr>
+      <w:r>
+        <w:rPr>
+          <w:rFonts w:ascii="Times New Roman" w:hAnsi="Times New Roman" w:cs="Times New Roman" w:eastAsia="Times New Roman"/>
+          <w:b/>
+          <w:sz w:val="24"/>
+          <w:szCs w:val="24"/>
+        </w:rPr>
+        <w:t xml:space="preserve">6.3. Elección del método</w:t>
+      </w:r>
+    </w:p>
+    <w:p>
+      <w:pPr>
+        <w:spacing w:before="0" w:after="0" w:line="480" w:lineRule="auto"/>
+        <w:ind w:firstLine="709"/>
+        <w:jc w:val="both"/>
+      </w:pPr>
+      <w:r>
+        <w:rPr>
+          <w:rFonts w:ascii="Times New Roman" w:hAnsi="Times New Roman" w:cs="Times New Roman" w:eastAsia="Times New Roman"/>
+          <w:sz w:val="24"/>
+          <w:szCs w:val="24"/>
+        </w:rPr>
+        <w:t xml:space="preserve">El enfoque es cuantitativo porque el riesgo se expresa como una probabilidad comparable entre carreras, grupos de personas y periodos. El panel rotatorio de la ENOE permite construir trayectorias individuales de hasta cinco trimestres, lo que hace posible estimar matrices de transición, en las que cada celda indica la proporción de personas que pasa de una situación laboral a otra entre dos trimestres. Para explicar esas transiciones se usarán modelos estadísticos con inferencia formal y modelos de aprendizaje automático, en línea con los trabajos que modelan la movilidad con redes ocupacionales (del Rio-Chanona et al., 2021) y con redes neuronales (Meng et al., 2019), y con los que miden la incertidumbre de la predicción del riesgo (Khan y Varshney, 2026).</w:t>
+      </w:r>
+    </w:p>
+    <w:p>
+      <w:pPr>
+        <w:keepNext/>
+        <w:spacing w:before="240" w:after="120" w:line="480" w:lineRule="auto"/>
+        <w:jc w:val="center"/>
+      </w:pPr>
+      <w:r>
+        <w:rPr>
+          <w:rFonts w:ascii="Times New Roman" w:hAnsi="Times New Roman" w:cs="Times New Roman" w:eastAsia="Times New Roman"/>
+          <w:b/>
+          <w:sz w:val="28"/>
+          <w:szCs w:val="28"/>
+        </w:rPr>
+        <w:t xml:space="preserve">VII. METODOLOGÍA</w:t>
+      </w:r>
+    </w:p>
+    <w:p>
+      <w:pPr>
+        <w:spacing w:before="0" w:after="0" w:line="480" w:lineRule="auto"/>
+        <w:ind w:firstLine="709"/>
+        <w:jc w:val="both"/>
+      </w:pPr>
+      <w:r>
+        <w:rPr>
+          <w:rFonts w:ascii="Times New Roman" w:hAnsi="Times New Roman" w:cs="Times New Roman" w:eastAsia="Times New Roman"/>
+          <w:sz w:val="24"/>
+          <w:szCs w:val="24"/>
+        </w:rPr>
+        <w:t xml:space="preserve">Tipo de estudio. Investigación cuantitativa, no experimental y longitudinal, basada en el seguimiento de personas en el panel de la ENOE.</w:t>
+      </w:r>
+    </w:p>
+    <w:p>
+      <w:pPr>
+        <w:spacing w:before="0" w:after="0" w:line="480" w:lineRule="auto"/>
+        <w:ind w:firstLine="709"/>
+        <w:jc w:val="both"/>
+      </w:pPr>
+      <w:r>
+        <w:rPr>
+          <w:rFonts w:ascii="Times New Roman" w:hAnsi="Times New Roman" w:cs="Times New Roman" w:eastAsia="Times New Roman"/>
+          <w:sz w:val="24"/>
+          <w:szCs w:val="24"/>
+        </w:rPr>
+        <w:t xml:space="preserve">Población y unidades de análisis. Personas de 15 años o más que estudiaron una carrera de los campos 06 o 0532 de la Clasificación Mexicana de Planes de Estudio, o que trabajan en las ocupaciones de informática y ciencia de datos señaladas en el marco teórico, en México. Jalisco se analizará como caso estatal en la medida en que el tamaño de la muestra lo permita. Las unidades de análisis son la persona, observada trimestre a trimestre, la ocupación y la carrera.</w:t>
+      </w:r>
+    </w:p>
+    <w:p>
+      <w:pPr>
+        <w:spacing w:before="0" w:after="0" w:line="480" w:lineRule="auto"/>
+        <w:ind w:firstLine="709"/>
+        <w:jc w:val="both"/>
+      </w:pPr>
+      <w:r>
+        <w:rPr>
+          <w:rFonts w:ascii="Times New Roman" w:hAnsi="Times New Roman" w:cs="Times New Roman" w:eastAsia="Times New Roman"/>
+          <w:sz w:val="24"/>
+          <w:szCs w:val="24"/>
+        </w:rPr>
+        <w:t xml:space="preserve">Fuentes de datos. La ENOE (INEGI, 2025) para las trayectorias laborales, la carrera y las características de las personas; la Clasificación Mexicana de Planes de Estudio (INEGI, 2016) y el Sistema Nacional de Clasificación de Ocupaciones (INEGI, 2019) para delimitar carreras y ocupaciones; la base O*NET (National Center for O*NET Development, 2024) para las tareas de cada ocupación; e índices publicados de exposición a la inteligencia artificial (Eloundou et al., 2023; Felten et al., 2023) y de uso observado (Handa et al., 2025).</w:t>
+      </w:r>
+    </w:p>
+    <w:p>
+      <w:pPr>
+        <w:spacing w:before="0" w:after="0" w:line="480" w:lineRule="auto"/>
+        <w:ind w:firstLine="709"/>
+        <w:jc w:val="both"/>
+      </w:pPr>
+      <w:r>
+        <w:rPr>
+          <w:rFonts w:ascii="Times New Roman" w:hAnsi="Times New Roman" w:cs="Times New Roman" w:eastAsia="Times New Roman"/>
+          <w:sz w:val="24"/>
+          <w:szCs w:val="24"/>
+        </w:rPr>
+        <w:t xml:space="preserve">Procedimiento. El trabajo se organiza en cinco pasos alineados con los objetivos específicos:</w:t>
       </w:r>
     </w:p>
     <w:p>
@@ -976,7 +1540,7 @@
           <w:sz w:val="24"/>
           <w:szCs w:val="24"/>
         </w:rPr>
-        <w:t xml:space="preserve">1. ¿Qué tareas de las ocupaciones de ingeniería informática están más expuestas a los modelos de inteligencia artificial?</w:t>
+        <w:t xml:space="preserve">1. Delimitación de las carreras y ocupaciones de informática y ciencia de datos, y depuración de los trimestres de la ENOE disponibles antes y después de 2022.</w:t>
       </w:r>
     </w:p>
     <w:p>
@@ -991,7 +1555,7 @@
           <w:sz w:val="24"/>
           <w:szCs w:val="24"/>
         </w:rPr>
-        <w:t xml:space="preserve">2. ¿Con qué frecuencia cambian de ocupación, quedan desocupados o salen del mercado de trabajo estos trabajadores, hacia qué ocupaciones se mueven y cómo cambió esa movilidad después de 2022?</w:t>
+        <w:t xml:space="preserve">2. Asignación de las tareas de O*NET a las ocupaciones mexicanas mediante tablas de correspondencia y cálculo de su exposición a los modelos de inteligencia artificial.</w:t>
       </w:r>
     </w:p>
     <w:p>
@@ -1006,7 +1570,52 @@
           <w:sz w:val="24"/>
           <w:szCs w:val="24"/>
         </w:rPr>
-        <w:t xml:space="preserve">3. ¿Qué características del trabajador, como la edad, la experiencia, la escolaridad y el tipo de ocupación, se asocian con un mayor riesgo de movilidad?</w:t>
+        <w:t xml:space="preserve">3. Enlace de los registros de cada persona entre trimestres y construcción de matrices de transición entre ocupaciones, desocupación e inactividad, comparando el periodo anterior y el posterior a 2022.</w:t>
+      </w:r>
+    </w:p>
+    <w:p>
+      <w:pPr>
+        <w:spacing w:before="0" w:after="0" w:line="480" w:lineRule="auto"/>
+        <w:ind w:left="709"/>
+        <w:jc w:val="both"/>
+      </w:pPr>
+      <w:r>
+        <w:rPr>
+          <w:rFonts w:ascii="Times New Roman" w:hAnsi="Times New Roman" w:cs="Times New Roman" w:eastAsia="Times New Roman"/>
+          <w:sz w:val="24"/>
+          <w:szCs w:val="24"/>
+        </w:rPr>
+        <w:t xml:space="preserve">4. Estimación de modelos de la probabilidad de transición, como regresiones logísticas multinomiales y modelos de diferencias en diferencias que comparen a jóvenes y a personas con experiencia antes y después de 2022, complementados con modelos de aprendizaje automático con validación cruzada y con modelos que estimen la incertidumbre de la predicción, para contrastar H1 y comparar el riesgo entre carreras.</w:t>
+      </w:r>
+    </w:p>
+    <w:p>
+      <w:pPr>
+        <w:spacing w:before="0" w:after="0" w:line="480" w:lineRule="auto"/>
+        <w:ind w:left="709"/>
+        <w:jc w:val="both"/>
+      </w:pPr>
+      <w:r>
+        <w:rPr>
+          <w:rFonts w:ascii="Times New Roman" w:hAnsi="Times New Roman" w:cs="Times New Roman" w:eastAsia="Times New Roman"/>
+          <w:sz w:val="24"/>
+          <w:szCs w:val="24"/>
+        </w:rPr>
+        <w:t xml:space="preserve">5. Construcción de una red de movilidad con las ocupaciones de destino observadas, para contrastar H2, y elaboración del tablero de visualización del riesgo por carrera.</w:t>
+      </w:r>
+    </w:p>
+    <w:p>
+      <w:pPr>
+        <w:spacing w:before="0" w:after="0" w:line="480" w:lineRule="auto"/>
+        <w:ind w:firstLine="709"/>
+        <w:jc w:val="both"/>
+      </w:pPr>
+      <w:r>
+        <w:rPr>
+          <w:rFonts w:ascii="Times New Roman" w:hAnsi="Times New Roman" w:cs="Times New Roman" w:eastAsia="Times New Roman"/>
+          <w:sz w:val="24"/>
+          <w:szCs w:val="24"/>
+        </w:rPr>
+        <w:t xml:space="preserve">Herramientas de análisis. Python (pandas, NumPy, statsmodels, scikit-learn y Matplotlib), SQL Server para la integración de datos y GitHub para el control de versiones y la reproducibilidad del análisis.</w:t>
       </w:r>
     </w:p>
     <w:p>
@@ -1022,7 +1631,7 @@
           <w:sz w:val="28"/>
           <w:szCs w:val="28"/>
         </w:rPr>
-        <w:t xml:space="preserve">III. JUSTIFICACIÓN</w:t>
+        <w:t xml:space="preserve">VIII. RECURSOS</w:t>
       </w:r>
     </w:p>
     <w:p>
@@ -1037,7 +1646,7 @@
           <w:sz w:val="24"/>
           <w:szCs w:val="24"/>
         </w:rPr>
-        <w:t xml:space="preserve">Relevancia social. Si el efecto de la inteligencia artificial se concentra en la entrada al mercado de trabajo, como sugieren Brynjolfsson et al. (2026), quienes más lo resentirían serían los egresados recientes de carreras de informática, que buscan su primer empleo en las ocupaciones más expuestas. Conocer ese riesgo permite anticiparlo en la formación universitaria y en las políticas de empleo.</w:t>
+        <w:t xml:space="preserve">Recursos humanos. El tesista, responsable del desarrollo del proyecto; el director de tesis, por designar; y la profesora de la unidad de aprendizaje Desarrollo de Proyecto I, que da seguimiento al protocolo.</w:t>
       </w:r>
     </w:p>
     <w:p>
@@ -1052,7 +1661,7 @@
           <w:sz w:val="24"/>
           <w:szCs w:val="24"/>
         </w:rPr>
-        <w:t xml:space="preserve">Relevancia práctica. Los resultados permitirán identificar qué ocupaciones de destino reciben a los trabajadores que salen de la ingeniería informática y qué habilidades facilitan esas transiciones. Paolillo et al. (2022) mostraron que es posible identificar, para cada ocupación, alternativas que reducen el riesgo de automatización con un esfuerzo de reentrenamiento moderado; un análisis similar con datos mexicanos serviría a universidades, empleadores y trabajadores para orientar la capacitación.</w:t>
+        <w:t xml:space="preserve">Recursos materiales. Equipo de cómputo personal, un servidor local con SQL Server para la base de datos del proyecto, software libre para el análisis (Python y sus bibliotecas) y un repositorio en GitHub. Las fuentes de información son públicas y gratuitas.</w:t>
       </w:r>
     </w:p>
     <w:p>
@@ -1067,7 +1676,23 @@
           <w:sz w:val="24"/>
           <w:szCs w:val="24"/>
         </w:rPr>
-        <w:t xml:space="preserve">Aportación a la ciencia. El proyecto propone medir la movilidad laboral asociada a la inteligencia artificial siguiendo a los mismos trabajadores en el tiempo, en lugar de comparar fotografías de la exposición en distintos años. Frank et al. (2025) muestran que la exposición por sí sola es un mal predictor de lo que ocurre con el empleo, por lo que observar las transiciones reales de los trabajadores aporta una medida más directa del riesgo.</w:t>
+        <w:t xml:space="preserve">Recursos económicos. El proyecto no requiere la compra de datos ni de licencias de software. Los costos se limitan al uso del equipo propio y a la conexión a internet, cubiertos por el tesista.</w:t>
+      </w:r>
+    </w:p>
+    <w:p>
+      <w:pPr>
+        <w:keepNext/>
+        <w:spacing w:before="240" w:after="120" w:line="480" w:lineRule="auto"/>
+        <w:jc w:val="center"/>
+      </w:pPr>
+      <w:r>
+        <w:rPr>
+          <w:rFonts w:ascii="Times New Roman" w:hAnsi="Times New Roman" w:cs="Times New Roman" w:eastAsia="Times New Roman"/>
+          <w:b/>
+          <w:sz w:val="28"/>
+          <w:szCs w:val="28"/>
+        </w:rPr>
+        <w:t xml:space="preserve">IX. CRONOGRAMA</w:t>
       </w:r>
     </w:p>
     <w:p>
@@ -1082,679 +1707,7 @@
           <w:sz w:val="24"/>
           <w:szCs w:val="24"/>
         </w:rPr>
-        <w:t xml:space="preserve">Viabilidad. Las fuentes de información son públicas y gratuitas. La Encuesta Nacional de Ocupación y Empleo (ENOE) del INEGI tiene un diseño de panel rotatorio: la muestra se divide en cinco paneles y cada vivienda permanece en la encuesta durante cinco trimestres, de modo que en cada trimestre se mantiene el 80 % de la muestra (INEGI, 2025). Esto significa que una misma persona se entrevista hasta cinco veces seguidas, lo que permite observar si cambió de ocupación o de condición laboral entre un trimestre y otro. La ocupación se registra con el Sistema Nacional de Clasificación de Ocupaciones (INEGI, 2019), y las tareas de cada ocupación pueden obtenerse de la base O*NET (National Center for O*NET Development, 2024).</w:t>
-      </w:r>
-    </w:p>
-    <w:p>
-      <w:pPr>
-        <w:keepNext/>
-        <w:spacing w:before="240" w:after="120" w:line="480" w:lineRule="auto"/>
-        <w:jc w:val="center"/>
-      </w:pPr>
-      <w:r>
-        <w:rPr>
-          <w:rFonts w:ascii="Times New Roman" w:hAnsi="Times New Roman" w:cs="Times New Roman" w:eastAsia="Times New Roman"/>
-          <w:b/>
-          <w:sz w:val="28"/>
-          <w:szCs w:val="28"/>
-        </w:rPr>
-        <w:t xml:space="preserve">IV. OBJETIVOS</w:t>
-      </w:r>
-    </w:p>
-    <w:p>
-      <w:pPr>
-        <w:keepNext/>
-        <w:spacing w:before="240" w:after="0" w:line="480" w:lineRule="auto"/>
-        <w:jc w:val="left"/>
-      </w:pPr>
-      <w:r>
-        <w:rPr>
-          <w:rFonts w:ascii="Times New Roman" w:hAnsi="Times New Roman" w:cs="Times New Roman" w:eastAsia="Times New Roman"/>
-          <w:b/>
-          <w:sz w:val="24"/>
-          <w:szCs w:val="24"/>
-        </w:rPr>
-        <w:t xml:space="preserve">4.1. Objetivo general</w:t>
-      </w:r>
-    </w:p>
-    <w:p>
-      <w:pPr>
-        <w:spacing w:before="0" w:after="0" w:line="480" w:lineRule="auto"/>
-        <w:ind w:firstLine="709"/>
-        <w:jc w:val="both"/>
-      </w:pPr>
-      <w:r>
-        <w:rPr>
-          <w:rFonts w:ascii="Times New Roman" w:hAnsi="Times New Roman" w:cs="Times New Roman" w:eastAsia="Times New Roman"/>
-          <w:sz w:val="24"/>
-          <w:szCs w:val="24"/>
-        </w:rPr>
-        <w:t xml:space="preserve">Evaluar el riesgo de movilidad laboral de los trabajadores de las ocupaciones de ingeniería informática en México frente a los modelos de inteligencia artificial, mediante un modelo de ciencia de datos que relacione la exposición de sus tareas con las transiciones laborales observadas.</w:t>
-      </w:r>
-    </w:p>
-    <w:p>
-      <w:pPr>
-        <w:keepNext/>
-        <w:spacing w:before="240" w:after="0" w:line="480" w:lineRule="auto"/>
-        <w:jc w:val="left"/>
-      </w:pPr>
-      <w:r>
-        <w:rPr>
-          <w:rFonts w:ascii="Times New Roman" w:hAnsi="Times New Roman" w:cs="Times New Roman" w:eastAsia="Times New Roman"/>
-          <w:b/>
-          <w:sz w:val="24"/>
-          <w:szCs w:val="24"/>
-        </w:rPr>
-        <w:t xml:space="preserve">4.2. Objetivos específicos</w:t>
-      </w:r>
-    </w:p>
-    <w:p>
-      <w:pPr>
-        <w:spacing w:before="0" w:after="0" w:line="480" w:lineRule="auto"/>
-        <w:ind w:left="709"/>
-        <w:jc w:val="both"/>
-      </w:pPr>
-      <w:r>
-        <w:rPr>
-          <w:rFonts w:ascii="Times New Roman" w:hAnsi="Times New Roman" w:cs="Times New Roman" w:eastAsia="Times New Roman"/>
-          <w:sz w:val="24"/>
-          <w:szCs w:val="24"/>
-        </w:rPr>
-        <w:t xml:space="preserve">1. Delimitar las ocupaciones de ingeniería informática en el Sistema Nacional de Clasificación de Ocupaciones y caracterizar a sus trabajadores con la ENOE.</w:t>
-      </w:r>
-    </w:p>
-    <w:p>
-      <w:pPr>
-        <w:spacing w:before="0" w:after="0" w:line="480" w:lineRule="auto"/>
-        <w:ind w:left="709"/>
-        <w:jc w:val="both"/>
-      </w:pPr>
-      <w:r>
-        <w:rPr>
-          <w:rFonts w:ascii="Times New Roman" w:hAnsi="Times New Roman" w:cs="Times New Roman" w:eastAsia="Times New Roman"/>
-          <w:sz w:val="24"/>
-          <w:szCs w:val="24"/>
-        </w:rPr>
-        <w:t xml:space="preserve">2. Medir la exposición de las tareas de esas ocupaciones a los modelos de inteligencia artificial a partir de O*NET y de índices de exposición publicados.</w:t>
-      </w:r>
-    </w:p>
-    <w:p>
-      <w:pPr>
-        <w:spacing w:before="0" w:after="0" w:line="480" w:lineRule="auto"/>
-        <w:ind w:left="709"/>
-        <w:jc w:val="both"/>
-      </w:pPr>
-      <w:r>
-        <w:rPr>
-          <w:rFonts w:ascii="Times New Roman" w:hAnsi="Times New Roman" w:cs="Times New Roman" w:eastAsia="Times New Roman"/>
-          <w:sz w:val="24"/>
-          <w:szCs w:val="24"/>
-        </w:rPr>
-        <w:t xml:space="preserve">3. Construir las trayectorias trimestrales de los trabajadores con el panel de la ENOE y estimar matrices de transición entre ocupaciones y condiciones laborales, antes y después de 2022.</w:t>
-      </w:r>
-    </w:p>
-    <w:p>
-      <w:pPr>
-        <w:spacing w:before="0" w:after="0" w:line="480" w:lineRule="auto"/>
-        <w:ind w:left="709"/>
-        <w:jc w:val="both"/>
-      </w:pPr>
-      <w:r>
-        <w:rPr>
-          <w:rFonts w:ascii="Times New Roman" w:hAnsi="Times New Roman" w:cs="Times New Roman" w:eastAsia="Times New Roman"/>
-          <w:sz w:val="24"/>
-          <w:szCs w:val="24"/>
-        </w:rPr>
-        <w:t xml:space="preserve">4. Estimar modelos que expliquen el riesgo de movilidad en función de la exposición y de las características del trabajador, y evaluar su desempeño y robustez.</w:t>
-      </w:r>
-    </w:p>
-    <w:p>
-      <w:pPr>
-        <w:spacing w:before="0" w:after="0" w:line="480" w:lineRule="auto"/>
-        <w:ind w:left="709"/>
-        <w:jc w:val="both"/>
-      </w:pPr>
-      <w:r>
-        <w:rPr>
-          <w:rFonts w:ascii="Times New Roman" w:hAnsi="Times New Roman" w:cs="Times New Roman" w:eastAsia="Times New Roman"/>
-          <w:sz w:val="24"/>
-          <w:szCs w:val="24"/>
-        </w:rPr>
-        <w:t xml:space="preserve">5. Identificar las ocupaciones de destino de quienes salen de la ingeniería informática y presentar los resultados en un tablero de visualización.</w:t>
-      </w:r>
-    </w:p>
-    <w:p>
-      <w:pPr>
-        <w:keepNext/>
-        <w:spacing w:before="240" w:after="120" w:line="480" w:lineRule="auto"/>
-        <w:jc w:val="center"/>
-      </w:pPr>
-      <w:r>
-        <w:rPr>
-          <w:rFonts w:ascii="Times New Roman" w:hAnsi="Times New Roman" w:cs="Times New Roman" w:eastAsia="Times New Roman"/>
-          <w:b/>
-          <w:sz w:val="28"/>
-          <w:szCs w:val="28"/>
-        </w:rPr>
-        <w:t xml:space="preserve">V. HIPÓTESIS</w:t>
-      </w:r>
-    </w:p>
-    <w:p>
-      <w:pPr>
-        <w:spacing w:before="0" w:after="0" w:line="480" w:lineRule="auto"/>
-        <w:ind w:firstLine="709"/>
-        <w:jc w:val="both"/>
-      </w:pPr>
-      <w:r>
-        <w:rPr>
-          <w:rFonts w:ascii="Times New Roman" w:hAnsi="Times New Roman" w:cs="Times New Roman" w:eastAsia="Times New Roman"/>
-          <w:sz w:val="24"/>
-          <w:szCs w:val="24"/>
-        </w:rPr>
-        <w:t xml:space="preserve">H1. Después de la difusión de los modelos de lenguaje en 2022, los trabajadores jóvenes de las ocupaciones de ingeniería informática presentan un riesgo de movilidad mayor que los trabajadores con más experiencia. La hipótesis se sustenta en la caída relativa del empleo de los jóvenes en ocupaciones expuestas, explicada por menos contrataciones (Brynjolfsson et al., 2026), y en la reducción de contrataciones en puestos no relacionados con la inteligencia artificial dentro de los establecimientos que la adoptan (Acemoglu et al., 2022).</w:t>
-      </w:r>
-    </w:p>
-    <w:p>
-      <w:pPr>
-        <w:spacing w:before="0" w:after="0" w:line="480" w:lineRule="auto"/>
-        <w:ind w:firstLine="709"/>
-        <w:jc w:val="both"/>
-      </w:pPr>
-      <w:r>
-        <w:rPr>
-          <w:rFonts w:ascii="Times New Roman" w:hAnsi="Times New Roman" w:cs="Times New Roman" w:eastAsia="Times New Roman"/>
-          <w:sz w:val="24"/>
-          <w:szCs w:val="24"/>
-        </w:rPr>
-        <w:t xml:space="preserve">H2. Quienes salen de las ocupaciones de ingeniería informática se mueven principalmente hacia ocupaciones cercanas en habilidades, y no hacia la desocupación, porque sus habilidades digitales son transferibles. La hipótesis se basa en el papel de la red de movilidad ocupacional en las opciones de transición (del Rio-Chanona et al., 2021) y en la protección que las habilidades digitales ofrecen frente al riesgo de desplazamiento (Chen et al., 2022; Georgieff y Hyee, 2022).</w:t>
-      </w:r>
-    </w:p>
-    <w:p>
-      <w:pPr>
-        <w:keepNext/>
-        <w:spacing w:before="240" w:after="120" w:line="480" w:lineRule="auto"/>
-        <w:jc w:val="center"/>
-      </w:pPr>
-      <w:r>
-        <w:rPr>
-          <w:rFonts w:ascii="Times New Roman" w:hAnsi="Times New Roman" w:cs="Times New Roman" w:eastAsia="Times New Roman"/>
-          <w:b/>
-          <w:sz w:val="28"/>
-          <w:szCs w:val="28"/>
-        </w:rPr>
-        <w:t xml:space="preserve">VI. ANTECEDENTES</w:t>
-      </w:r>
-    </w:p>
-    <w:p>
-      <w:pPr>
-        <w:spacing w:before="0" w:after="0" w:line="480" w:lineRule="auto"/>
-        <w:ind w:firstLine="709"/>
-        <w:jc w:val="both"/>
-      </w:pPr>
-      <w:r>
-        <w:rPr>
-          <w:rFonts w:ascii="Times New Roman" w:hAnsi="Times New Roman" w:cs="Times New Roman" w:eastAsia="Times New Roman"/>
-          <w:sz w:val="24"/>
-          <w:szCs w:val="24"/>
-        </w:rPr>
-        <w:t xml:space="preserve">Los antecedentes se presentan en orden cronológico. Autor et al. (2003) establecieron el enfoque de tareas, según el cual la tecnología sustituye tareas y no ocupaciones completas. Kambourov y Manovskii (2008) documentaron el aumento de la movilidad ocupacional en Estados Unidos entre 1968 y 1997 y destacaron su importancia porque buena parte del capital humano de los trabajadores es específico de su ocupación, de modo que cambiar de ocupación implica perder parte de ese capital. Frey y Osborne (2017) estimaron la probabilidad de automatización de 702 ocupaciones, y Acemoglu y Restrepo (2019) formalizaron la idea de que la automatización desplaza trabajo de unas tareas mientras la creación de tareas nuevas lo reinstala en otras.</w:t>
-      </w:r>
-    </w:p>
-    <w:p>
-      <w:pPr>
-        <w:spacing w:before="0" w:after="0" w:line="480" w:lineRule="auto"/>
-        <w:ind w:firstLine="709"/>
-        <w:jc w:val="both"/>
-      </w:pPr>
-      <w:r>
-        <w:rPr>
-          <w:rFonts w:ascii="Times New Roman" w:hAnsi="Times New Roman" w:cs="Times New Roman" w:eastAsia="Times New Roman"/>
-          <w:sz w:val="24"/>
-          <w:szCs w:val="24"/>
-        </w:rPr>
-        <w:t xml:space="preserve">Sobre la movilidad, Meng et al. (2019) propusieron una red neuronal jerárquica con mecanismos de atención que aprende de las trayectorias laborales para predecir el siguiente empleador de una persona y cuánto tiempo permanecerá en el nuevo puesto. Del Rio-Chanona et al. (2021) construyeron una red empírica de movilidad ocupacional y simularon cómo se mueven los trabajadores ante distintos escenarios de automatización. Paolillo et al. (2022) calcularon el riesgo de automatización de casi 1,000 ocupaciones y propusieron un método para encontrar, para cada una, alternativas que reduzcan ese riesgo con el menor esfuerzo de reentrenamiento.</w:t>
-      </w:r>
-    </w:p>
-    <w:p>
-      <w:pPr>
-        <w:spacing w:before="0" w:after="0" w:line="480" w:lineRule="auto"/>
-        <w:ind w:firstLine="709"/>
-        <w:jc w:val="both"/>
-      </w:pPr>
-      <w:r>
-        <w:rPr>
-          <w:rFonts w:ascii="Times New Roman" w:hAnsi="Times New Roman" w:cs="Times New Roman" w:eastAsia="Times New Roman"/>
-          <w:sz w:val="24"/>
-          <w:szCs w:val="24"/>
-        </w:rPr>
-        <w:t xml:space="preserve">Con la llegada de los modelos de lenguaje, Eloundou et al. (2023) midieron la exposición de las tareas a estos modelos, y Acemoglu et al. (2022) documentaron cambios en las contrataciones y en los requisitos de las vacantes de los establecimientos que adoptan inteligencia artificial. Georgieff y Hyee (2022) y Chen et al. (2022) mostraron que el uso de computadora y las habilidades digitales cambian el signo o moderan el efecto de la exposición. Dahlin (2024) encontró, con una encuesta en Estados Unidos, que los trabajadores de cuello blanco y con experiencia técnica son quienes más reportan haber sido desplazados por la inteligencia artificial. Más recientemente, Frank et al. (2025) relacionaron la exposición con el riesgo de desempleo, Handa et al. (2025) midieron el uso real de un modelo de lenguaje por tarea, Broady et al. (2026) compararon la exposición con la evolución del empleo entre 2019 y 2024, Gao y Huang (2026) separaron la factibilidad técnica del riesgo comercial de automatizar cada actividad, y Brynjolfsson et al. (2026) documentaron la caída relativa del empleo de los trabajadores jóvenes en ocupaciones expuestas.</w:t>
-      </w:r>
-    </w:p>
-    <w:p>
-      <w:pPr>
-        <w:keepNext/>
-        <w:spacing w:before="240" w:after="120" w:line="480" w:lineRule="auto"/>
-        <w:jc w:val="center"/>
-      </w:pPr>
-      <w:r>
-        <w:rPr>
-          <w:rFonts w:ascii="Times New Roman" w:hAnsi="Times New Roman" w:cs="Times New Roman" w:eastAsia="Times New Roman"/>
-          <w:b/>
-          <w:sz w:val="28"/>
-          <w:szCs w:val="28"/>
-        </w:rPr>
-        <w:t xml:space="preserve">VII. MARCO TEÓRICO</w:t>
-      </w:r>
-    </w:p>
-    <w:p>
-      <w:pPr>
-        <w:keepNext/>
-        <w:spacing w:before="240" w:after="0" w:line="480" w:lineRule="auto"/>
-        <w:jc w:val="left"/>
-      </w:pPr>
-      <w:r>
-        <w:rPr>
-          <w:rFonts w:ascii="Times New Roman" w:hAnsi="Times New Roman" w:cs="Times New Roman" w:eastAsia="Times New Roman"/>
-          <w:b/>
-          <w:sz w:val="24"/>
-          <w:szCs w:val="24"/>
-        </w:rPr>
-        <w:t xml:space="preserve">7.1. Conceptos y definiciones</w:t>
-      </w:r>
-    </w:p>
-    <w:p>
-      <w:pPr>
-        <w:spacing w:before="0" w:after="0" w:line="480" w:lineRule="auto"/>
-        <w:ind w:firstLine="709"/>
-        <w:jc w:val="both"/>
-      </w:pPr>
-      <w:r>
-        <w:rPr>
-          <w:rFonts w:ascii="Times New Roman" w:hAnsi="Times New Roman" w:cs="Times New Roman" w:eastAsia="Times New Roman"/>
-          <w:sz w:val="24"/>
-          <w:szCs w:val="24"/>
-        </w:rPr>
-        <w:t xml:space="preserve">Movilidad laboral. Se refiere a los cambios en la situación laboral de un trabajador entre dos momentos. En este protocolo incluye tres tipos de transición: el cambio de ocupación, que Kambourov y Manovskii (2008) miden como el paso de un trabajador de una ocupación a otra entre dos periodos; el paso del empleo a la desocupación; y la salida de la fuerza de trabajo. El riesgo de movilidad laboral es la probabilidad de que ocurra alguna de esas transiciones en un periodo determinado.</w:t>
-      </w:r>
-    </w:p>
-    <w:p>
-      <w:pPr>
-        <w:spacing w:before="0" w:after="0" w:line="480" w:lineRule="auto"/>
-        <w:ind w:firstLine="709"/>
-        <w:jc w:val="both"/>
-      </w:pPr>
-      <w:r>
-        <w:rPr>
-          <w:rFonts w:ascii="Times New Roman" w:hAnsi="Times New Roman" w:cs="Times New Roman" w:eastAsia="Times New Roman"/>
-          <w:sz w:val="24"/>
-          <w:szCs w:val="24"/>
-        </w:rPr>
-        <w:t xml:space="preserve">Desplazamiento y reinstalación. La automatización permite que el capital realice tareas que antes hacían las personas, lo que produce un efecto de desplazamiento del trabajo; la creación de tareas nuevas genera, en sentido contrario, un efecto de reinstalación (Acemoglu y Restrepo, 2019). La movilidad laboral es la forma en que estos dos efectos se observan en los trabajadores: unos dejan las tareas que se automatizan y otros se mueven hacia las tareas nuevas.</w:t>
-      </w:r>
-    </w:p>
-    <w:p>
-      <w:pPr>
-        <w:spacing w:before="0" w:after="0" w:line="480" w:lineRule="auto"/>
-        <w:ind w:firstLine="709"/>
-        <w:jc w:val="both"/>
-      </w:pPr>
-      <w:r>
-        <w:rPr>
-          <w:rFonts w:ascii="Times New Roman" w:hAnsi="Times New Roman" w:cs="Times New Roman" w:eastAsia="Times New Roman"/>
-          <w:sz w:val="24"/>
-          <w:szCs w:val="24"/>
-        </w:rPr>
-        <w:t xml:space="preserve">Modelos de lenguaje de gran escala. Se trata de modelos de lenguaje basados en la arquitectura Transformer que contienen cientos de miles de millones de parámetros o más, se entrenan con grandes volúmenes de texto y muestran una fuerte capacidad para comprender el lenguaje natural y resolver tareas complejas mediante la generación de texto; ejemplos de ellos son GPT-3, PaLM y LLaMA (Zhao et al., 2023). La arquitectura Transformer es una red neuronal que se apoya únicamente en mecanismos de atención (Vaswani et al., 2017).</w:t>
-      </w:r>
-    </w:p>
-    <w:p>
-      <w:pPr>
-        <w:spacing w:before="0" w:after="0" w:line="480" w:lineRule="auto"/>
-        <w:ind w:firstLine="709"/>
-        <w:jc w:val="both"/>
-      </w:pPr>
-      <w:r>
-        <w:rPr>
-          <w:rFonts w:ascii="Times New Roman" w:hAnsi="Times New Roman" w:cs="Times New Roman" w:eastAsia="Times New Roman"/>
-          <w:sz w:val="24"/>
-          <w:szCs w:val="24"/>
-        </w:rPr>
-        <w:t xml:space="preserve">Ocupaciones de ingeniería informática. En el Sistema Nacional de Clasificación de Ocupaciones 2019 corresponden al subgrupo 227, Investigadores y profesionistas en sistemas computacionales, que comprende a los desarrolladores y analistas de software y multimedia (2271) y a los administradores de bases de datos y redes de computadora (2272) (INEGI, 2019). Como posibles ocupaciones de destino cercanas se considerarán, entre otras, los técnicos en la instalación y reparación de redes, equipos y sistemas computacionales (2651) y los directores y coordinadores de informática (1321 y 1621).</w:t>
-      </w:r>
-    </w:p>
-    <w:p>
-      <w:pPr>
-        <w:spacing w:before="0" w:after="0" w:line="480" w:lineRule="auto"/>
-        <w:ind w:firstLine="709"/>
-        <w:jc w:val="both"/>
-      </w:pPr>
-      <w:r>
-        <w:rPr>
-          <w:rFonts w:ascii="Times New Roman" w:hAnsi="Times New Roman" w:cs="Times New Roman" w:eastAsia="Times New Roman"/>
-          <w:sz w:val="24"/>
-          <w:szCs w:val="24"/>
-        </w:rPr>
-        <w:t xml:space="preserve">Exposición a la inteligencia artificial. Es el grado en que las tareas de una ocupación pueden ser realizadas o asistidas por un sistema de inteligencia artificial. Eloundou et al. (2023) consideran que una tarea está expuesta cuando usar un modelo de lenguaje puede reducir al menos a la mitad el tiempo necesario para completarla con la misma calidad. La exposición no implica sustitución: puede traducirse en automatización o en aumento de las capacidades del trabajador (Handa et al., 2025).</w:t>
-      </w:r>
-    </w:p>
-    <w:p>
-      <w:pPr>
-        <w:keepNext/>
-        <w:spacing w:before="240" w:after="0" w:line="480" w:lineRule="auto"/>
-        <w:jc w:val="left"/>
-      </w:pPr>
-      <w:r>
-        <w:rPr>
-          <w:rFonts w:ascii="Times New Roman" w:hAnsi="Times New Roman" w:cs="Times New Roman" w:eastAsia="Times New Roman"/>
-          <w:b/>
-          <w:sz w:val="24"/>
-          <w:szCs w:val="24"/>
-        </w:rPr>
-        <w:t xml:space="preserve">7.2. Teoría de tareas y movilidad</w:t>
-      </w:r>
-    </w:p>
-    <w:p>
-      <w:pPr>
-        <w:spacing w:before="0" w:after="0" w:line="480" w:lineRule="auto"/>
-        <w:ind w:firstLine="709"/>
-        <w:jc w:val="both"/>
-      </w:pPr>
-      <w:r>
-        <w:rPr>
-          <w:rFonts w:ascii="Times New Roman" w:hAnsi="Times New Roman" w:cs="Times New Roman" w:eastAsia="Times New Roman"/>
-          <w:sz w:val="24"/>
-          <w:szCs w:val="24"/>
-        </w:rPr>
-        <w:t xml:space="preserve">El fundamento teórico es el enfoque de tareas (Autor et al., 2003), según el cual la tecnología no sustituye ocupaciones completas, sino tareas específicas, y la teoría del desplazamiento y la reinstalación de Acemoglu y Restrepo (2019). Si la inteligencia artificial absorbe algunas tareas de una ocupación, la demanda de trabajo se reorganiza: los trabajadores cuyas tareas se automatizan pueden cambiar de funciones dentro de la ocupación, moverse a otra ocupación o quedar sin empleo. Qué tan costoso es ese ajuste depende de cuánto capital humano específico se pierde al cambiar de ocupación (Kambourov y Manovskii, 2008) y de cuántas ocupaciones cercanas existen para recibir al trabajador (del Rio-Chanona et al., 2021).</w:t>
-      </w:r>
-    </w:p>
-    <w:p>
-      <w:pPr>
-        <w:keepNext/>
-        <w:spacing w:before="240" w:after="0" w:line="480" w:lineRule="auto"/>
-        <w:jc w:val="left"/>
-      </w:pPr>
-      <w:r>
-        <w:rPr>
-          <w:rFonts w:ascii="Times New Roman" w:hAnsi="Times New Roman" w:cs="Times New Roman" w:eastAsia="Times New Roman"/>
-          <w:b/>
-          <w:sz w:val="24"/>
-          <w:szCs w:val="24"/>
-        </w:rPr>
-        <w:t xml:space="preserve">7.3. Elección del método</w:t>
-      </w:r>
-    </w:p>
-    <w:p>
-      <w:pPr>
-        <w:spacing w:before="0" w:after="0" w:line="480" w:lineRule="auto"/>
-        <w:ind w:firstLine="709"/>
-        <w:jc w:val="both"/>
-      </w:pPr>
-      <w:r>
-        <w:rPr>
-          <w:rFonts w:ascii="Times New Roman" w:hAnsi="Times New Roman" w:cs="Times New Roman" w:eastAsia="Times New Roman"/>
-          <w:sz w:val="24"/>
-          <w:szCs w:val="24"/>
-        </w:rPr>
-        <w:t xml:space="preserve">El enfoque es cuantitativo porque el riesgo se expresa como una probabilidad comparable entre grupos de trabajadores y periodos. El panel rotatorio de la ENOE permite construir trayectorias individuales de hasta cinco trimestres, lo que hace posible estimar matrices de transición, en las que cada celda indica la proporción de trabajadores que pasa de una situación laboral a otra entre dos trimestres. Para explicar esas transiciones se usarán modelos estadísticos con inferencia formal y modelos de aprendizaje automático, en línea con los trabajos que modelan la movilidad con redes ocupacionales (del Rio-Chanona et al., 2021) y con redes neuronales (Meng et al., 2019).</w:t>
-      </w:r>
-    </w:p>
-    <w:p>
-      <w:pPr>
-        <w:keepNext/>
-        <w:spacing w:before="240" w:after="120" w:line="480" w:lineRule="auto"/>
-        <w:jc w:val="center"/>
-      </w:pPr>
-      <w:r>
-        <w:rPr>
-          <w:rFonts w:ascii="Times New Roman" w:hAnsi="Times New Roman" w:cs="Times New Roman" w:eastAsia="Times New Roman"/>
-          <w:b/>
-          <w:sz w:val="28"/>
-          <w:szCs w:val="28"/>
-        </w:rPr>
-        <w:t xml:space="preserve">VIII. METODOLOGÍA</w:t>
-      </w:r>
-    </w:p>
-    <w:p>
-      <w:pPr>
-        <w:spacing w:before="0" w:after="0" w:line="480" w:lineRule="auto"/>
-        <w:ind w:firstLine="709"/>
-        <w:jc w:val="both"/>
-      </w:pPr>
-      <w:r>
-        <w:rPr>
-          <w:rFonts w:ascii="Times New Roman" w:hAnsi="Times New Roman" w:cs="Times New Roman" w:eastAsia="Times New Roman"/>
-          <w:sz w:val="24"/>
-          <w:szCs w:val="24"/>
-        </w:rPr>
-        <w:t xml:space="preserve">Tipo de estudio. Investigación cuantitativa, no experimental y longitudinal, basada en el seguimiento de trabajadores en el panel de la ENOE.</w:t>
-      </w:r>
-    </w:p>
-    <w:p>
-      <w:pPr>
-        <w:spacing w:before="0" w:after="0" w:line="480" w:lineRule="auto"/>
-        <w:ind w:firstLine="709"/>
-        <w:jc w:val="both"/>
-      </w:pPr>
-      <w:r>
-        <w:rPr>
-          <w:rFonts w:ascii="Times New Roman" w:hAnsi="Times New Roman" w:cs="Times New Roman" w:eastAsia="Times New Roman"/>
-          <w:sz w:val="24"/>
-          <w:szCs w:val="24"/>
-        </w:rPr>
-        <w:t xml:space="preserve">Población y unidades de análisis. Personas ocupadas en las ocupaciones de ingeniería informática (subgrupo 227 del Sistema Nacional de Clasificación de Ocupaciones 2019) en México. Jalisco se analizará como caso estatal en la medida en que el tamaño de la muestra lo permita. Las unidades de análisis son el trabajador, observado trimestre a trimestre, y la ocupación.</w:t>
-      </w:r>
-    </w:p>
-    <w:p>
-      <w:pPr>
-        <w:spacing w:before="0" w:after="0" w:line="480" w:lineRule="auto"/>
-        <w:ind w:firstLine="709"/>
-        <w:jc w:val="both"/>
-      </w:pPr>
-      <w:r>
-        <w:rPr>
-          <w:rFonts w:ascii="Times New Roman" w:hAnsi="Times New Roman" w:cs="Times New Roman" w:eastAsia="Times New Roman"/>
-          <w:sz w:val="24"/>
-          <w:szCs w:val="24"/>
-        </w:rPr>
-        <w:t xml:space="preserve">Fuentes de datos. La ENOE (INEGI, 2025) para las trayectorias laborales y las características de los trabajadores; el Sistema Nacional de Clasificación de Ocupaciones (INEGI, 2019) para delimitar las ocupaciones; la base O*NET (National Center for O*NET Development, 2024) para las tareas de cada ocupación; e índices publicados de exposición a la inteligencia artificial (Eloundou et al., 2023; Felten et al., 2023) y de uso observado (Handa et al., 2025).</w:t>
-      </w:r>
-    </w:p>
-    <w:p>
-      <w:pPr>
-        <w:spacing w:before="0" w:after="0" w:line="480" w:lineRule="auto"/>
-        <w:ind w:firstLine="709"/>
-        <w:jc w:val="both"/>
-      </w:pPr>
-      <w:r>
-        <w:rPr>
-          <w:rFonts w:ascii="Times New Roman" w:hAnsi="Times New Roman" w:cs="Times New Roman" w:eastAsia="Times New Roman"/>
-          <w:sz w:val="24"/>
-          <w:szCs w:val="24"/>
-        </w:rPr>
-        <w:t xml:space="preserve">Procedimiento. El trabajo se organiza en cinco pasos alineados con los objetivos específicos:</w:t>
-      </w:r>
-    </w:p>
-    <w:p>
-      <w:pPr>
-        <w:spacing w:before="0" w:after="0" w:line="480" w:lineRule="auto"/>
-        <w:ind w:left="709"/>
-        <w:jc w:val="both"/>
-      </w:pPr>
-      <w:r>
-        <w:rPr>
-          <w:rFonts w:ascii="Times New Roman" w:hAnsi="Times New Roman" w:cs="Times New Roman" w:eastAsia="Times New Roman"/>
-          <w:sz w:val="24"/>
-          <w:szCs w:val="24"/>
-        </w:rPr>
-        <w:t xml:space="preserve">1. Delimitación de las ocupaciones de ingeniería informática y de sus posibles ocupaciones de destino, y depuración de los trimestres de la ENOE disponibles antes y después de 2022.</w:t>
-      </w:r>
-    </w:p>
-    <w:p>
-      <w:pPr>
-        <w:spacing w:before="0" w:after="0" w:line="480" w:lineRule="auto"/>
-        <w:ind w:left="709"/>
-        <w:jc w:val="both"/>
-      </w:pPr>
-      <w:r>
-        <w:rPr>
-          <w:rFonts w:ascii="Times New Roman" w:hAnsi="Times New Roman" w:cs="Times New Roman" w:eastAsia="Times New Roman"/>
-          <w:sz w:val="24"/>
-          <w:szCs w:val="24"/>
-        </w:rPr>
-        <w:t xml:space="preserve">2. Asignación de las tareas de O*NET a las ocupaciones mexicanas mediante tablas de correspondencia y cálculo de su exposición a los modelos de inteligencia artificial.</w:t>
-      </w:r>
-    </w:p>
-    <w:p>
-      <w:pPr>
-        <w:spacing w:before="0" w:after="0" w:line="480" w:lineRule="auto"/>
-        <w:ind w:left="709"/>
-        <w:jc w:val="both"/>
-      </w:pPr>
-      <w:r>
-        <w:rPr>
-          <w:rFonts w:ascii="Times New Roman" w:hAnsi="Times New Roman" w:cs="Times New Roman" w:eastAsia="Times New Roman"/>
-          <w:sz w:val="24"/>
-          <w:szCs w:val="24"/>
-        </w:rPr>
-        <w:t xml:space="preserve">3. Enlace de los registros de cada persona entre trimestres y construcción de matrices de transición entre ocupaciones, desocupación e inactividad, comparando el periodo anterior y el posterior a 2022.</w:t>
-      </w:r>
-    </w:p>
-    <w:p>
-      <w:pPr>
-        <w:spacing w:before="0" w:after="0" w:line="480" w:lineRule="auto"/>
-        <w:ind w:left="709"/>
-        <w:jc w:val="both"/>
-      </w:pPr>
-      <w:r>
-        <w:rPr>
-          <w:rFonts w:ascii="Times New Roman" w:hAnsi="Times New Roman" w:cs="Times New Roman" w:eastAsia="Times New Roman"/>
-          <w:sz w:val="24"/>
-          <w:szCs w:val="24"/>
-        </w:rPr>
-        <w:t xml:space="preserve">4. Estimación de modelos de la probabilidad de transición, como regresiones logísticas multinomiales y modelos de diferencias en diferencias que comparen a jóvenes y a trabajadores con experiencia antes y después de 2022, complementados con modelos de aprendizaje automático con validación cruzada, para contrastar H1.</w:t>
-      </w:r>
-    </w:p>
-    <w:p>
-      <w:pPr>
-        <w:spacing w:before="0" w:after="0" w:line="480" w:lineRule="auto"/>
-        <w:ind w:left="709"/>
-        <w:jc w:val="both"/>
-      </w:pPr>
-      <w:r>
-        <w:rPr>
-          <w:rFonts w:ascii="Times New Roman" w:hAnsi="Times New Roman" w:cs="Times New Roman" w:eastAsia="Times New Roman"/>
-          <w:sz w:val="24"/>
-          <w:szCs w:val="24"/>
-        </w:rPr>
-        <w:t xml:space="preserve">5. Construcción de una red de movilidad con las ocupaciones de destino observadas, para contrastar H2, y elaboración del tablero de visualización.</w:t>
-      </w:r>
-    </w:p>
-    <w:p>
-      <w:pPr>
-        <w:spacing w:before="0" w:after="0" w:line="480" w:lineRule="auto"/>
-        <w:ind w:firstLine="709"/>
-        <w:jc w:val="both"/>
-      </w:pPr>
-      <w:r>
-        <w:rPr>
-          <w:rFonts w:ascii="Times New Roman" w:hAnsi="Times New Roman" w:cs="Times New Roman" w:eastAsia="Times New Roman"/>
-          <w:sz w:val="24"/>
-          <w:szCs w:val="24"/>
-        </w:rPr>
-        <w:t xml:space="preserve">Herramientas de análisis. Python (pandas, NumPy, statsmodels, scikit-learn y Matplotlib), SQL Server para la integración de datos y GitHub para el control de versiones y la reproducibilidad del análisis.</w:t>
-      </w:r>
-    </w:p>
-    <w:p>
-      <w:pPr>
-        <w:keepNext/>
-        <w:spacing w:before="240" w:after="120" w:line="480" w:lineRule="auto"/>
-        <w:jc w:val="center"/>
-      </w:pPr>
-      <w:r>
-        <w:rPr>
-          <w:rFonts w:ascii="Times New Roman" w:hAnsi="Times New Roman" w:cs="Times New Roman" w:eastAsia="Times New Roman"/>
-          <w:b/>
-          <w:sz w:val="28"/>
-          <w:szCs w:val="28"/>
-        </w:rPr>
-        <w:t xml:space="preserve">IX. RECURSOS</w:t>
-      </w:r>
-    </w:p>
-    <w:p>
-      <w:pPr>
-        <w:spacing w:before="0" w:after="0" w:line="480" w:lineRule="auto"/>
-        <w:ind w:firstLine="709"/>
-        <w:jc w:val="both"/>
-      </w:pPr>
-      <w:r>
-        <w:rPr>
-          <w:rFonts w:ascii="Times New Roman" w:hAnsi="Times New Roman" w:cs="Times New Roman" w:eastAsia="Times New Roman"/>
-          <w:sz w:val="24"/>
-          <w:szCs w:val="24"/>
-        </w:rPr>
-        <w:t xml:space="preserve">Recursos humanos. El tesista, responsable del desarrollo del proyecto; el director de tesis, por designar; y la profesora de la unidad de aprendizaje Desarrollo de Proyecto I, que da seguimiento al protocolo.</w:t>
-      </w:r>
-    </w:p>
-    <w:p>
-      <w:pPr>
-        <w:spacing w:before="0" w:after="0" w:line="480" w:lineRule="auto"/>
-        <w:ind w:firstLine="709"/>
-        <w:jc w:val="both"/>
-      </w:pPr>
-      <w:r>
-        <w:rPr>
-          <w:rFonts w:ascii="Times New Roman" w:hAnsi="Times New Roman" w:cs="Times New Roman" w:eastAsia="Times New Roman"/>
-          <w:sz w:val="24"/>
-          <w:szCs w:val="24"/>
-        </w:rPr>
-        <w:t xml:space="preserve">Recursos materiales. Equipo de cómputo personal, un servidor local con SQL Server para la base de datos del proyecto, software libre para el análisis (Python y sus bibliotecas) y un repositorio en GitHub. Las fuentes de información son públicas y gratuitas.</w:t>
-      </w:r>
-    </w:p>
-    <w:p>
-      <w:pPr>
-        <w:spacing w:before="0" w:after="0" w:line="480" w:lineRule="auto"/>
-        <w:ind w:firstLine="709"/>
-        <w:jc w:val="both"/>
-      </w:pPr>
-      <w:r>
-        <w:rPr>
-          <w:rFonts w:ascii="Times New Roman" w:hAnsi="Times New Roman" w:cs="Times New Roman" w:eastAsia="Times New Roman"/>
-          <w:sz w:val="24"/>
-          <w:szCs w:val="24"/>
-        </w:rPr>
-        <w:t xml:space="preserve">Recursos económicos. El proyecto no requiere la compra de datos ni de licencias de software. Los costos se limitan al uso del equipo propio y a la conexión a internet, cubiertos por el tesista.</w:t>
-      </w:r>
-    </w:p>
-    <w:p>
-      <w:pPr>
-        <w:keepNext/>
-        <w:spacing w:before="240" w:after="120" w:line="480" w:lineRule="auto"/>
-        <w:jc w:val="center"/>
-      </w:pPr>
-      <w:r>
-        <w:rPr>
-          <w:rFonts w:ascii="Times New Roman" w:hAnsi="Times New Roman" w:cs="Times New Roman" w:eastAsia="Times New Roman"/>
-          <w:b/>
-          <w:sz w:val="28"/>
-          <w:szCs w:val="28"/>
-        </w:rPr>
-        <w:t xml:space="preserve">X. CRONOGRAMA</w:t>
-      </w:r>
-    </w:p>
-    <w:p>
-      <w:pPr>
-        <w:spacing w:before="0" w:after="0" w:line="480" w:lineRule="auto"/>
-        <w:ind w:firstLine="709"/>
-        <w:jc w:val="both"/>
-      </w:pPr>
-      <w:r>
-        <w:rPr>
-          <w:rFonts w:ascii="Times New Roman" w:hAnsi="Times New Roman" w:cs="Times New Roman" w:eastAsia="Times New Roman"/>
-          <w:sz w:val="24"/>
-          <w:szCs w:val="24"/>
-        </w:rPr>
-        <w:t xml:space="preserve">El cronograma parte del plan registrado en el avance de protocolo de la tesis e incorpora el reenfoque hacia la movilidad laboral en las ocupaciones de ingeniería informática, con el estado de cada etapa a octubre de 2026.</w:t>
+        <w:t xml:space="preserve">El cronograma parte del plan registrado en el avance de protocolo de la tesis e incorpora el reenfoque hacia la movilidad laboral en informática y ciencia de datos, con el estado de cada etapa a octubre de 2026.</w:t>
       </w:r>
     </w:p>
     <w:p>
@@ -2060,7 +2013,7 @@
                 <w:rFonts w:ascii="Times New Roman" w:hAnsi="Times New Roman" w:cs="Times New Roman" w:eastAsia="Times New Roman"/>
                 <w:sz w:val="20"/>
               </w:rPr>
-              <w:t xml:space="preserve">Reenfoque a movilidad laboral en ingeniería informática</w:t>
+              <w:t xml:space="preserve">Reenfoque a movilidad laboral en informática y ciencia de datos</w:t>
             </w:r>
           </w:p>
         </w:tc>
@@ -2280,7 +2233,7 @@
                 <w:rFonts w:ascii="Times New Roman" w:hAnsi="Times New Roman" w:cs="Times New Roman" w:eastAsia="Times New Roman"/>
                 <w:sz w:val="20"/>
               </w:rPr>
-              <w:t xml:space="preserve">Mapeo de ocupaciones y tareas (SINCO, O*NET)</w:t>
+              <w:t xml:space="preserve">Mapeo de carreras, ocupaciones y tareas (CMPE, SINCO, O*NET)</w:t>
             </w:r>
           </w:p>
         </w:tc>
@@ -2720,7 +2673,7 @@
                 <w:rFonts w:ascii="Times New Roman" w:hAnsi="Times New Roman" w:cs="Times New Roman" w:eastAsia="Times New Roman"/>
                 <w:sz w:val="20"/>
               </w:rPr>
-              <w:t xml:space="preserve">Red de movilidad y tablero de visualización</w:t>
+              <w:t xml:space="preserve">Red de movilidad y tablero por carrera</w:t>
             </w:r>
           </w:p>
         </w:tc>
@@ -3063,7 +3016,7 @@
           <w:sz w:val="28"/>
           <w:szCs w:val="28"/>
         </w:rPr>
-        <w:t xml:space="preserve">XI. REFERENCIAS BIBLIOGRÁFICAS</w:t>
+        <w:t xml:space="preserve">X. REFERENCIAS BIBLIOGRÁFICAS</w:t>
       </w:r>
     </w:p>
     <w:p>
@@ -3303,7 +3256,7 @@
           <w:sz w:val="24"/>
           <w:szCs w:val="24"/>
         </w:rPr>
-        <w:t xml:space="preserve">Instituto Nacional de Estadística y Geografía. (2019). Sistema Nacional de Clasificación de Ocupaciones (SINCO) 2019. INEGI.</w:t>
+        <w:t xml:space="preserve">Instituto Nacional de Estadística y Geografía. (2016). Clasificación mexicana de planes de estudio por campos de formación académica 2016: Educación superior y media superior. INEGI.</w:t>
       </w:r>
     </w:p>
     <w:p>
@@ -3318,7 +3271,7 @@
           <w:sz w:val="24"/>
           <w:szCs w:val="24"/>
         </w:rPr>
-        <w:t xml:space="preserve">Instituto Nacional de Estadística y Geografía. (2025). Encuesta Nacional de Ocupación y Empleo 2025, cuestionario ampliado, primer trimestre [Metadatos y bases de datos]. Red Nacional de Metadatos. https://www.inegi.org.mx/rnm/index.php/catalog/1104</w:t>
+        <w:t xml:space="preserve">Instituto Nacional de Estadística y Geografía. (2019). Sistema Nacional de Clasificación de Ocupaciones (SINCO) 2019. INEGI.</w:t>
       </w:r>
     </w:p>
     <w:p>
@@ -3333,7 +3286,37 @@
           <w:sz w:val="24"/>
           <w:szCs w:val="24"/>
         </w:rPr>
+        <w:t xml:space="preserve">Instituto Nacional de Estadística y Geografía. (2025). Encuesta Nacional de Ocupación y Empleo 2025, cuestionario ampliado, primer trimestre [Metadatos y bases de datos]. Red Nacional de Metadatos. https://www.inegi.org.mx/rnm/index.php/catalog/1104</w:t>
+      </w:r>
+    </w:p>
+    <w:p>
+      <w:pPr>
+        <w:spacing w:before="0" w:after="0" w:line="360" w:lineRule="auto"/>
+        <w:ind w:left="709" w:hanging="709"/>
+        <w:jc w:val="left"/>
+      </w:pPr>
+      <w:r>
+        <w:rPr>
+          <w:rFonts w:ascii="Times New Roman" w:hAnsi="Times New Roman" w:cs="Times New Roman" w:eastAsia="Times New Roman"/>
+          <w:sz w:val="24"/>
+          <w:szCs w:val="24"/>
+        </w:rPr>
         <w:t xml:space="preserve">Kambourov, G., &amp; Manovskii, I. (2008). Rising occupational and industry mobility in the United States: 1968-97. International Economic Review, 49(1), 41-79. https://doi.org/10.1111/j.1468-2354.2008.00473.x</w:t>
+      </w:r>
+    </w:p>
+    <w:p>
+      <w:pPr>
+        <w:spacing w:before="0" w:after="0" w:line="360" w:lineRule="auto"/>
+        <w:ind w:left="709" w:hanging="709"/>
+        <w:jc w:val="left"/>
+      </w:pPr>
+      <w:r>
+        <w:rPr>
+          <w:rFonts w:ascii="Times New Roman" w:hAnsi="Times New Roman" w:cs="Times New Roman" w:eastAsia="Times New Roman"/>
+          <w:sz w:val="24"/>
+          <w:szCs w:val="24"/>
+        </w:rPr>
+        <w:t xml:space="preserve">Khan, I. R., &amp; Varshney, M. (2026). Dynamic uncertainty-aware Bayesian neural model for real-time workforce displacement risk under AI automation. International Journal of Computer Information Systems and Industrial Management Applications. https://doi.org/10.70917/ijcisim-2026-4563</w:t>
       </w:r>
     </w:p>
     <w:p>

</xml_diff>